<commit_message>
Avance del informe (requisitos)
</commit_message>
<xml_diff>
--- a/InformeProyecto_MarioGonzalezDeLaIglesia/InformeProyecto_MarioGonzálezDeLaIglesia.docx
+++ b/InformeProyecto_MarioGonzalezDeLaIglesia/InformeProyecto_MarioGonzálezDeLaIglesia.docx
@@ -399,8 +399,6 @@
                 <w:szCs w:val="36"/>
               </w:rPr>
             </w:pPr>
-            <w:bookmarkStart w:id="0" w:name="_GoBack"/>
-            <w:bookmarkEnd w:id="0"/>
           </w:p>
         </w:tc>
       </w:tr>
@@ -502,6 +500,7 @@
         <w:rPr>
           <w:b/>
           <w:bCs/>
+          <w:sz w:val="24"/>
         </w:rPr>
       </w:sdtEndPr>
       <w:sdtContent>
@@ -1444,12 +1443,12 @@
         <w:spacing w:line="360" w:lineRule="auto"/>
         <w:ind w:left="426" w:hanging="426"/>
       </w:pPr>
-      <w:bookmarkStart w:id="1" w:name="_Toc224033568"/>
+      <w:bookmarkStart w:id="0" w:name="_Toc224033568"/>
       <w:r>
         <w:lastRenderedPageBreak/>
         <w:t>CONTROL DE VERSIONES</w:t>
       </w:r>
-      <w:bookmarkEnd w:id="1"/>
+      <w:bookmarkEnd w:id="0"/>
     </w:p>
     <w:tbl>
       <w:tblPr>
@@ -1461,7 +1460,7 @@
       <w:tblGrid>
         <w:gridCol w:w="1698"/>
         <w:gridCol w:w="1983"/>
-        <w:gridCol w:w="1554"/>
+        <w:gridCol w:w="1676"/>
         <w:gridCol w:w="1699"/>
       </w:tblGrid>
       <w:tr>
@@ -1517,13 +1516,21 @@
           <w:tcPr>
             <w:tcW w:w="1698" w:type="dxa"/>
           </w:tcPr>
-          <w:p/>
+          <w:p>
+            <w:r>
+              <w:t>1.0</w:t>
+            </w:r>
+          </w:p>
         </w:tc>
         <w:tc>
           <w:tcPr>
             <w:tcW w:w="1983" w:type="dxa"/>
           </w:tcPr>
-          <w:p/>
+          <w:p>
+            <w:r>
+              <w:t>Mario G</w:t>
+            </w:r>
+          </w:p>
         </w:tc>
         <w:tc>
           <w:tcPr>
@@ -1535,7 +1542,11 @@
           <w:tcPr>
             <w:tcW w:w="1699" w:type="dxa"/>
           </w:tcPr>
-          <w:p/>
+          <w:p>
+            <w:r>
+              <w:t>21/04/2026</w:t>
+            </w:r>
+          </w:p>
         </w:tc>
       </w:tr>
       <w:tr>
@@ -1699,14 +1710,43 @@
         <w:spacing w:line="360" w:lineRule="auto"/>
         <w:ind w:left="426" w:hanging="426"/>
       </w:pPr>
-      <w:bookmarkStart w:id="2" w:name="_Toc224033569"/>
+      <w:bookmarkStart w:id="1" w:name="_Toc224033569"/>
       <w:r>
         <w:lastRenderedPageBreak/>
         <w:t>INTRODUCCIÓN</w:t>
       </w:r>
-      <w:bookmarkEnd w:id="2"/>
+      <w:bookmarkEnd w:id="1"/>
     </w:p>
-    <w:p/>
+    <w:p>
+      <w:pPr>
+        <w:jc w:val="both"/>
+      </w:pPr>
+      <w:r>
+        <w:t xml:space="preserve">Buenas, aquí podréis ver de forma más detallada el informe seguido para un proyecto de java, donde se podrá ver un seguimiento, para poder recrearlo sin tener mucha idea. El proyecto trata de una </w:t>
+      </w:r>
+      <w:r>
+        <w:rPr>
+          <w:b/>
+        </w:rPr>
+        <w:t>máquina vending</w:t>
+      </w:r>
+      <w:r>
+        <w:t xml:space="preserve"> con una programación orientada a objetos.</w:t>
+      </w:r>
+    </w:p>
+    <w:p>
+      <w:pPr>
+        <w:jc w:val="both"/>
+      </w:pPr>
+      <w:r>
+        <w:t xml:space="preserve">Aquí les explicaremos sus requisitos necesarios para que sepamos si funciona, un diseño claro para recrear sus objetos, y un intento de explicación de la programación para poder hacer sus funciones correctamente, además de un aparatado solamente de pruebas, para que veáis en lo que puede llegar a fallar de esos requisitos. </w:t>
+      </w:r>
+    </w:p>
+    <w:p>
+      <w:r>
+        <w:br w:type="page"/>
+      </w:r>
+    </w:p>
     <w:p>
       <w:pPr>
         <w:pStyle w:val="Ttulo1"/>
@@ -1717,12 +1757,21 @@
         <w:spacing w:line="360" w:lineRule="auto"/>
         <w:ind w:left="426" w:hanging="426"/>
       </w:pPr>
-      <w:bookmarkStart w:id="3" w:name="_Toc224033570"/>
+      <w:bookmarkStart w:id="2" w:name="_Toc224033570"/>
       <w:r>
+        <w:lastRenderedPageBreak/>
         <w:t>FASE ANÁLISIS</w:t>
       </w:r>
-      <w:bookmarkStart w:id="4" w:name="_Hlk140679235"/>
-      <w:bookmarkEnd w:id="3"/>
+      <w:bookmarkStart w:id="3" w:name="_Hlk140679235"/>
+      <w:bookmarkEnd w:id="2"/>
+    </w:p>
+    <w:p>
+      <w:pPr>
+        <w:jc w:val="both"/>
+      </w:pPr>
+      <w:r>
+        <w:t>En los siguientes apartados podemos ver los requisitos funcionales y no funcionales de la fase análisis que seguiremos para llevar a cabo el proyecto.</w:t>
+      </w:r>
     </w:p>
     <w:p>
       <w:pPr>
@@ -1731,14 +1780,234 @@
           <w:szCs w:val="28"/>
         </w:rPr>
       </w:pPr>
-      <w:bookmarkStart w:id="5" w:name="_Toc224033571"/>
+      <w:bookmarkStart w:id="4" w:name="_Toc224033571"/>
       <w:r>
         <w:rPr>
           <w:szCs w:val="28"/>
         </w:rPr>
         <w:t>Funcionales</w:t>
       </w:r>
+      <w:bookmarkEnd w:id="4"/>
+    </w:p>
+    <w:p>
+      <w:pPr>
+        <w:pStyle w:val="Prrafodelista"/>
+        <w:numPr>
+          <w:ilvl w:val="0"/>
+          <w:numId w:val="27"/>
+        </w:numPr>
+      </w:pPr>
+      <w:r>
+        <w:t>Conseguir que haya una gestión clara del stock</w:t>
+      </w:r>
+      <w:r>
+        <w:t>.</w:t>
+      </w:r>
+    </w:p>
+    <w:p>
+      <w:pPr>
+        <w:pStyle w:val="Prrafodelista"/>
+        <w:numPr>
+          <w:ilvl w:val="1"/>
+          <w:numId w:val="27"/>
+        </w:numPr>
+      </w:pPr>
+      <w:r>
+        <w:t>Una validación que un código de ranura tenga su formato correcto.</w:t>
+      </w:r>
+    </w:p>
+    <w:p>
+      <w:pPr>
+        <w:pStyle w:val="Prrafodelista"/>
+        <w:numPr>
+          <w:ilvl w:val="1"/>
+          <w:numId w:val="27"/>
+        </w:numPr>
+      </w:pPr>
+      <w:r>
+        <w:t>Implementar algo que al añadir un producto en una ranura libre.</w:t>
+      </w:r>
+      <w:bookmarkStart w:id="5" w:name="_GoBack"/>
       <w:bookmarkEnd w:id="5"/>
+    </w:p>
+    <w:p>
+      <w:pPr>
+        <w:rPr>
+          <w:b/>
+        </w:rPr>
+      </w:pPr>
+      <w:r>
+        <w:rPr>
+          <w:b/>
+        </w:rPr>
+        <w:t>Modo Usuario</w:t>
+      </w:r>
+    </w:p>
+    <w:p>
+      <w:pPr>
+        <w:pStyle w:val="Prrafodelista"/>
+        <w:numPr>
+          <w:ilvl w:val="0"/>
+          <w:numId w:val="27"/>
+        </w:numPr>
+      </w:pPr>
+      <w:r>
+        <w:t>Conseguir que un usuario pueda insertar monedas.</w:t>
+      </w:r>
+    </w:p>
+    <w:p>
+      <w:pPr>
+        <w:pStyle w:val="Prrafodelista"/>
+        <w:numPr>
+          <w:ilvl w:val="0"/>
+          <w:numId w:val="27"/>
+        </w:numPr>
+      </w:pPr>
+      <w:r>
+        <w:t>Poder comprar productos de la máquina.</w:t>
+      </w:r>
+    </w:p>
+    <w:p>
+      <w:pPr>
+        <w:pStyle w:val="Prrafodelista"/>
+        <w:numPr>
+          <w:ilvl w:val="0"/>
+          <w:numId w:val="27"/>
+        </w:numPr>
+      </w:pPr>
+      <w:r>
+        <w:t>Devuelva crédito si es necesario.</w:t>
+      </w:r>
+    </w:p>
+    <w:p>
+      <w:pPr>
+        <w:pStyle w:val="Prrafodelista"/>
+        <w:numPr>
+          <w:ilvl w:val="0"/>
+          <w:numId w:val="27"/>
+        </w:numPr>
+      </w:pPr>
+      <w:r>
+        <w:t>Uso del modo administrador, cuando sea necesario.</w:t>
+      </w:r>
+    </w:p>
+    <w:p>
+      <w:pPr>
+        <w:rPr>
+          <w:b/>
+        </w:rPr>
+      </w:pPr>
+      <w:r>
+        <w:rPr>
+          <w:b/>
+        </w:rPr>
+        <w:t>Modo Administrador</w:t>
+      </w:r>
+    </w:p>
+    <w:p>
+      <w:pPr>
+        <w:pStyle w:val="Prrafodelista"/>
+        <w:numPr>
+          <w:ilvl w:val="0"/>
+          <w:numId w:val="27"/>
+        </w:numPr>
+      </w:pPr>
+      <w:r>
+        <w:t>Poder reponer el stock de la máquina</w:t>
+      </w:r>
+      <w:r>
+        <w:t xml:space="preserve"> del producto que se asigne</w:t>
+      </w:r>
+      <w:r>
+        <w:t>.</w:t>
+      </w:r>
+    </w:p>
+    <w:p>
+      <w:pPr>
+        <w:pStyle w:val="Prrafodelista"/>
+        <w:numPr>
+          <w:ilvl w:val="0"/>
+          <w:numId w:val="27"/>
+        </w:numPr>
+      </w:pPr>
+      <w:r>
+        <w:t>Implementar un nuevo producto en caso que no esté ya dentro de la máquina</w:t>
+      </w:r>
+      <w:r>
+        <w:t>.</w:t>
+      </w:r>
+    </w:p>
+    <w:p>
+      <w:pPr>
+        <w:pStyle w:val="Prrafodelista"/>
+        <w:numPr>
+          <w:ilvl w:val="0"/>
+          <w:numId w:val="27"/>
+        </w:numPr>
+      </w:pPr>
+      <w:r>
+        <w:t>Implementar la eliminación de un producto en caso necesario</w:t>
+      </w:r>
+      <w:r>
+        <w:t>.</w:t>
+      </w:r>
+    </w:p>
+    <w:p>
+      <w:pPr>
+        <w:pStyle w:val="Prrafodelista"/>
+        <w:numPr>
+          <w:ilvl w:val="0"/>
+          <w:numId w:val="27"/>
+        </w:numPr>
+      </w:pPr>
+      <w:r>
+        <w:t>Poder ver el estado de la caja, y ver cuantas tenemos actualmente</w:t>
+      </w:r>
+      <w:r>
+        <w:t>.</w:t>
+      </w:r>
+    </w:p>
+    <w:p>
+      <w:pPr>
+        <w:pStyle w:val="Prrafodelista"/>
+        <w:numPr>
+          <w:ilvl w:val="0"/>
+          <w:numId w:val="27"/>
+        </w:numPr>
+      </w:pPr>
+      <w:r>
+        <w:t>Conseguir ver la recaudación total desde que inicio el sistema.</w:t>
+      </w:r>
+    </w:p>
+    <w:p>
+      <w:pPr>
+        <w:pStyle w:val="Prrafodelista"/>
+        <w:numPr>
+          <w:ilvl w:val="0"/>
+          <w:numId w:val="27"/>
+        </w:numPr>
+      </w:pPr>
+      <w:r>
+        <w:t>Ver el stock detallado actualmente de la máquina</w:t>
+      </w:r>
+      <w:r>
+        <w:t>.</w:t>
+      </w:r>
+    </w:p>
+    <w:p>
+      <w:pPr>
+        <w:pStyle w:val="Prrafodelista"/>
+        <w:numPr>
+          <w:ilvl w:val="0"/>
+          <w:numId w:val="27"/>
+        </w:numPr>
+      </w:pPr>
+      <w:r>
+        <w:t>Poder hacer un cambio en la contraseña con unas restricciones establecidas</w:t>
+      </w:r>
+      <w:r>
+        <w:t>.</w:t>
+      </w:r>
     </w:p>
     <w:p>
       <w:pPr>
@@ -1755,6 +2024,102 @@
         <w:t>No funcionales</w:t>
       </w:r>
       <w:bookmarkEnd w:id="6"/>
+    </w:p>
+    <w:p>
+      <w:pPr>
+        <w:pStyle w:val="Prrafodelista"/>
+        <w:numPr>
+          <w:ilvl w:val="0"/>
+          <w:numId w:val="21"/>
+        </w:numPr>
+      </w:pPr>
+      <w:r>
+        <w:t>Fiabilidad:</w:t>
+      </w:r>
+    </w:p>
+    <w:p>
+      <w:pPr>
+        <w:pStyle w:val="Prrafodelista"/>
+        <w:numPr>
+          <w:ilvl w:val="0"/>
+          <w:numId w:val="21"/>
+        </w:numPr>
+      </w:pPr>
+      <w:r>
+        <w:t>Escalabilidad</w:t>
+      </w:r>
+    </w:p>
+    <w:p>
+      <w:pPr>
+        <w:pStyle w:val="Prrafodelista"/>
+        <w:numPr>
+          <w:ilvl w:val="0"/>
+          <w:numId w:val="21"/>
+        </w:numPr>
+      </w:pPr>
+      <w:r>
+        <w:t>Extensibilidad:</w:t>
+      </w:r>
+    </w:p>
+    <w:p>
+      <w:pPr>
+        <w:pStyle w:val="Prrafodelista"/>
+        <w:numPr>
+          <w:ilvl w:val="0"/>
+          <w:numId w:val="21"/>
+        </w:numPr>
+      </w:pPr>
+      <w:r>
+        <w:t>Seguridad:</w:t>
+      </w:r>
+    </w:p>
+    <w:p>
+      <w:pPr>
+        <w:pStyle w:val="Prrafodelista"/>
+        <w:numPr>
+          <w:ilvl w:val="0"/>
+          <w:numId w:val="21"/>
+        </w:numPr>
+      </w:pPr>
+      <w:r>
+        <w:t>Mantenibilidad:</w:t>
+      </w:r>
+    </w:p>
+    <w:p>
+      <w:pPr>
+        <w:pStyle w:val="Prrafodelista"/>
+        <w:numPr>
+          <w:ilvl w:val="0"/>
+          <w:numId w:val="21"/>
+        </w:numPr>
+      </w:pPr>
+      <w:r>
+        <w:t>Introducción de comentarios para detallar el código.</w:t>
+      </w:r>
+    </w:p>
+    <w:p>
+      <w:pPr>
+        <w:pStyle w:val="Prrafodelista"/>
+        <w:numPr>
+          <w:ilvl w:val="0"/>
+          <w:numId w:val="21"/>
+        </w:numPr>
+      </w:pPr>
+      <w:r>
+        <w:t>Uso de BigDecimal para una precisión decimal más exactitud.</w:t>
+      </w:r>
+    </w:p>
+    <w:p>
+      <w:pPr>
+        <w:pStyle w:val="Prrafodelista"/>
+        <w:numPr>
+          <w:ilvl w:val="0"/>
+          <w:numId w:val="21"/>
+        </w:numPr>
+      </w:pPr>
+      <w:r>
+        <w:t>Hacer un uso de la estrategia greedy para el almacén.</w:t>
+      </w:r>
     </w:p>
     <w:p>
       <w:r>
@@ -1867,7 +2232,7 @@
       <w:r>
         <w:t>MANTENIMIENTO</w:t>
       </w:r>
-      <w:bookmarkEnd w:id="4"/>
+      <w:bookmarkEnd w:id="3"/>
       <w:bookmarkEnd w:id="8"/>
       <w:bookmarkEnd w:id="9"/>
       <w:bookmarkEnd w:id="13"/>
@@ -1880,11 +2245,11 @@
         <w:tblLook w:val="04A0" w:firstRow="1" w:lastRow="0" w:firstColumn="1" w:lastColumn="0" w:noHBand="0" w:noVBand="1"/>
       </w:tblPr>
       <w:tblGrid>
-        <w:gridCol w:w="1728"/>
-        <w:gridCol w:w="1165"/>
-        <w:gridCol w:w="2590"/>
-        <w:gridCol w:w="2476"/>
-        <w:gridCol w:w="1357"/>
+        <w:gridCol w:w="1725"/>
+        <w:gridCol w:w="1156"/>
+        <w:gridCol w:w="2599"/>
+        <w:gridCol w:w="2484"/>
+        <w:gridCol w:w="1352"/>
       </w:tblGrid>
       <w:tr>
         <w:trPr>
@@ -2170,7 +2535,6 @@
         <w:docPartUnique/>
       </w:docPartObj>
     </w:sdtPr>
-    <w:sdtEndPr/>
     <w:sdtContent>
       <w:sdt>
         <w:sdtPr>
@@ -2180,7 +2544,6 @@
             <w:docPartUnique/>
           </w:docPartObj>
         </w:sdtPr>
-        <w:sdtEndPr/>
         <w:sdtContent>
           <w:tbl>
             <w:tblPr>
@@ -2243,7 +2606,7 @@
                       <w:bCs/>
                       <w:noProof/>
                     </w:rPr>
-                    <w:t>9</w:t>
+                    <w:t>5</w:t>
                   </w:r>
                   <w:r>
                     <w:rPr>
@@ -2282,7 +2645,7 @@
                       <w:bCs/>
                       <w:noProof/>
                     </w:rPr>
-                    <w:t>9</w:t>
+                    <w:t>10</w:t>
                   </w:r>
                   <w:r>
                     <w:rPr>
@@ -2323,7 +2686,6 @@
         <w:docPartUnique/>
       </w:docPartObj>
     </w:sdtPr>
-    <w:sdtEndPr/>
     <w:sdtContent>
       <w:sdt>
         <w:sdtPr>
@@ -2333,7 +2695,6 @@
             <w:docPartUnique/>
           </w:docPartObj>
         </w:sdtPr>
-        <w:sdtEndPr/>
         <w:sdtContent>
           <w:tbl>
             <w:tblPr>
@@ -2601,23 +2962,7 @@
               <w:bCs/>
               <w:szCs w:val="20"/>
             </w:rPr>
-            <w:t>PROYECTO 2</w:t>
-          </w:r>
-          <w:r>
-            <w:rPr>
-              <w:b/>
-              <w:bCs/>
-              <w:szCs w:val="20"/>
-            </w:rPr>
-            <w:t xml:space="preserve">: </w:t>
-          </w:r>
-          <w:r>
-            <w:rPr>
-              <w:b/>
-              <w:bCs/>
-              <w:szCs w:val="20"/>
-            </w:rPr>
-            <w:t>INFORME DE MÁQUINA VENDING</w:t>
+            <w:t>PROYECTO 2: INFORME DE MÁQUINA VENDING</w:t>
           </w:r>
         </w:p>
         <w:p>
@@ -2952,6 +3297,95 @@
     </w:lvl>
   </w:abstractNum>
   <w:abstractNum w:abstractNumId="1" w15:restartNumberingAfterBreak="0">
+    <w:nsid w:val="078E7AE4"/>
+    <w:multiLevelType w:val="hybridMultilevel"/>
+    <w:tmpl w:val="82E07004"/>
+    <w:lvl w:ilvl="0" w:tplc="CB02A71E">
+      <w:start w:val="1"/>
+      <w:numFmt w:val="decimal"/>
+      <w:lvlText w:val="RF%1."/>
+      <w:lvlJc w:val="left"/>
+      <w:pPr>
+        <w:ind w:left="720" w:hanging="360"/>
+      </w:pPr>
+      <w:rPr>
+        <w:rFonts w:hint="default"/>
+      </w:rPr>
+    </w:lvl>
+    <w:lvl w:ilvl="1" w:tplc="0C0A0019" w:tentative="1">
+      <w:start w:val="1"/>
+      <w:numFmt w:val="lowerLetter"/>
+      <w:lvlText w:val="%2."/>
+      <w:lvlJc w:val="left"/>
+      <w:pPr>
+        <w:ind w:left="1440" w:hanging="360"/>
+      </w:pPr>
+    </w:lvl>
+    <w:lvl w:ilvl="2" w:tplc="0C0A001B" w:tentative="1">
+      <w:start w:val="1"/>
+      <w:numFmt w:val="lowerRoman"/>
+      <w:lvlText w:val="%3."/>
+      <w:lvlJc w:val="right"/>
+      <w:pPr>
+        <w:ind w:left="2160" w:hanging="180"/>
+      </w:pPr>
+    </w:lvl>
+    <w:lvl w:ilvl="3" w:tplc="0C0A000F" w:tentative="1">
+      <w:start w:val="1"/>
+      <w:numFmt w:val="decimal"/>
+      <w:lvlText w:val="%4."/>
+      <w:lvlJc w:val="left"/>
+      <w:pPr>
+        <w:ind w:left="2880" w:hanging="360"/>
+      </w:pPr>
+    </w:lvl>
+    <w:lvl w:ilvl="4" w:tplc="0C0A0019" w:tentative="1">
+      <w:start w:val="1"/>
+      <w:numFmt w:val="lowerLetter"/>
+      <w:lvlText w:val="%5."/>
+      <w:lvlJc w:val="left"/>
+      <w:pPr>
+        <w:ind w:left="3600" w:hanging="360"/>
+      </w:pPr>
+    </w:lvl>
+    <w:lvl w:ilvl="5" w:tplc="0C0A001B" w:tentative="1">
+      <w:start w:val="1"/>
+      <w:numFmt w:val="lowerRoman"/>
+      <w:lvlText w:val="%6."/>
+      <w:lvlJc w:val="right"/>
+      <w:pPr>
+        <w:ind w:left="4320" w:hanging="180"/>
+      </w:pPr>
+    </w:lvl>
+    <w:lvl w:ilvl="6" w:tplc="0C0A000F" w:tentative="1">
+      <w:start w:val="1"/>
+      <w:numFmt w:val="decimal"/>
+      <w:lvlText w:val="%7."/>
+      <w:lvlJc w:val="left"/>
+      <w:pPr>
+        <w:ind w:left="5040" w:hanging="360"/>
+      </w:pPr>
+    </w:lvl>
+    <w:lvl w:ilvl="7" w:tplc="0C0A0019" w:tentative="1">
+      <w:start w:val="1"/>
+      <w:numFmt w:val="lowerLetter"/>
+      <w:lvlText w:val="%8."/>
+      <w:lvlJc w:val="left"/>
+      <w:pPr>
+        <w:ind w:left="5760" w:hanging="360"/>
+      </w:pPr>
+    </w:lvl>
+    <w:lvl w:ilvl="8" w:tplc="0C0A001B" w:tentative="1">
+      <w:start w:val="1"/>
+      <w:numFmt w:val="lowerRoman"/>
+      <w:lvlText w:val="%9."/>
+      <w:lvlJc w:val="right"/>
+      <w:pPr>
+        <w:ind w:left="6480" w:hanging="180"/>
+      </w:pPr>
+    </w:lvl>
+  </w:abstractNum>
+  <w:abstractNum w:abstractNumId="2" w15:restartNumberingAfterBreak="0">
     <w:nsid w:val="084E3FC2"/>
     <w:multiLevelType w:val="multilevel"/>
     <w:tmpl w:val="7A7453B0"/>
@@ -3064,7 +3498,98 @@
       </w:rPr>
     </w:lvl>
   </w:abstractNum>
-  <w:abstractNum w:abstractNumId="2" w15:restartNumberingAfterBreak="0">
+  <w:abstractNum w:abstractNumId="3" w15:restartNumberingAfterBreak="0">
+    <w:nsid w:val="09AD6ADC"/>
+    <w:multiLevelType w:val="hybridMultilevel"/>
+    <w:tmpl w:val="B4000372"/>
+    <w:lvl w:ilvl="0" w:tplc="851E3888">
+      <w:start w:val="1"/>
+      <w:numFmt w:val="decimal"/>
+      <w:lvlText w:val="RF%1."/>
+      <w:lvlJc w:val="left"/>
+      <w:pPr>
+        <w:ind w:left="720" w:hanging="360"/>
+      </w:pPr>
+      <w:rPr>
+        <w:rFonts w:hint="default"/>
+        <w:b/>
+        <w:i w:val="0"/>
+      </w:rPr>
+    </w:lvl>
+    <w:lvl w:ilvl="1" w:tplc="0C0A0019" w:tentative="1">
+      <w:start w:val="1"/>
+      <w:numFmt w:val="lowerLetter"/>
+      <w:lvlText w:val="%2."/>
+      <w:lvlJc w:val="left"/>
+      <w:pPr>
+        <w:ind w:left="1440" w:hanging="360"/>
+      </w:pPr>
+    </w:lvl>
+    <w:lvl w:ilvl="2" w:tplc="0C0A001B" w:tentative="1">
+      <w:start w:val="1"/>
+      <w:numFmt w:val="lowerRoman"/>
+      <w:lvlText w:val="%3."/>
+      <w:lvlJc w:val="right"/>
+      <w:pPr>
+        <w:ind w:left="2160" w:hanging="180"/>
+      </w:pPr>
+    </w:lvl>
+    <w:lvl w:ilvl="3" w:tplc="0C0A000F" w:tentative="1">
+      <w:start w:val="1"/>
+      <w:numFmt w:val="decimal"/>
+      <w:lvlText w:val="%4."/>
+      <w:lvlJc w:val="left"/>
+      <w:pPr>
+        <w:ind w:left="2880" w:hanging="360"/>
+      </w:pPr>
+    </w:lvl>
+    <w:lvl w:ilvl="4" w:tplc="0C0A0019" w:tentative="1">
+      <w:start w:val="1"/>
+      <w:numFmt w:val="lowerLetter"/>
+      <w:lvlText w:val="%5."/>
+      <w:lvlJc w:val="left"/>
+      <w:pPr>
+        <w:ind w:left="3600" w:hanging="360"/>
+      </w:pPr>
+    </w:lvl>
+    <w:lvl w:ilvl="5" w:tplc="0C0A001B" w:tentative="1">
+      <w:start w:val="1"/>
+      <w:numFmt w:val="lowerRoman"/>
+      <w:lvlText w:val="%6."/>
+      <w:lvlJc w:val="right"/>
+      <w:pPr>
+        <w:ind w:left="4320" w:hanging="180"/>
+      </w:pPr>
+    </w:lvl>
+    <w:lvl w:ilvl="6" w:tplc="0C0A000F" w:tentative="1">
+      <w:start w:val="1"/>
+      <w:numFmt w:val="decimal"/>
+      <w:lvlText w:val="%7."/>
+      <w:lvlJc w:val="left"/>
+      <w:pPr>
+        <w:ind w:left="5040" w:hanging="360"/>
+      </w:pPr>
+    </w:lvl>
+    <w:lvl w:ilvl="7" w:tplc="0C0A0019" w:tentative="1">
+      <w:start w:val="1"/>
+      <w:numFmt w:val="lowerLetter"/>
+      <w:lvlText w:val="%8."/>
+      <w:lvlJc w:val="left"/>
+      <w:pPr>
+        <w:ind w:left="5760" w:hanging="360"/>
+      </w:pPr>
+    </w:lvl>
+    <w:lvl w:ilvl="8" w:tplc="0C0A001B" w:tentative="1">
+      <w:start w:val="1"/>
+      <w:numFmt w:val="lowerRoman"/>
+      <w:lvlText w:val="%9."/>
+      <w:lvlJc w:val="right"/>
+      <w:pPr>
+        <w:ind w:left="6480" w:hanging="180"/>
+      </w:pPr>
+    </w:lvl>
+  </w:abstractNum>
+  <w:abstractNum w:abstractNumId="4" w15:restartNumberingAfterBreak="0">
     <w:nsid w:val="0CD46445"/>
     <w:multiLevelType w:val="hybridMultilevel"/>
     <w:tmpl w:val="97F4EE72"/>
@@ -3178,7 +3703,7 @@
       </w:rPr>
     </w:lvl>
   </w:abstractNum>
-  <w:abstractNum w:abstractNumId="3" w15:restartNumberingAfterBreak="0">
+  <w:abstractNum w:abstractNumId="5" w15:restartNumberingAfterBreak="0">
     <w:nsid w:val="1AF55B59"/>
     <w:multiLevelType w:val="multilevel"/>
     <w:tmpl w:val="4950FAF6"/>
@@ -3291,7 +3816,302 @@
       </w:rPr>
     </w:lvl>
   </w:abstractNum>
-  <w:abstractNum w:abstractNumId="4" w15:restartNumberingAfterBreak="0">
+  <w:abstractNum w:abstractNumId="6" w15:restartNumberingAfterBreak="0">
+    <w:nsid w:val="21E049D7"/>
+    <w:multiLevelType w:val="hybridMultilevel"/>
+    <w:tmpl w:val="2304C7A2"/>
+    <w:lvl w:ilvl="0" w:tplc="851E3888">
+      <w:start w:val="1"/>
+      <w:numFmt w:val="decimal"/>
+      <w:lvlText w:val="RF%1."/>
+      <w:lvlJc w:val="left"/>
+      <w:pPr>
+        <w:ind w:left="720" w:hanging="360"/>
+      </w:pPr>
+      <w:rPr>
+        <w:rFonts w:hint="default"/>
+        <w:b/>
+        <w:i w:val="0"/>
+      </w:rPr>
+    </w:lvl>
+    <w:lvl w:ilvl="1" w:tplc="0C0A0019" w:tentative="1">
+      <w:start w:val="1"/>
+      <w:numFmt w:val="lowerLetter"/>
+      <w:lvlText w:val="%2."/>
+      <w:lvlJc w:val="left"/>
+      <w:pPr>
+        <w:ind w:left="1440" w:hanging="360"/>
+      </w:pPr>
+    </w:lvl>
+    <w:lvl w:ilvl="2" w:tplc="0C0A001B" w:tentative="1">
+      <w:start w:val="1"/>
+      <w:numFmt w:val="lowerRoman"/>
+      <w:lvlText w:val="%3."/>
+      <w:lvlJc w:val="right"/>
+      <w:pPr>
+        <w:ind w:left="2160" w:hanging="180"/>
+      </w:pPr>
+    </w:lvl>
+    <w:lvl w:ilvl="3" w:tplc="0C0A000F" w:tentative="1">
+      <w:start w:val="1"/>
+      <w:numFmt w:val="decimal"/>
+      <w:lvlText w:val="%4."/>
+      <w:lvlJc w:val="left"/>
+      <w:pPr>
+        <w:ind w:left="2880" w:hanging="360"/>
+      </w:pPr>
+    </w:lvl>
+    <w:lvl w:ilvl="4" w:tplc="0C0A0019" w:tentative="1">
+      <w:start w:val="1"/>
+      <w:numFmt w:val="lowerLetter"/>
+      <w:lvlText w:val="%5."/>
+      <w:lvlJc w:val="left"/>
+      <w:pPr>
+        <w:ind w:left="3600" w:hanging="360"/>
+      </w:pPr>
+    </w:lvl>
+    <w:lvl w:ilvl="5" w:tplc="0C0A001B" w:tentative="1">
+      <w:start w:val="1"/>
+      <w:numFmt w:val="lowerRoman"/>
+      <w:lvlText w:val="%6."/>
+      <w:lvlJc w:val="right"/>
+      <w:pPr>
+        <w:ind w:left="4320" w:hanging="180"/>
+      </w:pPr>
+    </w:lvl>
+    <w:lvl w:ilvl="6" w:tplc="0C0A000F" w:tentative="1">
+      <w:start w:val="1"/>
+      <w:numFmt w:val="decimal"/>
+      <w:lvlText w:val="%7."/>
+      <w:lvlJc w:val="left"/>
+      <w:pPr>
+        <w:ind w:left="5040" w:hanging="360"/>
+      </w:pPr>
+    </w:lvl>
+    <w:lvl w:ilvl="7" w:tplc="0C0A0019" w:tentative="1">
+      <w:start w:val="1"/>
+      <w:numFmt w:val="lowerLetter"/>
+      <w:lvlText w:val="%8."/>
+      <w:lvlJc w:val="left"/>
+      <w:pPr>
+        <w:ind w:left="5760" w:hanging="360"/>
+      </w:pPr>
+    </w:lvl>
+    <w:lvl w:ilvl="8" w:tplc="0C0A001B" w:tentative="1">
+      <w:start w:val="1"/>
+      <w:numFmt w:val="lowerRoman"/>
+      <w:lvlText w:val="%9."/>
+      <w:lvlJc w:val="right"/>
+      <w:pPr>
+        <w:ind w:left="6480" w:hanging="180"/>
+      </w:pPr>
+    </w:lvl>
+  </w:abstractNum>
+  <w:abstractNum w:abstractNumId="7" w15:restartNumberingAfterBreak="0">
+    <w:nsid w:val="21E46DCB"/>
+    <w:multiLevelType w:val="hybridMultilevel"/>
+    <w:tmpl w:val="9EBE5D12"/>
+    <w:lvl w:ilvl="0" w:tplc="52F4C64A">
+      <w:start w:val="1"/>
+      <w:numFmt w:val="decimal"/>
+      <w:lvlText w:val="RNF%1."/>
+      <w:lvlJc w:val="left"/>
+      <w:pPr>
+        <w:ind w:left="720" w:hanging="360"/>
+      </w:pPr>
+      <w:rPr>
+        <w:rFonts w:hint="default"/>
+        <w:b/>
+        <w:i w:val="0"/>
+      </w:rPr>
+    </w:lvl>
+    <w:lvl w:ilvl="1" w:tplc="0C0A0019" w:tentative="1">
+      <w:start w:val="1"/>
+      <w:numFmt w:val="lowerLetter"/>
+      <w:lvlText w:val="%2."/>
+      <w:lvlJc w:val="left"/>
+      <w:pPr>
+        <w:ind w:left="1440" w:hanging="360"/>
+      </w:pPr>
+    </w:lvl>
+    <w:lvl w:ilvl="2" w:tplc="0C0A001B" w:tentative="1">
+      <w:start w:val="1"/>
+      <w:numFmt w:val="lowerRoman"/>
+      <w:lvlText w:val="%3."/>
+      <w:lvlJc w:val="right"/>
+      <w:pPr>
+        <w:ind w:left="2160" w:hanging="180"/>
+      </w:pPr>
+    </w:lvl>
+    <w:lvl w:ilvl="3" w:tplc="0C0A000F" w:tentative="1">
+      <w:start w:val="1"/>
+      <w:numFmt w:val="decimal"/>
+      <w:lvlText w:val="%4."/>
+      <w:lvlJc w:val="left"/>
+      <w:pPr>
+        <w:ind w:left="2880" w:hanging="360"/>
+      </w:pPr>
+    </w:lvl>
+    <w:lvl w:ilvl="4" w:tplc="0C0A0019" w:tentative="1">
+      <w:start w:val="1"/>
+      <w:numFmt w:val="lowerLetter"/>
+      <w:lvlText w:val="%5."/>
+      <w:lvlJc w:val="left"/>
+      <w:pPr>
+        <w:ind w:left="3600" w:hanging="360"/>
+      </w:pPr>
+    </w:lvl>
+    <w:lvl w:ilvl="5" w:tplc="0C0A001B" w:tentative="1">
+      <w:start w:val="1"/>
+      <w:numFmt w:val="lowerRoman"/>
+      <w:lvlText w:val="%6."/>
+      <w:lvlJc w:val="right"/>
+      <w:pPr>
+        <w:ind w:left="4320" w:hanging="180"/>
+      </w:pPr>
+    </w:lvl>
+    <w:lvl w:ilvl="6" w:tplc="0C0A000F" w:tentative="1">
+      <w:start w:val="1"/>
+      <w:numFmt w:val="decimal"/>
+      <w:lvlText w:val="%7."/>
+      <w:lvlJc w:val="left"/>
+      <w:pPr>
+        <w:ind w:left="5040" w:hanging="360"/>
+      </w:pPr>
+    </w:lvl>
+    <w:lvl w:ilvl="7" w:tplc="0C0A0019" w:tentative="1">
+      <w:start w:val="1"/>
+      <w:numFmt w:val="lowerLetter"/>
+      <w:lvlText w:val="%8."/>
+      <w:lvlJc w:val="left"/>
+      <w:pPr>
+        <w:ind w:left="5760" w:hanging="360"/>
+      </w:pPr>
+    </w:lvl>
+    <w:lvl w:ilvl="8" w:tplc="0C0A001B" w:tentative="1">
+      <w:start w:val="1"/>
+      <w:numFmt w:val="lowerRoman"/>
+      <w:lvlText w:val="%9."/>
+      <w:lvlJc w:val="right"/>
+      <w:pPr>
+        <w:ind w:left="6480" w:hanging="180"/>
+      </w:pPr>
+    </w:lvl>
+  </w:abstractNum>
+  <w:abstractNum w:abstractNumId="8" w15:restartNumberingAfterBreak="0">
+    <w:nsid w:val="25DA5F70"/>
+    <w:multiLevelType w:val="hybridMultilevel"/>
+    <w:tmpl w:val="5D108B8A"/>
+    <w:lvl w:ilvl="0" w:tplc="A7CA65DE">
+      <w:start w:val="1"/>
+      <w:numFmt w:val="bullet"/>
+      <w:lvlText w:val="-"/>
+      <w:lvlJc w:val="left"/>
+      <w:pPr>
+        <w:ind w:left="720" w:hanging="360"/>
+      </w:pPr>
+      <w:rPr>
+        <w:rFonts w:ascii="Calibri" w:eastAsiaTheme="minorHAnsi" w:hAnsi="Calibri" w:cs="Calibri" w:hint="default"/>
+      </w:rPr>
+    </w:lvl>
+    <w:lvl w:ilvl="1" w:tplc="0C0A0003" w:tentative="1">
+      <w:start w:val="1"/>
+      <w:numFmt w:val="bullet"/>
+      <w:lvlText w:val="o"/>
+      <w:lvlJc w:val="left"/>
+      <w:pPr>
+        <w:ind w:left="1440" w:hanging="360"/>
+      </w:pPr>
+      <w:rPr>
+        <w:rFonts w:ascii="Courier New" w:hAnsi="Courier New" w:cs="Courier New" w:hint="default"/>
+      </w:rPr>
+    </w:lvl>
+    <w:lvl w:ilvl="2" w:tplc="0C0A0005" w:tentative="1">
+      <w:start w:val="1"/>
+      <w:numFmt w:val="bullet"/>
+      <w:lvlText w:val=""/>
+      <w:lvlJc w:val="left"/>
+      <w:pPr>
+        <w:ind w:left="2160" w:hanging="360"/>
+      </w:pPr>
+      <w:rPr>
+        <w:rFonts w:ascii="Wingdings" w:hAnsi="Wingdings" w:hint="default"/>
+      </w:rPr>
+    </w:lvl>
+    <w:lvl w:ilvl="3" w:tplc="0C0A0001" w:tentative="1">
+      <w:start w:val="1"/>
+      <w:numFmt w:val="bullet"/>
+      <w:lvlText w:val=""/>
+      <w:lvlJc w:val="left"/>
+      <w:pPr>
+        <w:ind w:left="2880" w:hanging="360"/>
+      </w:pPr>
+      <w:rPr>
+        <w:rFonts w:ascii="Symbol" w:hAnsi="Symbol" w:hint="default"/>
+      </w:rPr>
+    </w:lvl>
+    <w:lvl w:ilvl="4" w:tplc="0C0A0003" w:tentative="1">
+      <w:start w:val="1"/>
+      <w:numFmt w:val="bullet"/>
+      <w:lvlText w:val="o"/>
+      <w:lvlJc w:val="left"/>
+      <w:pPr>
+        <w:ind w:left="3600" w:hanging="360"/>
+      </w:pPr>
+      <w:rPr>
+        <w:rFonts w:ascii="Courier New" w:hAnsi="Courier New" w:cs="Courier New" w:hint="default"/>
+      </w:rPr>
+    </w:lvl>
+    <w:lvl w:ilvl="5" w:tplc="0C0A0005" w:tentative="1">
+      <w:start w:val="1"/>
+      <w:numFmt w:val="bullet"/>
+      <w:lvlText w:val=""/>
+      <w:lvlJc w:val="left"/>
+      <w:pPr>
+        <w:ind w:left="4320" w:hanging="360"/>
+      </w:pPr>
+      <w:rPr>
+        <w:rFonts w:ascii="Wingdings" w:hAnsi="Wingdings" w:hint="default"/>
+      </w:rPr>
+    </w:lvl>
+    <w:lvl w:ilvl="6" w:tplc="0C0A0001" w:tentative="1">
+      <w:start w:val="1"/>
+      <w:numFmt w:val="bullet"/>
+      <w:lvlText w:val=""/>
+      <w:lvlJc w:val="left"/>
+      <w:pPr>
+        <w:ind w:left="5040" w:hanging="360"/>
+      </w:pPr>
+      <w:rPr>
+        <w:rFonts w:ascii="Symbol" w:hAnsi="Symbol" w:hint="default"/>
+      </w:rPr>
+    </w:lvl>
+    <w:lvl w:ilvl="7" w:tplc="0C0A0003" w:tentative="1">
+      <w:start w:val="1"/>
+      <w:numFmt w:val="bullet"/>
+      <w:lvlText w:val="o"/>
+      <w:lvlJc w:val="left"/>
+      <w:pPr>
+        <w:ind w:left="5760" w:hanging="360"/>
+      </w:pPr>
+      <w:rPr>
+        <w:rFonts w:ascii="Courier New" w:hAnsi="Courier New" w:cs="Courier New" w:hint="default"/>
+      </w:rPr>
+    </w:lvl>
+    <w:lvl w:ilvl="8" w:tplc="0C0A0005" w:tentative="1">
+      <w:start w:val="1"/>
+      <w:numFmt w:val="bullet"/>
+      <w:lvlText w:val=""/>
+      <w:lvlJc w:val="left"/>
+      <w:pPr>
+        <w:ind w:left="6480" w:hanging="360"/>
+      </w:pPr>
+      <w:rPr>
+        <w:rFonts w:ascii="Wingdings" w:hAnsi="Wingdings" w:hint="default"/>
+      </w:rPr>
+    </w:lvl>
+  </w:abstractNum>
+  <w:abstractNum w:abstractNumId="9" w15:restartNumberingAfterBreak="0">
     <w:nsid w:val="294F68E2"/>
     <w:multiLevelType w:val="multilevel"/>
     <w:tmpl w:val="EC2C131A"/>
@@ -3404,7 +4224,7 @@
       </w:rPr>
     </w:lvl>
   </w:abstractNum>
-  <w:abstractNum w:abstractNumId="5" w15:restartNumberingAfterBreak="0">
+  <w:abstractNum w:abstractNumId="10" w15:restartNumberingAfterBreak="0">
     <w:nsid w:val="2FF214F7"/>
     <w:multiLevelType w:val="hybridMultilevel"/>
     <w:tmpl w:val="CF7C626E"/>
@@ -3518,7 +4338,7 @@
       </w:rPr>
     </w:lvl>
   </w:abstractNum>
-  <w:abstractNum w:abstractNumId="6" w15:restartNumberingAfterBreak="0">
+  <w:abstractNum w:abstractNumId="11" w15:restartNumberingAfterBreak="0">
     <w:nsid w:val="309578A3"/>
     <w:multiLevelType w:val="multilevel"/>
     <w:tmpl w:val="A62A4396"/>
@@ -3631,7 +4451,124 @@
       </w:rPr>
     </w:lvl>
   </w:abstractNum>
-  <w:abstractNum w:abstractNumId="7" w15:restartNumberingAfterBreak="0">
+  <w:abstractNum w:abstractNumId="12" w15:restartNumberingAfterBreak="0">
+    <w:nsid w:val="30C06199"/>
+    <w:multiLevelType w:val="multilevel"/>
+    <w:tmpl w:val="7742AFDA"/>
+    <w:lvl w:ilvl="0">
+      <w:start w:val="1"/>
+      <w:numFmt w:val="decimal"/>
+      <w:lvlText w:val="RF%1"/>
+      <w:lvlJc w:val="center"/>
+      <w:pPr>
+        <w:ind w:left="720" w:hanging="360"/>
+      </w:pPr>
+      <w:rPr>
+        <w:rFonts w:hint="default"/>
+        <w:b/>
+        <w:i w:val="0"/>
+      </w:rPr>
+    </w:lvl>
+    <w:lvl w:ilvl="1">
+      <w:start w:val="1"/>
+      <w:numFmt w:val="decimal"/>
+      <w:lvlText w:val="RF%1.%2"/>
+      <w:lvlJc w:val="center"/>
+      <w:pPr>
+        <w:ind w:left="1440" w:hanging="360"/>
+      </w:pPr>
+      <w:rPr>
+        <w:rFonts w:hint="default"/>
+        <w:b/>
+        <w:i w:val="0"/>
+      </w:rPr>
+    </w:lvl>
+    <w:lvl w:ilvl="2">
+      <w:start w:val="1"/>
+      <w:numFmt w:val="lowerRoman"/>
+      <w:lvlText w:val="%3."/>
+      <w:lvlJc w:val="right"/>
+      <w:pPr>
+        <w:ind w:left="2160" w:hanging="180"/>
+      </w:pPr>
+      <w:rPr>
+        <w:rFonts w:hint="default"/>
+      </w:rPr>
+    </w:lvl>
+    <w:lvl w:ilvl="3">
+      <w:start w:val="1"/>
+      <w:numFmt w:val="decimal"/>
+      <w:lvlText w:val="%4."/>
+      <w:lvlJc w:val="left"/>
+      <w:pPr>
+        <w:ind w:left="2880" w:hanging="360"/>
+      </w:pPr>
+      <w:rPr>
+        <w:rFonts w:hint="default"/>
+      </w:rPr>
+    </w:lvl>
+    <w:lvl w:ilvl="4">
+      <w:start w:val="1"/>
+      <w:numFmt w:val="lowerLetter"/>
+      <w:lvlText w:val="%5."/>
+      <w:lvlJc w:val="left"/>
+      <w:pPr>
+        <w:ind w:left="3600" w:hanging="360"/>
+      </w:pPr>
+      <w:rPr>
+        <w:rFonts w:hint="default"/>
+      </w:rPr>
+    </w:lvl>
+    <w:lvl w:ilvl="5">
+      <w:start w:val="1"/>
+      <w:numFmt w:val="lowerRoman"/>
+      <w:lvlText w:val="%6."/>
+      <w:lvlJc w:val="right"/>
+      <w:pPr>
+        <w:ind w:left="4320" w:hanging="180"/>
+      </w:pPr>
+      <w:rPr>
+        <w:rFonts w:hint="default"/>
+      </w:rPr>
+    </w:lvl>
+    <w:lvl w:ilvl="6">
+      <w:start w:val="1"/>
+      <w:numFmt w:val="decimal"/>
+      <w:lvlText w:val="%7."/>
+      <w:lvlJc w:val="left"/>
+      <w:pPr>
+        <w:ind w:left="5040" w:hanging="360"/>
+      </w:pPr>
+      <w:rPr>
+        <w:rFonts w:hint="default"/>
+      </w:rPr>
+    </w:lvl>
+    <w:lvl w:ilvl="7">
+      <w:start w:val="1"/>
+      <w:numFmt w:val="lowerLetter"/>
+      <w:lvlText w:val="%8."/>
+      <w:lvlJc w:val="left"/>
+      <w:pPr>
+        <w:ind w:left="5760" w:hanging="360"/>
+      </w:pPr>
+      <w:rPr>
+        <w:rFonts w:hint="default"/>
+      </w:rPr>
+    </w:lvl>
+    <w:lvl w:ilvl="8">
+      <w:start w:val="1"/>
+      <w:numFmt w:val="lowerRoman"/>
+      <w:lvlText w:val="%9."/>
+      <w:lvlJc w:val="right"/>
+      <w:pPr>
+        <w:ind w:left="6480" w:hanging="180"/>
+      </w:pPr>
+      <w:rPr>
+        <w:rFonts w:hint="default"/>
+      </w:rPr>
+    </w:lvl>
+  </w:abstractNum>
+  <w:abstractNum w:abstractNumId="13" w15:restartNumberingAfterBreak="0">
     <w:nsid w:val="400B2895"/>
     <w:multiLevelType w:val="multilevel"/>
     <w:tmpl w:val="29CA851A"/>
@@ -3744,7 +4681,7 @@
       </w:rPr>
     </w:lvl>
   </w:abstractNum>
-  <w:abstractNum w:abstractNumId="8" w15:restartNumberingAfterBreak="0">
+  <w:abstractNum w:abstractNumId="14" w15:restartNumberingAfterBreak="0">
     <w:nsid w:val="45A9145B"/>
     <w:multiLevelType w:val="hybridMultilevel"/>
     <w:tmpl w:val="282A5A02"/>
@@ -3833,7 +4770,7 @@
       </w:pPr>
     </w:lvl>
   </w:abstractNum>
-  <w:abstractNum w:abstractNumId="9" w15:restartNumberingAfterBreak="0">
+  <w:abstractNum w:abstractNumId="15" w15:restartNumberingAfterBreak="0">
     <w:nsid w:val="54785330"/>
     <w:multiLevelType w:val="hybridMultilevel"/>
     <w:tmpl w:val="1BB42C98"/>
@@ -3944,7 +4881,98 @@
       </w:rPr>
     </w:lvl>
   </w:abstractNum>
-  <w:abstractNum w:abstractNumId="10" w15:restartNumberingAfterBreak="0">
+  <w:abstractNum w:abstractNumId="16" w15:restartNumberingAfterBreak="0">
+    <w:nsid w:val="593E7642"/>
+    <w:multiLevelType w:val="hybridMultilevel"/>
+    <w:tmpl w:val="013226C0"/>
+    <w:lvl w:ilvl="0" w:tplc="851E3888">
+      <w:start w:val="1"/>
+      <w:numFmt w:val="decimal"/>
+      <w:lvlText w:val="RF%1."/>
+      <w:lvlJc w:val="left"/>
+      <w:pPr>
+        <w:ind w:left="720" w:hanging="360"/>
+      </w:pPr>
+      <w:rPr>
+        <w:rFonts w:hint="default"/>
+        <w:b/>
+        <w:i w:val="0"/>
+      </w:rPr>
+    </w:lvl>
+    <w:lvl w:ilvl="1" w:tplc="0C0A0019" w:tentative="1">
+      <w:start w:val="1"/>
+      <w:numFmt w:val="lowerLetter"/>
+      <w:lvlText w:val="%2."/>
+      <w:lvlJc w:val="left"/>
+      <w:pPr>
+        <w:ind w:left="1440" w:hanging="360"/>
+      </w:pPr>
+    </w:lvl>
+    <w:lvl w:ilvl="2" w:tplc="0C0A001B" w:tentative="1">
+      <w:start w:val="1"/>
+      <w:numFmt w:val="lowerRoman"/>
+      <w:lvlText w:val="%3."/>
+      <w:lvlJc w:val="right"/>
+      <w:pPr>
+        <w:ind w:left="2160" w:hanging="180"/>
+      </w:pPr>
+    </w:lvl>
+    <w:lvl w:ilvl="3" w:tplc="0C0A000F" w:tentative="1">
+      <w:start w:val="1"/>
+      <w:numFmt w:val="decimal"/>
+      <w:lvlText w:val="%4."/>
+      <w:lvlJc w:val="left"/>
+      <w:pPr>
+        <w:ind w:left="2880" w:hanging="360"/>
+      </w:pPr>
+    </w:lvl>
+    <w:lvl w:ilvl="4" w:tplc="0C0A0019" w:tentative="1">
+      <w:start w:val="1"/>
+      <w:numFmt w:val="lowerLetter"/>
+      <w:lvlText w:val="%5."/>
+      <w:lvlJc w:val="left"/>
+      <w:pPr>
+        <w:ind w:left="3600" w:hanging="360"/>
+      </w:pPr>
+    </w:lvl>
+    <w:lvl w:ilvl="5" w:tplc="0C0A001B" w:tentative="1">
+      <w:start w:val="1"/>
+      <w:numFmt w:val="lowerRoman"/>
+      <w:lvlText w:val="%6."/>
+      <w:lvlJc w:val="right"/>
+      <w:pPr>
+        <w:ind w:left="4320" w:hanging="180"/>
+      </w:pPr>
+    </w:lvl>
+    <w:lvl w:ilvl="6" w:tplc="0C0A000F" w:tentative="1">
+      <w:start w:val="1"/>
+      <w:numFmt w:val="decimal"/>
+      <w:lvlText w:val="%7."/>
+      <w:lvlJc w:val="left"/>
+      <w:pPr>
+        <w:ind w:left="5040" w:hanging="360"/>
+      </w:pPr>
+    </w:lvl>
+    <w:lvl w:ilvl="7" w:tplc="0C0A0019" w:tentative="1">
+      <w:start w:val="1"/>
+      <w:numFmt w:val="lowerLetter"/>
+      <w:lvlText w:val="%8."/>
+      <w:lvlJc w:val="left"/>
+      <w:pPr>
+        <w:ind w:left="5760" w:hanging="360"/>
+      </w:pPr>
+    </w:lvl>
+    <w:lvl w:ilvl="8" w:tplc="0C0A001B" w:tentative="1">
+      <w:start w:val="1"/>
+      <w:numFmt w:val="lowerRoman"/>
+      <w:lvlText w:val="%9."/>
+      <w:lvlJc w:val="right"/>
+      <w:pPr>
+        <w:ind w:left="6480" w:hanging="180"/>
+      </w:pPr>
+    </w:lvl>
+  </w:abstractNum>
+  <w:abstractNum w:abstractNumId="17" w15:restartNumberingAfterBreak="0">
     <w:nsid w:val="59654BDA"/>
     <w:multiLevelType w:val="multilevel"/>
     <w:tmpl w:val="7B140CEC"/>
@@ -4057,7 +5085,7 @@
       </w:rPr>
     </w:lvl>
   </w:abstractNum>
-  <w:abstractNum w:abstractNumId="11" w15:restartNumberingAfterBreak="0">
+  <w:abstractNum w:abstractNumId="18" w15:restartNumberingAfterBreak="0">
     <w:nsid w:val="59B41EC9"/>
     <w:multiLevelType w:val="hybridMultilevel"/>
     <w:tmpl w:val="9E6287E8"/>
@@ -4171,7 +5199,98 @@
       </w:rPr>
     </w:lvl>
   </w:abstractNum>
-  <w:abstractNum w:abstractNumId="12" w15:restartNumberingAfterBreak="0">
+  <w:abstractNum w:abstractNumId="19" w15:restartNumberingAfterBreak="0">
+    <w:nsid w:val="5D3214D4"/>
+    <w:multiLevelType w:val="hybridMultilevel"/>
+    <w:tmpl w:val="952C518C"/>
+    <w:lvl w:ilvl="0" w:tplc="851E3888">
+      <w:start w:val="1"/>
+      <w:numFmt w:val="decimal"/>
+      <w:lvlText w:val="RF%1."/>
+      <w:lvlJc w:val="left"/>
+      <w:pPr>
+        <w:ind w:left="720" w:hanging="360"/>
+      </w:pPr>
+      <w:rPr>
+        <w:rFonts w:hint="default"/>
+        <w:b/>
+        <w:i w:val="0"/>
+      </w:rPr>
+    </w:lvl>
+    <w:lvl w:ilvl="1" w:tplc="0C0A0019" w:tentative="1">
+      <w:start w:val="1"/>
+      <w:numFmt w:val="lowerLetter"/>
+      <w:lvlText w:val="%2."/>
+      <w:lvlJc w:val="left"/>
+      <w:pPr>
+        <w:ind w:left="1440" w:hanging="360"/>
+      </w:pPr>
+    </w:lvl>
+    <w:lvl w:ilvl="2" w:tplc="0C0A001B" w:tentative="1">
+      <w:start w:val="1"/>
+      <w:numFmt w:val="lowerRoman"/>
+      <w:lvlText w:val="%3."/>
+      <w:lvlJc w:val="right"/>
+      <w:pPr>
+        <w:ind w:left="2160" w:hanging="180"/>
+      </w:pPr>
+    </w:lvl>
+    <w:lvl w:ilvl="3" w:tplc="0C0A000F" w:tentative="1">
+      <w:start w:val="1"/>
+      <w:numFmt w:val="decimal"/>
+      <w:lvlText w:val="%4."/>
+      <w:lvlJc w:val="left"/>
+      <w:pPr>
+        <w:ind w:left="2880" w:hanging="360"/>
+      </w:pPr>
+    </w:lvl>
+    <w:lvl w:ilvl="4" w:tplc="0C0A0019" w:tentative="1">
+      <w:start w:val="1"/>
+      <w:numFmt w:val="lowerLetter"/>
+      <w:lvlText w:val="%5."/>
+      <w:lvlJc w:val="left"/>
+      <w:pPr>
+        <w:ind w:left="3600" w:hanging="360"/>
+      </w:pPr>
+    </w:lvl>
+    <w:lvl w:ilvl="5" w:tplc="0C0A001B" w:tentative="1">
+      <w:start w:val="1"/>
+      <w:numFmt w:val="lowerRoman"/>
+      <w:lvlText w:val="%6."/>
+      <w:lvlJc w:val="right"/>
+      <w:pPr>
+        <w:ind w:left="4320" w:hanging="180"/>
+      </w:pPr>
+    </w:lvl>
+    <w:lvl w:ilvl="6" w:tplc="0C0A000F" w:tentative="1">
+      <w:start w:val="1"/>
+      <w:numFmt w:val="decimal"/>
+      <w:lvlText w:val="%7."/>
+      <w:lvlJc w:val="left"/>
+      <w:pPr>
+        <w:ind w:left="5040" w:hanging="360"/>
+      </w:pPr>
+    </w:lvl>
+    <w:lvl w:ilvl="7" w:tplc="0C0A0019" w:tentative="1">
+      <w:start w:val="1"/>
+      <w:numFmt w:val="lowerLetter"/>
+      <w:lvlText w:val="%8."/>
+      <w:lvlJc w:val="left"/>
+      <w:pPr>
+        <w:ind w:left="5760" w:hanging="360"/>
+      </w:pPr>
+    </w:lvl>
+    <w:lvl w:ilvl="8" w:tplc="0C0A001B" w:tentative="1">
+      <w:start w:val="1"/>
+      <w:numFmt w:val="lowerRoman"/>
+      <w:lvlText w:val="%9."/>
+      <w:lvlJc w:val="right"/>
+      <w:pPr>
+        <w:ind w:left="6480" w:hanging="180"/>
+      </w:pPr>
+    </w:lvl>
+  </w:abstractNum>
+  <w:abstractNum w:abstractNumId="20" w15:restartNumberingAfterBreak="0">
     <w:nsid w:val="65A83448"/>
     <w:multiLevelType w:val="multilevel"/>
     <w:tmpl w:val="C4A0D928"/>
@@ -4284,7 +5403,7 @@
       </w:rPr>
     </w:lvl>
   </w:abstractNum>
-  <w:abstractNum w:abstractNumId="13" w15:restartNumberingAfterBreak="0">
+  <w:abstractNum w:abstractNumId="21" w15:restartNumberingAfterBreak="0">
     <w:nsid w:val="6A38221D"/>
     <w:multiLevelType w:val="multilevel"/>
     <w:tmpl w:val="EA58F970"/>
@@ -4397,7 +5516,98 @@
       </w:rPr>
     </w:lvl>
   </w:abstractNum>
-  <w:abstractNum w:abstractNumId="14" w15:restartNumberingAfterBreak="0">
+  <w:abstractNum w:abstractNumId="22" w15:restartNumberingAfterBreak="0">
+    <w:nsid w:val="6C6B144B"/>
+    <w:multiLevelType w:val="hybridMultilevel"/>
+    <w:tmpl w:val="860A9000"/>
+    <w:lvl w:ilvl="0" w:tplc="52F4C64A">
+      <w:start w:val="1"/>
+      <w:numFmt w:val="decimal"/>
+      <w:lvlText w:val="RNF%1."/>
+      <w:lvlJc w:val="left"/>
+      <w:pPr>
+        <w:ind w:left="720" w:hanging="360"/>
+      </w:pPr>
+      <w:rPr>
+        <w:rFonts w:hint="default"/>
+        <w:b/>
+        <w:i w:val="0"/>
+      </w:rPr>
+    </w:lvl>
+    <w:lvl w:ilvl="1" w:tplc="0C0A0019" w:tentative="1">
+      <w:start w:val="1"/>
+      <w:numFmt w:val="lowerLetter"/>
+      <w:lvlText w:val="%2."/>
+      <w:lvlJc w:val="left"/>
+      <w:pPr>
+        <w:ind w:left="1440" w:hanging="360"/>
+      </w:pPr>
+    </w:lvl>
+    <w:lvl w:ilvl="2" w:tplc="0C0A001B" w:tentative="1">
+      <w:start w:val="1"/>
+      <w:numFmt w:val="lowerRoman"/>
+      <w:lvlText w:val="%3."/>
+      <w:lvlJc w:val="right"/>
+      <w:pPr>
+        <w:ind w:left="2160" w:hanging="180"/>
+      </w:pPr>
+    </w:lvl>
+    <w:lvl w:ilvl="3" w:tplc="0C0A000F" w:tentative="1">
+      <w:start w:val="1"/>
+      <w:numFmt w:val="decimal"/>
+      <w:lvlText w:val="%4."/>
+      <w:lvlJc w:val="left"/>
+      <w:pPr>
+        <w:ind w:left="2880" w:hanging="360"/>
+      </w:pPr>
+    </w:lvl>
+    <w:lvl w:ilvl="4" w:tplc="0C0A0019" w:tentative="1">
+      <w:start w:val="1"/>
+      <w:numFmt w:val="lowerLetter"/>
+      <w:lvlText w:val="%5."/>
+      <w:lvlJc w:val="left"/>
+      <w:pPr>
+        <w:ind w:left="3600" w:hanging="360"/>
+      </w:pPr>
+    </w:lvl>
+    <w:lvl w:ilvl="5" w:tplc="0C0A001B" w:tentative="1">
+      <w:start w:val="1"/>
+      <w:numFmt w:val="lowerRoman"/>
+      <w:lvlText w:val="%6."/>
+      <w:lvlJc w:val="right"/>
+      <w:pPr>
+        <w:ind w:left="4320" w:hanging="180"/>
+      </w:pPr>
+    </w:lvl>
+    <w:lvl w:ilvl="6" w:tplc="0C0A000F" w:tentative="1">
+      <w:start w:val="1"/>
+      <w:numFmt w:val="decimal"/>
+      <w:lvlText w:val="%7."/>
+      <w:lvlJc w:val="left"/>
+      <w:pPr>
+        <w:ind w:left="5040" w:hanging="360"/>
+      </w:pPr>
+    </w:lvl>
+    <w:lvl w:ilvl="7" w:tplc="0C0A0019" w:tentative="1">
+      <w:start w:val="1"/>
+      <w:numFmt w:val="lowerLetter"/>
+      <w:lvlText w:val="%8."/>
+      <w:lvlJc w:val="left"/>
+      <w:pPr>
+        <w:ind w:left="5760" w:hanging="360"/>
+      </w:pPr>
+    </w:lvl>
+    <w:lvl w:ilvl="8" w:tplc="0C0A001B" w:tentative="1">
+      <w:start w:val="1"/>
+      <w:numFmt w:val="lowerRoman"/>
+      <w:lvlText w:val="%9."/>
+      <w:lvlJc w:val="right"/>
+      <w:pPr>
+        <w:ind w:left="6480" w:hanging="180"/>
+      </w:pPr>
+    </w:lvl>
+  </w:abstractNum>
+  <w:abstractNum w:abstractNumId="23" w15:restartNumberingAfterBreak="0">
     <w:nsid w:val="73EA1DEB"/>
     <w:multiLevelType w:val="hybridMultilevel"/>
     <w:tmpl w:val="9AC27004"/>
@@ -4486,7 +5696,7 @@
       </w:pPr>
     </w:lvl>
   </w:abstractNum>
-  <w:abstractNum w:abstractNumId="15" w15:restartNumberingAfterBreak="0">
+  <w:abstractNum w:abstractNumId="24" w15:restartNumberingAfterBreak="0">
     <w:nsid w:val="77E86306"/>
     <w:multiLevelType w:val="hybridMultilevel"/>
     <w:tmpl w:val="5012487C"/>
@@ -4572,7 +5782,7 @@
       </w:pPr>
     </w:lvl>
   </w:abstractNum>
-  <w:abstractNum w:abstractNumId="16" w15:restartNumberingAfterBreak="0">
+  <w:abstractNum w:abstractNumId="25" w15:restartNumberingAfterBreak="0">
     <w:nsid w:val="7E6365E8"/>
     <w:multiLevelType w:val="hybridMultilevel"/>
     <w:tmpl w:val="468CCF2A"/>
@@ -4685,7 +5895,7 @@
       </w:rPr>
     </w:lvl>
   </w:abstractNum>
-  <w:abstractNum w:abstractNumId="17" w15:restartNumberingAfterBreak="0">
+  <w:abstractNum w:abstractNumId="26" w15:restartNumberingAfterBreak="0">
     <w:nsid w:val="7F687E8B"/>
     <w:multiLevelType w:val="multilevel"/>
     <w:tmpl w:val="ED9287FE"/>
@@ -4799,58 +6009,85 @@
     </w:lvl>
   </w:abstractNum>
   <w:num w:numId="1">
-    <w:abstractNumId w:val="14"/>
+    <w:abstractNumId w:val="23"/>
   </w:num>
   <w:num w:numId="2">
     <w:abstractNumId w:val="0"/>
   </w:num>
   <w:num w:numId="3">
+    <w:abstractNumId w:val="26"/>
+  </w:num>
+  <w:num w:numId="4">
+    <w:abstractNumId w:val="20"/>
+  </w:num>
+  <w:num w:numId="5">
     <w:abstractNumId w:val="17"/>
   </w:num>
-  <w:num w:numId="4">
-    <w:abstractNumId w:val="12"/>
+  <w:num w:numId="6">
+    <w:abstractNumId w:val="9"/>
   </w:num>
-  <w:num w:numId="5">
+  <w:num w:numId="7">
+    <w:abstractNumId w:val="2"/>
+  </w:num>
+  <w:num w:numId="8">
+    <w:abstractNumId w:val="21"/>
+  </w:num>
+  <w:num w:numId="9">
+    <w:abstractNumId w:val="11"/>
+  </w:num>
+  <w:num w:numId="10">
+    <w:abstractNumId w:val="13"/>
+  </w:num>
+  <w:num w:numId="11">
+    <w:abstractNumId w:val="5"/>
+  </w:num>
+  <w:num w:numId="12">
+    <w:abstractNumId w:val="15"/>
+  </w:num>
+  <w:num w:numId="13">
     <w:abstractNumId w:val="10"/>
   </w:num>
-  <w:num w:numId="6">
+  <w:num w:numId="14">
+    <w:abstractNumId w:val="18"/>
+  </w:num>
+  <w:num w:numId="15">
     <w:abstractNumId w:val="4"/>
   </w:num>
-  <w:num w:numId="7">
+  <w:num w:numId="16">
+    <w:abstractNumId w:val="14"/>
+  </w:num>
+  <w:num w:numId="17">
+    <w:abstractNumId w:val="24"/>
+  </w:num>
+  <w:num w:numId="18">
+    <w:abstractNumId w:val="25"/>
+  </w:num>
+  <w:num w:numId="19">
     <w:abstractNumId w:val="1"/>
   </w:num>
-  <w:num w:numId="8">
-    <w:abstractNumId w:val="13"/>
-  </w:num>
-  <w:num w:numId="9">
+  <w:num w:numId="20">
     <w:abstractNumId w:val="6"/>
   </w:num>
-  <w:num w:numId="10">
+  <w:num w:numId="21">
     <w:abstractNumId w:val="7"/>
   </w:num>
-  <w:num w:numId="11">
+  <w:num w:numId="22">
+    <w:abstractNumId w:val="8"/>
+  </w:num>
+  <w:num w:numId="23">
     <w:abstractNumId w:val="3"/>
   </w:num>
-  <w:num w:numId="12">
-    <w:abstractNumId w:val="9"/>
+  <w:num w:numId="24">
+    <w:abstractNumId w:val="22"/>
   </w:num>
-  <w:num w:numId="13">
-    <w:abstractNumId w:val="5"/>
+  <w:num w:numId="25">
+    <w:abstractNumId w:val="19"/>
   </w:num>
-  <w:num w:numId="14">
-    <w:abstractNumId w:val="11"/>
+  <w:num w:numId="26">
+    <w:abstractNumId w:val="16"/>
   </w:num>
-  <w:num w:numId="15">
-    <w:abstractNumId w:val="2"/>
-  </w:num>
-  <w:num w:numId="16">
-    <w:abstractNumId w:val="8"/>
-  </w:num>
-  <w:num w:numId="17">
-    <w:abstractNumId w:val="15"/>
-  </w:num>
-  <w:num w:numId="18">
-    <w:abstractNumId w:val="16"/>
+  <w:num w:numId="27">
+    <w:abstractNumId w:val="12"/>
   </w:num>
 </w:numbering>
 </file>
@@ -5250,7 +6487,10 @@
   <w:style w:type="paragraph" w:default="1" w:styleId="Normal">
     <w:name w:val="Normal"/>
     <w:qFormat/>
-    <w:rsid w:val="00EF7394"/>
+    <w:rsid w:val="005B4C25"/>
+    <w:rPr>
+      <w:sz w:val="24"/>
+    </w:rPr>
   </w:style>
   <w:style w:type="paragraph" w:styleId="Ttulo1">
     <w:name w:val="heading 1"/>
@@ -5316,7 +6556,6 @@
       <w:rFonts w:eastAsiaTheme="majorEastAsia" w:cstheme="majorBidi"/>
       <w:b/>
       <w:color w:val="00B0F0"/>
-      <w:sz w:val="24"/>
       <w:szCs w:val="24"/>
       <w:u w:val="single"/>
     </w:rPr>
@@ -5882,7 +7121,7 @@
 </file>
 
 <file path=customXml/itemProps1.xml><?xml version="1.0" encoding="utf-8"?>
-<ds:datastoreItem xmlns:ds="http://schemas.openxmlformats.org/officeDocument/2006/customXml" ds:itemID="{B969280F-48C4-49A5-9851-EB7B33727E21}">
+<ds:datastoreItem xmlns:ds="http://schemas.openxmlformats.org/officeDocument/2006/customXml" ds:itemID="{2823A75B-A1C7-4890-B0B8-D9C5AD326BFA}">
   <ds:schemaRefs>
     <ds:schemaRef ds:uri="http://schemas.openxmlformats.org/officeDocument/2006/bibliography"/>
   </ds:schemaRefs>

</xml_diff>

<commit_message>
Fase de Analisis y Fase de diseño
</commit_message>
<xml_diff>
--- a/InformeProyecto_MarioGonzalezDeLaIglesia/InformeProyecto_MarioGonzálezDeLaIglesia.docx
+++ b/InformeProyecto_MarioGonzalezDeLaIglesia/InformeProyecto_MarioGonzálezDeLaIglesia.docx
@@ -1,6 +1,6 @@
 
 <file path=word/document.xml><?xml version="1.0" encoding="utf-8"?>
-<w:document xmlns:wpc="http://schemas.microsoft.com/office/word/2010/wordprocessingCanvas" xmlns:cx="http://schemas.microsoft.com/office/drawing/2014/chartex" xmlns:mc="http://schemas.openxmlformats.org/markup-compatibility/2006" xmlns:o="urn:schemas-microsoft-com:office:office" xmlns:r="http://schemas.openxmlformats.org/officeDocument/2006/relationships" xmlns:m="http://schemas.openxmlformats.org/officeDocument/2006/math" xmlns:v="urn:schemas-microsoft-com:vml" xmlns:wp14="http://schemas.microsoft.com/office/word/2010/wordprocessingDrawing" xmlns:wp="http://schemas.openxmlformats.org/drawingml/2006/wordprocessingDrawing" xmlns:w10="urn:schemas-microsoft-com:office:word" xmlns:w="http://schemas.openxmlformats.org/wordprocessingml/2006/main" xmlns:w14="http://schemas.microsoft.com/office/word/2010/wordml" xmlns:w15="http://schemas.microsoft.com/office/word/2012/wordml" xmlns:w16se="http://schemas.microsoft.com/office/word/2015/wordml/symex" xmlns:wpg="http://schemas.microsoft.com/office/word/2010/wordprocessingGroup" xmlns:wpi="http://schemas.microsoft.com/office/word/2010/wordprocessingInk" xmlns:wne="http://schemas.microsoft.com/office/word/2006/wordml" xmlns:wps="http://schemas.microsoft.com/office/word/2010/wordprocessingShape" mc:Ignorable="w14 w15 w16se wp14">
+<w:document xmlns:wpc="http://schemas.microsoft.com/office/word/2010/wordprocessingCanvas" xmlns:cx="http://schemas.microsoft.com/office/drawing/2014/chartex" xmlns:cx1="http://schemas.microsoft.com/office/drawing/2015/9/8/chartex" xmlns:cx2="http://schemas.microsoft.com/office/drawing/2015/10/21/chartex" xmlns:cx3="http://schemas.microsoft.com/office/drawing/2016/5/9/chartex" xmlns:cx4="http://schemas.microsoft.com/office/drawing/2016/5/10/chartex" xmlns:cx5="http://schemas.microsoft.com/office/drawing/2016/5/11/chartex" xmlns:cx6="http://schemas.microsoft.com/office/drawing/2016/5/12/chartex" xmlns:cx7="http://schemas.microsoft.com/office/drawing/2016/5/13/chartex" xmlns:cx8="http://schemas.microsoft.com/office/drawing/2016/5/14/chartex" xmlns:mc="http://schemas.openxmlformats.org/markup-compatibility/2006" xmlns:aink="http://schemas.microsoft.com/office/drawing/2016/ink" xmlns:am3d="http://schemas.microsoft.com/office/drawing/2017/model3d" xmlns:o="urn:schemas-microsoft-com:office:office" xmlns:oel="http://schemas.microsoft.com/office/2019/extlst" xmlns:r="http://schemas.openxmlformats.org/officeDocument/2006/relationships" xmlns:m="http://schemas.openxmlformats.org/officeDocument/2006/math" xmlns:v="urn:schemas-microsoft-com:vml" xmlns:wp14="http://schemas.microsoft.com/office/word/2010/wordprocessingDrawing" xmlns:wp="http://schemas.openxmlformats.org/drawingml/2006/wordprocessingDrawing" xmlns:w10="urn:schemas-microsoft-com:office:word" xmlns:w="http://schemas.openxmlformats.org/wordprocessingml/2006/main" xmlns:w14="http://schemas.microsoft.com/office/word/2010/wordml" xmlns:w15="http://schemas.microsoft.com/office/word/2012/wordml" xmlns:w16cex="http://schemas.microsoft.com/office/word/2018/wordml/cex" xmlns:w16cid="http://schemas.microsoft.com/office/word/2016/wordml/cid" xmlns:w16="http://schemas.microsoft.com/office/word/2018/wordml" xmlns:w16du="http://schemas.microsoft.com/office/word/2023/wordml/word16du" xmlns:w16sdtdh="http://schemas.microsoft.com/office/word/2020/wordml/sdtdatahash" xmlns:w16sdtfl="http://schemas.microsoft.com/office/word/2024/wordml/sdtformatlock" xmlns:w16se="http://schemas.microsoft.com/office/word/2015/wordml/symex" xmlns:wpg="http://schemas.microsoft.com/office/word/2010/wordprocessingGroup" xmlns:wpi="http://schemas.microsoft.com/office/word/2010/wordprocessingInk" xmlns:wne="http://schemas.microsoft.com/office/word/2006/wordml" xmlns:wps="http://schemas.microsoft.com/office/word/2010/wordprocessingShape" mc:Ignorable="w14 w15 w16se w16cid w16 w16cex w16sdtdh w16sdtfl w16du wp14">
   <w:body>
     <w:tbl>
       <w:tblPr>
@@ -1638,6 +1638,9 @@
             <w:pPr>
               <w:jc w:val="center"/>
             </w:pPr>
+            <w:r>
+              <w:t>Modificación de fase análisis</w:t>
+            </w:r>
           </w:p>
         </w:tc>
         <w:tc>
@@ -1650,6 +1653,126 @@
             </w:pPr>
             <w:r>
               <w:t>29/04/2026</w:t>
+            </w:r>
+          </w:p>
+        </w:tc>
+      </w:tr>
+      <w:tr>
+        <w:trPr>
+          <w:jc w:val="center"/>
+        </w:trPr>
+        <w:tc>
+          <w:tcPr>
+            <w:tcW w:w="1129" w:type="dxa"/>
+          </w:tcPr>
+          <w:p>
+            <w:pPr>
+              <w:jc w:val="center"/>
+            </w:pPr>
+            <w:r>
+              <w:t>1.</w:t>
+            </w:r>
+            <w:r>
+              <w:t>1.1</w:t>
+            </w:r>
+          </w:p>
+        </w:tc>
+        <w:tc>
+          <w:tcPr>
+            <w:tcW w:w="1843" w:type="dxa"/>
+          </w:tcPr>
+          <w:p>
+            <w:pPr>
+              <w:jc w:val="center"/>
+            </w:pPr>
+            <w:r>
+              <w:t>Mario González</w:t>
+            </w:r>
+          </w:p>
+        </w:tc>
+        <w:tc>
+          <w:tcPr>
+            <w:tcW w:w="2385" w:type="dxa"/>
+          </w:tcPr>
+          <w:p>
+            <w:pPr>
+              <w:jc w:val="center"/>
+            </w:pPr>
+            <w:r>
+              <w:t>Modificación de fase análisis</w:t>
+            </w:r>
+          </w:p>
+        </w:tc>
+        <w:tc>
+          <w:tcPr>
+            <w:tcW w:w="1699" w:type="dxa"/>
+          </w:tcPr>
+          <w:p>
+            <w:pPr>
+              <w:jc w:val="center"/>
+            </w:pPr>
+            <w:r>
+              <w:t>7</w:t>
+            </w:r>
+            <w:r>
+              <w:t>/5/2026</w:t>
+            </w:r>
+          </w:p>
+        </w:tc>
+      </w:tr>
+      <w:tr>
+        <w:trPr>
+          <w:jc w:val="center"/>
+        </w:trPr>
+        <w:tc>
+          <w:tcPr>
+            <w:tcW w:w="1129" w:type="dxa"/>
+          </w:tcPr>
+          <w:p>
+            <w:pPr>
+              <w:jc w:val="center"/>
+            </w:pPr>
+            <w:r>
+              <w:t>1.2</w:t>
+            </w:r>
+          </w:p>
+        </w:tc>
+        <w:tc>
+          <w:tcPr>
+            <w:tcW w:w="1843" w:type="dxa"/>
+          </w:tcPr>
+          <w:p>
+            <w:pPr>
+              <w:jc w:val="center"/>
+            </w:pPr>
+            <w:r>
+              <w:t>Mario González</w:t>
+            </w:r>
+          </w:p>
+        </w:tc>
+        <w:tc>
+          <w:tcPr>
+            <w:tcW w:w="2385" w:type="dxa"/>
+          </w:tcPr>
+          <w:p>
+            <w:pPr>
+              <w:jc w:val="center"/>
+            </w:pPr>
+            <w:r>
+              <w:t>Documentar la fase de diseño</w:t>
+            </w:r>
+          </w:p>
+        </w:tc>
+        <w:tc>
+          <w:tcPr>
+            <w:tcW w:w="1699" w:type="dxa"/>
+          </w:tcPr>
+          <w:p>
+            <w:pPr>
+              <w:jc w:val="center"/>
+            </w:pPr>
+            <w:r>
+              <w:t>8/5/2026</w:t>
             </w:r>
           </w:p>
         </w:tc>
@@ -1750,102 +1873,6 @@
           </w:p>
         </w:tc>
       </w:tr>
-      <w:tr>
-        <w:trPr>
-          <w:jc w:val="center"/>
-        </w:trPr>
-        <w:tc>
-          <w:tcPr>
-            <w:tcW w:w="1129" w:type="dxa"/>
-          </w:tcPr>
-          <w:p>
-            <w:pPr>
-              <w:jc w:val="center"/>
-            </w:pPr>
-          </w:p>
-        </w:tc>
-        <w:tc>
-          <w:tcPr>
-            <w:tcW w:w="1843" w:type="dxa"/>
-          </w:tcPr>
-          <w:p>
-            <w:pPr>
-              <w:jc w:val="center"/>
-            </w:pPr>
-            <w:r>
-              <w:t>Mario González</w:t>
-            </w:r>
-          </w:p>
-        </w:tc>
-        <w:tc>
-          <w:tcPr>
-            <w:tcW w:w="2385" w:type="dxa"/>
-          </w:tcPr>
-          <w:p>
-            <w:pPr>
-              <w:jc w:val="center"/>
-            </w:pPr>
-          </w:p>
-        </w:tc>
-        <w:tc>
-          <w:tcPr>
-            <w:tcW w:w="1699" w:type="dxa"/>
-          </w:tcPr>
-          <w:p>
-            <w:pPr>
-              <w:jc w:val="center"/>
-            </w:pPr>
-          </w:p>
-        </w:tc>
-      </w:tr>
-      <w:tr>
-        <w:trPr>
-          <w:jc w:val="center"/>
-        </w:trPr>
-        <w:tc>
-          <w:tcPr>
-            <w:tcW w:w="1129" w:type="dxa"/>
-          </w:tcPr>
-          <w:p>
-            <w:pPr>
-              <w:jc w:val="center"/>
-            </w:pPr>
-          </w:p>
-        </w:tc>
-        <w:tc>
-          <w:tcPr>
-            <w:tcW w:w="1843" w:type="dxa"/>
-          </w:tcPr>
-          <w:p>
-            <w:pPr>
-              <w:jc w:val="center"/>
-            </w:pPr>
-            <w:r>
-              <w:t>Mario González</w:t>
-            </w:r>
-          </w:p>
-        </w:tc>
-        <w:tc>
-          <w:tcPr>
-            <w:tcW w:w="2385" w:type="dxa"/>
-          </w:tcPr>
-          <w:p>
-            <w:pPr>
-              <w:jc w:val="center"/>
-            </w:pPr>
-          </w:p>
-        </w:tc>
-        <w:tc>
-          <w:tcPr>
-            <w:tcW w:w="1699" w:type="dxa"/>
-          </w:tcPr>
-          <w:p>
-            <w:pPr>
-              <w:jc w:val="center"/>
-            </w:pPr>
-          </w:p>
-        </w:tc>
-      </w:tr>
     </w:tbl>
     <w:p>
       <w:r>
@@ -1948,36 +1975,19 @@
           <w:ilvl w:val="0"/>
           <w:numId w:val="27"/>
         </w:numPr>
-      </w:pPr>
-      <w:r>
-        <w:t>Conseguir que haya una gestión clara del stock</w:t>
-      </w:r>
-      <w:r>
-        <w:t>.</w:t>
-      </w:r>
-    </w:p>
-    <w:p>
-      <w:pPr>
-        <w:pStyle w:val="Prrafodelista"/>
-        <w:numPr>
-          <w:ilvl w:val="1"/>
-          <w:numId w:val="27"/>
-        </w:numPr>
-      </w:pPr>
-      <w:r>
-        <w:t>Una validación que un código de ranura tenga su formato correcto.</w:t>
-      </w:r>
-    </w:p>
-    <w:p>
-      <w:pPr>
-        <w:pStyle w:val="Prrafodelista"/>
-        <w:numPr>
-          <w:ilvl w:val="1"/>
-          <w:numId w:val="27"/>
-        </w:numPr>
-      </w:pPr>
-      <w:r>
-        <w:t>Implementar algo que al añadir un producto en una ranura libre.</w:t>
+        <w:jc w:val="both"/>
+      </w:pPr>
+      <w:r>
+        <w:t xml:space="preserve">Presentar al iniciar el sistema un catálogo de productos con </w:t>
+      </w:r>
+      <w:r>
+        <w:t>sus dat</w:t>
+      </w:r>
+      <w:r>
+        <w:t>os y</w:t>
+      </w:r>
+      <w:r>
+        <w:t xml:space="preserve"> precio calculado.</w:t>
       </w:r>
     </w:p>
     <w:p>
@@ -1987,22 +1997,10 @@
           <w:ilvl w:val="0"/>
           <w:numId w:val="27"/>
         </w:numPr>
-      </w:pPr>
-      <w:r>
-        <w:t>(dos usuarios)</w:t>
-      </w:r>
-    </w:p>
-    <w:p>
-      <w:pPr>
-        <w:rPr>
-          <w:b/>
-        </w:rPr>
-      </w:pPr>
-      <w:r>
-        <w:rPr>
-          <w:b/>
-        </w:rPr>
-        <w:t>Modo Usuario</w:t>
+        <w:jc w:val="both"/>
+      </w:pPr>
+      <w:r>
+        <w:t>Dispondrá de dos usuarios dentro del sistema, de los cuales tendrán diferentes elecciones.</w:t>
       </w:r>
     </w:p>
     <w:p>
@@ -2012,9 +2010,10 @@
           <w:ilvl w:val="0"/>
           <w:numId w:val="27"/>
         </w:numPr>
-      </w:pPr>
-      <w:r>
-        <w:t>Conseguir que un usuario pueda insertar monedas.</w:t>
+        <w:jc w:val="both"/>
+      </w:pPr>
+      <w:r>
+        <w:t>Permitir al usuario insertar monedas de denominaciones específicas (0.05€, 0.10€, 0.20€, 0.50€, 1.00€ y 2.00€) y visualizar el crédito acumulado en tiempo real.</w:t>
       </w:r>
     </w:p>
     <w:p>
@@ -2024,9 +2023,10 @@
           <w:ilvl w:val="0"/>
           <w:numId w:val="27"/>
         </w:numPr>
-      </w:pPr>
-      <w:r>
-        <w:t>Poder comprar productos de la máquina.</w:t>
+        <w:jc w:val="both"/>
+      </w:pPr>
+      <w:r>
+        <w:t>Validar que el código de ranura introducido por el usuario cumple con el formato establecido (filas A-D y columnas 1-4).</w:t>
       </w:r>
     </w:p>
     <w:p>
@@ -2036,12 +2036,11 @@
           <w:ilvl w:val="0"/>
           <w:numId w:val="27"/>
         </w:numPr>
-      </w:pPr>
-      <w:r>
-        <w:t>Devuelva crédito si es necesario.</w:t>
-      </w:r>
-      <w:bookmarkStart w:id="5" w:name="_GoBack"/>
-      <w:bookmarkEnd w:id="5"/>
+        <w:jc w:val="both"/>
+      </w:pPr>
+      <w:r>
+        <w:t>Verificar que la ranura seleccionada no esté vacía y que el usuario disponga de crédito suficiente para cubrir el precio del producto.</w:t>
+      </w:r>
     </w:p>
     <w:p>
       <w:pPr>
@@ -2050,22 +2049,10 @@
           <w:ilvl w:val="0"/>
           <w:numId w:val="27"/>
         </w:numPr>
-      </w:pPr>
-      <w:r>
-        <w:t>Uso del modo administrador, cuando sea necesario.</w:t>
-      </w:r>
-    </w:p>
-    <w:p>
-      <w:pPr>
-        <w:rPr>
-          <w:b/>
-        </w:rPr>
-      </w:pPr>
-      <w:r>
-        <w:rPr>
-          <w:b/>
-        </w:rPr>
-        <w:t>Modo Administrador</w:t>
+        <w:jc w:val="both"/>
+      </w:pPr>
+      <w:r>
+        <w:t>Dispensar el artículo solicitado, descontar la unidad del stock y añadir las monedas introducidas al depósito de la máquina.</w:t>
       </w:r>
     </w:p>
     <w:p>
@@ -2075,15 +2062,10 @@
           <w:ilvl w:val="0"/>
           <w:numId w:val="27"/>
         </w:numPr>
-      </w:pPr>
-      <w:r>
-        <w:t>Poder reponer el stock de la máquina</w:t>
-      </w:r>
-      <w:r>
-        <w:t xml:space="preserve"> del producto que se asigne</w:t>
-      </w:r>
-      <w:r>
-        <w:t>.</w:t>
+        <w:jc w:val="both"/>
+      </w:pPr>
+      <w:r>
+        <w:t>Calcular y entregar el cambio sobrante mediante una estrategia greedy, utilizando siempre el menor número posible de monedas según las existencias del depósito.</w:t>
       </w:r>
     </w:p>
     <w:p>
@@ -2093,12 +2075,10 @@
           <w:ilvl w:val="0"/>
           <w:numId w:val="27"/>
         </w:numPr>
-      </w:pPr>
-      <w:r>
-        <w:t>Implementar un nuevo producto en caso que no esté ya dentro de la máquina</w:t>
-      </w:r>
-      <w:r>
-        <w:t>.</w:t>
+        <w:jc w:val="both"/>
+      </w:pPr>
+      <w:r>
+        <w:t>Cancelar la venta y devolver íntegramente el crédito acumulado si el usuario lo solicita o si el sistema no puede entregar el cambio exacto.</w:t>
       </w:r>
     </w:p>
     <w:p>
@@ -2108,12 +2088,10 @@
           <w:ilvl w:val="0"/>
           <w:numId w:val="27"/>
         </w:numPr>
-      </w:pPr>
-      <w:r>
-        <w:t>Implementar la eliminación de un producto en caso necesario</w:t>
-      </w:r>
-      <w:r>
-        <w:t>.</w:t>
+        <w:jc w:val="both"/>
+      </w:pPr>
+      <w:r>
+        <w:t xml:space="preserve">Controlar el acceso al panel de gestión mediante un PIN alfanumérico, limitando la entrada a un máximo de tres intentos fallidos antes de regresar al menú principal. </w:t>
       </w:r>
     </w:p>
     <w:p>
@@ -2123,12 +2101,10 @@
           <w:ilvl w:val="0"/>
           <w:numId w:val="27"/>
         </w:numPr>
-      </w:pPr>
-      <w:r>
-        <w:t>Poder ver el estado de la caja, y ver cuantas tenemos actualmente</w:t>
-      </w:r>
-      <w:r>
-        <w:t>.</w:t>
+        <w:jc w:val="both"/>
+      </w:pPr>
+      <w:r>
+        <w:t>Reponer las existencias de un producto ya asignado a una ranura, respetando el límite máximo de 10 unidades por posición.</w:t>
       </w:r>
     </w:p>
     <w:p>
@@ -2138,9 +2114,16 @@
           <w:ilvl w:val="0"/>
           <w:numId w:val="27"/>
         </w:numPr>
-      </w:pPr>
-      <w:r>
-        <w:t>Conseguir ver la recaudación total desde que inicio el sistema.</w:t>
+        <w:jc w:val="both"/>
+      </w:pPr>
+      <w:r>
+        <w:t xml:space="preserve">Configurar productos nuevos (bebidas o snacks) en ranuras vacías, </w:t>
+      </w:r>
+      <w:r>
+        <w:t xml:space="preserve">o al contrario eliminar un producto en una ranura </w:t>
+      </w:r>
+      <w:r>
+        <w:t>específica.</w:t>
       </w:r>
     </w:p>
     <w:p>
@@ -2150,13 +2133,12 @@
           <w:ilvl w:val="0"/>
           <w:numId w:val="27"/>
         </w:numPr>
-      </w:pPr>
-      <w:r>
-        <w:t>Ver el stock detallado actualmente de la máquina</w:t>
-      </w:r>
-      <w:r>
-        <w:t>.</w:t>
-      </w:r>
+        <w:jc w:val="both"/>
+      </w:pPr>
+      <w:r>
+        <w:t>Mostrar un informe detallado del estado de la caja que incluya la cantidad de monedas disponibles de cada tipo y la recaudación total por ventas.</w:t>
+      </w:r>
+      <w:bookmarkStart w:id="5" w:name="_Toc224033572"/>
     </w:p>
     <w:p>
       <w:pPr>
@@ -2165,12 +2147,15 @@
           <w:ilvl w:val="0"/>
           <w:numId w:val="27"/>
         </w:numPr>
-      </w:pPr>
-      <w:r>
-        <w:t>Poder hacer un cambio en la contraseña con unas restricciones establecidas</w:t>
-      </w:r>
-      <w:r>
-        <w:t>.</w:t>
+        <w:jc w:val="both"/>
+      </w:pPr>
+      <w:r>
+        <w:t>Permitir al administrador modificar la contraseña de acceso, validando que el nuevo código cumpla con las restricciones de seguridad del sistema.</w:t>
+      </w:r>
+    </w:p>
+    <w:p>
+      <w:r>
+        <w:br w:type="page"/>
       </w:r>
     </w:p>
     <w:p>
@@ -2180,14 +2165,14 @@
           <w:szCs w:val="28"/>
         </w:rPr>
       </w:pPr>
-      <w:bookmarkStart w:id="6" w:name="_Toc224033572"/>
       <w:r>
         <w:rPr>
           <w:szCs w:val="28"/>
         </w:rPr>
+        <w:lastRenderedPageBreak/>
         <w:t>No funcionales</w:t>
       </w:r>
-      <w:bookmarkEnd w:id="6"/>
+      <w:bookmarkEnd w:id="5"/>
     </w:p>
     <w:p>
       <w:pPr>
@@ -2198,7 +2183,19 @@
         </w:numPr>
       </w:pPr>
       <w:r>
-        <w:t>Fiabilidad:</w:t>
+        <w:t xml:space="preserve">Garantizar la fiabilidad del sistema mediante el uso de BigDecimal para que </w:t>
+      </w:r>
+      <w:r>
+        <w:tab/>
+      </w:r>
+      <w:r>
+        <w:t xml:space="preserve">todos los cálculos monetarios y devoluciones de cambio sean exactos y sin </w:t>
+      </w:r>
+      <w:r>
+        <w:tab/>
+      </w:r>
+      <w:r>
+        <w:t>errores de redondeo.</w:t>
       </w:r>
     </w:p>
     <w:p>
@@ -2210,7 +2207,7 @@
         </w:numPr>
       </w:pPr>
       <w:r>
-        <w:t>Escalabilidad</w:t>
+        <w:t>Asegurar la escalabilidad de la aplicación mediante una arquitectura de paquetes y colecciones que permita aumentar el número de ranuras o productos sin degradar el rendimiento.</w:t>
       </w:r>
     </w:p>
     <w:p>
@@ -2222,7 +2219,7 @@
         </w:numPr>
       </w:pPr>
       <w:r>
-        <w:t>Extensibilidad:</w:t>
+        <w:t>Facilitar la extensibilidad del software utilizando herencia y polimorfismo para que sea sencillo añadir nuevos tipos de productos o métodos de pago en el futuro.</w:t>
       </w:r>
     </w:p>
     <w:p>
@@ -2234,7 +2231,7 @@
         </w:numPr>
       </w:pPr>
       <w:r>
-        <w:t>Seguridad:</w:t>
+        <w:t>Implementar un protocolo de seguridad que restrinja el acceso al menú de gestión mediante un PIN alfanumérico y bloquee los intentos tras tres fallos consecutivos.</w:t>
       </w:r>
     </w:p>
     <w:p>
@@ -2246,7 +2243,7 @@
         </w:numPr>
       </w:pPr>
       <w:r>
-        <w:t>Mantenibilidad:</w:t>
+        <w:t>Introducción de comentarios para detallar el código.</w:t>
       </w:r>
     </w:p>
     <w:p>
@@ -2258,31 +2255,7 @@
         </w:numPr>
       </w:pPr>
       <w:r>
-        <w:t>Introducción de comentarios para detallar el código.</w:t>
-      </w:r>
-    </w:p>
-    <w:p>
-      <w:pPr>
-        <w:pStyle w:val="Prrafodelista"/>
-        <w:numPr>
-          <w:ilvl w:val="0"/>
-          <w:numId w:val="21"/>
-        </w:numPr>
-      </w:pPr>
-      <w:r>
         <w:t>Uso de BigDecimal para una precisión decimal más exactitud.</w:t>
-      </w:r>
-    </w:p>
-    <w:p>
-      <w:pPr>
-        <w:pStyle w:val="Prrafodelista"/>
-        <w:numPr>
-          <w:ilvl w:val="0"/>
-          <w:numId w:val="21"/>
-        </w:numPr>
-      </w:pPr>
-      <w:r>
-        <w:t>Hacer un uso de la estrategia greedy para el almacén.</w:t>
       </w:r>
     </w:p>
     <w:p>
@@ -2300,15 +2273,255 @@
         <w:spacing w:line="360" w:lineRule="auto"/>
         <w:ind w:left="426" w:hanging="426"/>
       </w:pPr>
-      <w:bookmarkStart w:id="7" w:name="_Toc224033573"/>
-      <w:bookmarkStart w:id="8" w:name="_Hlk140680469"/>
-      <w:bookmarkStart w:id="9" w:name="_Hlk140681490"/>
+      <w:bookmarkStart w:id="6" w:name="_Toc224033573"/>
+      <w:bookmarkStart w:id="7" w:name="_Hlk140680469"/>
+      <w:bookmarkStart w:id="8" w:name="_Hlk140681490"/>
       <w:r>
         <w:lastRenderedPageBreak/>
         <w:t>FASE DISEÑO</w:t>
       </w:r>
-      <w:bookmarkEnd w:id="7"/>
+      <w:bookmarkEnd w:id="6"/>
     </w:p>
+    <w:p>
+      <w:pPr>
+        <w:jc w:val="both"/>
+        <w:rPr>
+          <w:lang w:eastAsia="es-ES"/>
+        </w:rPr>
+      </w:pPr>
+      <w:r>
+        <w:rPr>
+          <w:lang w:eastAsia="es-ES"/>
+        </w:rPr>
+        <w:t xml:space="preserve">Mira, siéntate que te voy a contar cómo saqué esto adelante, porque al principio me parecía un mundo, pero luego, cuando vas encajando las piezas, todo cobra sentido. </w:t>
+      </w:r>
+    </w:p>
+    <w:p>
+      <w:pPr>
+        <w:jc w:val="both"/>
+        <w:rPr>
+          <w:lang w:eastAsia="es-ES"/>
+        </w:rPr>
+      </w:pPr>
+      <w:r>
+        <w:rPr>
+          <w:lang w:eastAsia="es-ES"/>
+        </w:rPr>
+        <w:t xml:space="preserve">Empecé por lo más básico, que son los productos, y ahí me di cuenta de que no podía volverme loco creando una lógica distinta para cada cosa que se vendiera. Pensé en un molde general, algo que llamé Producto, donde simplemente guardaba lo que todos tienen: un nombre y un precio. Pero claro, el trabajo pedía que hubiera snacks y bebidas, así que lo que hice fue usar ese molde base y "estirarlo". Para las bebidas, creé un molde específico que heredaba todo lo del </w:t>
+      </w:r>
+      <w:r>
+        <w:rPr>
+          <w:lang w:eastAsia="es-ES"/>
+        </w:rPr>
+        <w:t>anterior,</w:t>
+      </w:r>
+      <w:r>
+        <w:rPr>
+          <w:lang w:eastAsia="es-ES"/>
+        </w:rPr>
+        <w:t xml:space="preserve"> pero le añadía el tamaño o si tenía azúcar, y para los snacks hice lo </w:t>
+      </w:r>
+      <w:r>
+        <w:rPr>
+          <w:lang w:eastAsia="es-ES"/>
+        </w:rPr>
+        <w:t>mismo,</w:t>
+      </w:r>
+      <w:r>
+        <w:rPr>
+          <w:lang w:eastAsia="es-ES"/>
+        </w:rPr>
+        <w:t xml:space="preserve"> pero añadiendo s</w:t>
+      </w:r>
+      <w:r>
+        <w:rPr>
+          <w:lang w:eastAsia="es-ES"/>
+        </w:rPr>
+        <w:t xml:space="preserve">olo su tamaño donde solo podían ser </w:t>
+      </w:r>
+      <w:r>
+        <w:rPr>
+          <w:i/>
+          <w:iCs/>
+          <w:lang w:eastAsia="es-ES"/>
+        </w:rPr>
+        <w:t>Large, Medium o Small</w:t>
+      </w:r>
+      <w:r>
+        <w:rPr>
+          <w:lang w:eastAsia="es-ES"/>
+        </w:rPr>
+        <w:t xml:space="preserve">. </w:t>
+      </w:r>
+    </w:p>
+    <w:p>
+      <w:pPr>
+        <w:jc w:val="both"/>
+        <w:rPr>
+          <w:lang w:eastAsia="es-ES"/>
+        </w:rPr>
+      </w:pPr>
+      <w:r>
+        <w:rPr>
+          <w:lang w:eastAsia="es-ES"/>
+        </w:rPr>
+        <w:t xml:space="preserve">Así, cuando la máquina mira un producto, sabe que es un </w:t>
+      </w:r>
+      <w:r>
+        <w:rPr>
+          <w:lang w:eastAsia="es-ES"/>
+        </w:rPr>
+        <w:t>producto,</w:t>
+      </w:r>
+      <w:r>
+        <w:rPr>
+          <w:lang w:eastAsia="es-ES"/>
+        </w:rPr>
+        <w:t xml:space="preserve"> pero también sabe si tiene que tratarlo como bebida o snack, y eso me ahorró un montón de problemas porque el sistema ya sabe de qué familia viene cada objeto sin que yo se lo tenga que repetir mil veces.</w:t>
+      </w:r>
+    </w:p>
+    <w:p>
+      <w:pPr>
+        <w:jc w:val="both"/>
+        <w:rPr>
+          <w:lang w:eastAsia="es-ES"/>
+        </w:rPr>
+      </w:pPr>
+      <w:r>
+        <w:rPr>
+          <w:lang w:eastAsia="es-ES"/>
+        </w:rPr>
+        <w:t>Una vez que tuve los productos, el siguiente lío fue dónde meterlos, porque una máquina de vending no es un saco donde tiras todo, sino que está súper ordenada por ranuras. Así que me puse a diseñar esa estructura de cajones, una cuadrícula donde cada hueco sabe exactamente qué producto guarda y, lo más importante, cuántos quedan. Tuve que programar que cada vez que alguien compra, la máquina vaya a esa ranura específica y reste uno al stock</w:t>
+      </w:r>
+      <w:r>
+        <w:rPr>
+          <w:lang w:eastAsia="es-ES"/>
+        </w:rPr>
+        <w:t>.</w:t>
+      </w:r>
+    </w:p>
+    <w:p>
+      <w:pPr>
+        <w:jc w:val="both"/>
+        <w:rPr>
+          <w:lang w:eastAsia="es-ES"/>
+        </w:rPr>
+      </w:pPr>
+      <w:r>
+        <w:rPr>
+          <w:lang w:eastAsia="es-ES"/>
+        </w:rPr>
+        <w:t>Pero para que todo esto del dinero no fallara nunca, porque con el dinero no se juega, me creé un depósito de monedas súper estricto. En lugar de dejar que el usuario metiera cualquier número, hice una lista cerrada, un "enumerado", donde solo existen las monedas de verdad: la de 5 céntimos, 10, 20, 50, 1 euro y 2 euros. Si no es una de esas, la máquina ni la mira. Esto me dio una seguridad brutal porque el sistema sabe exactamente qué tipo de monedas tiene en la hucha y cuántas de cada una hay para poder devolver el cambio luego.</w:t>
+      </w:r>
+    </w:p>
+    <w:p>
+      <w:pPr>
+        <w:jc w:val="both"/>
+        <w:rPr>
+          <w:lang w:eastAsia="es-ES"/>
+        </w:rPr>
+      </w:pPr>
+      <w:r>
+        <w:rPr>
+          <w:lang w:eastAsia="es-ES"/>
+        </w:rPr>
+        <w:t>Y hablando del cambio, ahí es donde metí toda la lógica "gorda" dentro de lo que sería el cerebro de la máquina. Diseñé un proceso que es como un cajero automático minúsculo: cuando tú terminas de comprar, el cerebro mira cuánto dinero le has dado y cuánto vale el producto, saca la diferencia y empieza a rebuscar en el depósito de monedas. Lo hice de forma que siempre intente darte la moneda más grande que tenga disponible para acabar rápido y no llenarte el bolsillo de chatarra. Si te tiene que dar un euro, prefiere darte una moneda de un euro que dos de cincuenta. Todo esto lo guardé en una clase principal que controla la máquina, que es la que se encarga de conectar el depósito con las ranuras.</w:t>
+      </w:r>
+    </w:p>
+    <w:p>
+      <w:pPr>
+        <w:jc w:val="both"/>
+        <w:rPr>
+          <w:lang w:eastAsia="es-ES"/>
+        </w:rPr>
+      </w:pPr>
+      <w:r>
+        <w:rPr>
+          <w:lang w:eastAsia="es-ES"/>
+        </w:rPr>
+        <w:t>Pero claro, faltaba separar quién puede tocar qué, así que me inventé dos moldes de usuario totalmente distintos para que la lógica no se mezclara. Por un lado, el usuario normal, el cliente, que solo tiene permiso para meter monedas</w:t>
+      </w:r>
+      <w:r>
+        <w:rPr>
+          <w:lang w:eastAsia="es-ES"/>
+        </w:rPr>
+        <w:t>,</w:t>
+      </w:r>
+      <w:r>
+        <w:rPr>
+          <w:lang w:eastAsia="es-ES"/>
+        </w:rPr>
+        <w:t xml:space="preserve"> comprar</w:t>
+      </w:r>
+      <w:r>
+        <w:rPr>
+          <w:lang w:eastAsia="es-ES"/>
+        </w:rPr>
+        <w:t xml:space="preserve"> productos y pedir el crédito</w:t>
+      </w:r>
+      <w:r>
+        <w:rPr>
+          <w:lang w:eastAsia="es-ES"/>
+        </w:rPr>
+        <w:t xml:space="preserve">. Su lógica es sencilla: interactúa con la pantalla y recibe su producto. </w:t>
+      </w:r>
+      <w:r>
+        <w:rPr>
+          <w:lang w:eastAsia="es-ES"/>
+        </w:rPr>
+        <w:t>Pero,</w:t>
+      </w:r>
+      <w:r>
+        <w:rPr>
+          <w:lang w:eastAsia="es-ES"/>
+        </w:rPr>
+        <w:t xml:space="preserve"> por otro lado, creé el </w:t>
+      </w:r>
+      <w:r>
+        <w:rPr>
+          <w:lang w:eastAsia="es-ES"/>
+        </w:rPr>
+        <w:lastRenderedPageBreak/>
+        <w:t>molde del administrador, que es como el dueño que tiene la llave maestra. Este usuario tiene una lógica aparte que está protegida</w:t>
+      </w:r>
+      <w:r>
+        <w:rPr>
+          <w:lang w:eastAsia="es-ES"/>
+        </w:rPr>
+        <w:t>,</w:t>
+      </w:r>
+      <w:r>
+        <w:rPr>
+          <w:lang w:eastAsia="es-ES"/>
+        </w:rPr>
+        <w:t xml:space="preserve"> él puede ver cuánta recaudación total lleva la máquina desde que se encendió, puede rellenar las ranuras cuando se vacían o incluso </w:t>
+      </w:r>
+      <w:r>
+        <w:rPr>
+          <w:lang w:eastAsia="es-ES"/>
+        </w:rPr>
+        <w:t>ver</w:t>
+      </w:r>
+      <w:r>
+        <w:rPr>
+          <w:lang w:eastAsia="es-ES"/>
+        </w:rPr>
+        <w:t xml:space="preserve"> la caja de moneda</w:t>
+      </w:r>
+      <w:r>
+        <w:rPr>
+          <w:lang w:eastAsia="es-ES"/>
+        </w:rPr>
+        <w:t>s</w:t>
+      </w:r>
+      <w:r>
+        <w:rPr>
+          <w:lang w:eastAsia="es-ES"/>
+        </w:rPr>
+        <w:t>. Lo bueno de separarlos así es que el código del cliente no sabe nada de cómo se cambia un precio o cómo se ve la recaudación, manteniendo esa seguridad de que nadie va a tocar donde no debe. Fue como construir una tienda pequeña donde el mostrador separa perfectamente lo que hace el cliente de lo que hace el dependiente en el almacén, y así, poco a poco, conectando el depósito con las ranuras y los usuarios con la máquina, es como conseguí que todo funcionara como un reloj sin que se me escapara ningún detalle.</w:t>
+      </w:r>
+    </w:p>
+    <w:p/>
     <w:p>
       <w:r>
         <w:br w:type="page"/>
@@ -2324,12 +2537,12 @@
         <w:spacing w:line="360" w:lineRule="auto"/>
         <w:ind w:left="426" w:hanging="426"/>
       </w:pPr>
-      <w:bookmarkStart w:id="10" w:name="_Toc224033574"/>
+      <w:bookmarkStart w:id="9" w:name="_Toc224033574"/>
       <w:r>
         <w:lastRenderedPageBreak/>
         <w:t>PROGRAMACIÓN</w:t>
       </w:r>
-      <w:bookmarkEnd w:id="10"/>
+      <w:bookmarkEnd w:id="9"/>
     </w:p>
     <w:p>
       <w:r>
@@ -2346,12 +2559,12 @@
         <w:spacing w:line="360" w:lineRule="auto"/>
         <w:ind w:left="426" w:hanging="426"/>
       </w:pPr>
-      <w:bookmarkStart w:id="11" w:name="_Toc224033575"/>
+      <w:bookmarkStart w:id="10" w:name="_Toc224033575"/>
       <w:r>
         <w:lastRenderedPageBreak/>
         <w:t>PRUEBAS</w:t>
       </w:r>
-      <w:bookmarkEnd w:id="11"/>
+      <w:bookmarkEnd w:id="10"/>
     </w:p>
     <w:p>
       <w:r>
@@ -2368,13 +2581,13 @@
         <w:spacing w:line="360" w:lineRule="auto"/>
         <w:ind w:left="426" w:hanging="426"/>
       </w:pPr>
-      <w:bookmarkStart w:id="12" w:name="_Toc224033576"/>
+      <w:bookmarkStart w:id="11" w:name="_Toc224033576"/>
       <w:r>
         <w:lastRenderedPageBreak/>
         <w:t>EXPLOTACIÓN</w:t>
       </w:r>
-      <w:bookmarkStart w:id="13" w:name="_Hlk140747344"/>
-      <w:bookmarkEnd w:id="12"/>
+      <w:bookmarkStart w:id="12" w:name="_Hlk140747344"/>
+      <w:bookmarkEnd w:id="11"/>
     </w:p>
     <w:p>
       <w:r>
@@ -2392,15 +2605,15 @@
         <w:spacing w:line="360" w:lineRule="auto"/>
         <w:ind w:left="426" w:hanging="426"/>
       </w:pPr>
-      <w:bookmarkStart w:id="14" w:name="_Toc224033577"/>
+      <w:bookmarkStart w:id="13" w:name="_Toc224033577"/>
       <w:r>
         <w:t>MANTENIMIENTO</w:t>
       </w:r>
       <w:bookmarkEnd w:id="3"/>
+      <w:bookmarkEnd w:id="7"/>
       <w:bookmarkEnd w:id="8"/>
-      <w:bookmarkEnd w:id="9"/>
+      <w:bookmarkEnd w:id="12"/>
       <w:bookmarkEnd w:id="13"/>
-      <w:bookmarkEnd w:id="14"/>
     </w:p>
     <w:tbl>
       <w:tblPr>
@@ -2424,13 +2637,8 @@
             <w:tcW w:w="0" w:type="auto"/>
           </w:tcPr>
           <w:p>
-            <w:proofErr w:type="spellStart"/>
-            <w:r>
-              <w:t>Cod</w:t>
-            </w:r>
-            <w:proofErr w:type="spellEnd"/>
-            <w:r>
-              <w:t>. defecto</w:t>
+            <w:r>
+              <w:t>Cod. defecto</w:t>
             </w:r>
           </w:p>
         </w:tc>
@@ -2665,7 +2873,7 @@
 </file>
 
 <file path=word/endnotes.xml><?xml version="1.0" encoding="utf-8"?>
-<w:endnotes xmlns:wpc="http://schemas.microsoft.com/office/word/2010/wordprocessingCanvas" xmlns:cx="http://schemas.microsoft.com/office/drawing/2014/chartex" xmlns:mc="http://schemas.openxmlformats.org/markup-compatibility/2006" xmlns:o="urn:schemas-microsoft-com:office:office" xmlns:r="http://schemas.openxmlformats.org/officeDocument/2006/relationships" xmlns:m="http://schemas.openxmlformats.org/officeDocument/2006/math" xmlns:v="urn:schemas-microsoft-com:vml" xmlns:wp14="http://schemas.microsoft.com/office/word/2010/wordprocessingDrawing" xmlns:wp="http://schemas.openxmlformats.org/drawingml/2006/wordprocessingDrawing" xmlns:w10="urn:schemas-microsoft-com:office:word" xmlns:w="http://schemas.openxmlformats.org/wordprocessingml/2006/main" xmlns:w14="http://schemas.microsoft.com/office/word/2010/wordml" xmlns:w15="http://schemas.microsoft.com/office/word/2012/wordml" xmlns:w16se="http://schemas.microsoft.com/office/word/2015/wordml/symex" xmlns:wpg="http://schemas.microsoft.com/office/word/2010/wordprocessingGroup" xmlns:wpi="http://schemas.microsoft.com/office/word/2010/wordprocessingInk" xmlns:wne="http://schemas.microsoft.com/office/word/2006/wordml" xmlns:wps="http://schemas.microsoft.com/office/word/2010/wordprocessingShape" mc:Ignorable="w14 w15 w16se wp14">
+<w:endnotes xmlns:wpc="http://schemas.microsoft.com/office/word/2010/wordprocessingCanvas" xmlns:cx="http://schemas.microsoft.com/office/drawing/2014/chartex" xmlns:cx1="http://schemas.microsoft.com/office/drawing/2015/9/8/chartex" xmlns:cx2="http://schemas.microsoft.com/office/drawing/2015/10/21/chartex" xmlns:cx3="http://schemas.microsoft.com/office/drawing/2016/5/9/chartex" xmlns:cx4="http://schemas.microsoft.com/office/drawing/2016/5/10/chartex" xmlns:cx5="http://schemas.microsoft.com/office/drawing/2016/5/11/chartex" xmlns:cx6="http://schemas.microsoft.com/office/drawing/2016/5/12/chartex" xmlns:cx7="http://schemas.microsoft.com/office/drawing/2016/5/13/chartex" xmlns:cx8="http://schemas.microsoft.com/office/drawing/2016/5/14/chartex" xmlns:mc="http://schemas.openxmlformats.org/markup-compatibility/2006" xmlns:aink="http://schemas.microsoft.com/office/drawing/2016/ink" xmlns:am3d="http://schemas.microsoft.com/office/drawing/2017/model3d" xmlns:o="urn:schemas-microsoft-com:office:office" xmlns:oel="http://schemas.microsoft.com/office/2019/extlst" xmlns:r="http://schemas.openxmlformats.org/officeDocument/2006/relationships" xmlns:m="http://schemas.openxmlformats.org/officeDocument/2006/math" xmlns:v="urn:schemas-microsoft-com:vml" xmlns:wp14="http://schemas.microsoft.com/office/word/2010/wordprocessingDrawing" xmlns:wp="http://schemas.openxmlformats.org/drawingml/2006/wordprocessingDrawing" xmlns:w10="urn:schemas-microsoft-com:office:word" xmlns:w="http://schemas.openxmlformats.org/wordprocessingml/2006/main" xmlns:w14="http://schemas.microsoft.com/office/word/2010/wordml" xmlns:w15="http://schemas.microsoft.com/office/word/2012/wordml" xmlns:w16cex="http://schemas.microsoft.com/office/word/2018/wordml/cex" xmlns:w16cid="http://schemas.microsoft.com/office/word/2016/wordml/cid" xmlns:w16="http://schemas.microsoft.com/office/word/2018/wordml" xmlns:w16du="http://schemas.microsoft.com/office/word/2023/wordml/word16du" xmlns:w16sdtdh="http://schemas.microsoft.com/office/word/2020/wordml/sdtdatahash" xmlns:w16sdtfl="http://schemas.microsoft.com/office/word/2024/wordml/sdtformatlock" xmlns:w16se="http://schemas.microsoft.com/office/word/2015/wordml/symex" xmlns:wpg="http://schemas.microsoft.com/office/word/2010/wordprocessingGroup" xmlns:wpi="http://schemas.microsoft.com/office/word/2010/wordprocessingInk" xmlns:wne="http://schemas.microsoft.com/office/word/2006/wordml" xmlns:wps="http://schemas.microsoft.com/office/word/2010/wordprocessingShape" mc:Ignorable="w14 w15 w16se w16cid w16 w16cex w16sdtdh w16sdtfl w16du wp14">
   <w:endnote w:type="separator" w:id="-1">
     <w:p>
       <w:pPr>
@@ -2690,7 +2898,7 @@
 </file>
 
 <file path=word/footer1.xml><?xml version="1.0" encoding="utf-8"?>
-<w:ftr xmlns:wpc="http://schemas.microsoft.com/office/word/2010/wordprocessingCanvas" xmlns:cx="http://schemas.microsoft.com/office/drawing/2014/chartex" xmlns:mc="http://schemas.openxmlformats.org/markup-compatibility/2006" xmlns:o="urn:schemas-microsoft-com:office:office" xmlns:r="http://schemas.openxmlformats.org/officeDocument/2006/relationships" xmlns:m="http://schemas.openxmlformats.org/officeDocument/2006/math" xmlns:v="urn:schemas-microsoft-com:vml" xmlns:wp14="http://schemas.microsoft.com/office/word/2010/wordprocessingDrawing" xmlns:wp="http://schemas.openxmlformats.org/drawingml/2006/wordprocessingDrawing" xmlns:w10="urn:schemas-microsoft-com:office:word" xmlns:w="http://schemas.openxmlformats.org/wordprocessingml/2006/main" xmlns:w14="http://schemas.microsoft.com/office/word/2010/wordml" xmlns:w15="http://schemas.microsoft.com/office/word/2012/wordml" xmlns:w16se="http://schemas.microsoft.com/office/word/2015/wordml/symex" xmlns:wpg="http://schemas.microsoft.com/office/word/2010/wordprocessingGroup" xmlns:wpi="http://schemas.microsoft.com/office/word/2010/wordprocessingInk" xmlns:wne="http://schemas.microsoft.com/office/word/2006/wordml" xmlns:wps="http://schemas.microsoft.com/office/word/2010/wordprocessingShape" mc:Ignorable="w14 w15 w16se wp14">
+<w:ftr xmlns:wpc="http://schemas.microsoft.com/office/word/2010/wordprocessingCanvas" xmlns:cx="http://schemas.microsoft.com/office/drawing/2014/chartex" xmlns:cx1="http://schemas.microsoft.com/office/drawing/2015/9/8/chartex" xmlns:cx2="http://schemas.microsoft.com/office/drawing/2015/10/21/chartex" xmlns:cx3="http://schemas.microsoft.com/office/drawing/2016/5/9/chartex" xmlns:cx4="http://schemas.microsoft.com/office/drawing/2016/5/10/chartex" xmlns:cx5="http://schemas.microsoft.com/office/drawing/2016/5/11/chartex" xmlns:cx6="http://schemas.microsoft.com/office/drawing/2016/5/12/chartex" xmlns:cx7="http://schemas.microsoft.com/office/drawing/2016/5/13/chartex" xmlns:cx8="http://schemas.microsoft.com/office/drawing/2016/5/14/chartex" xmlns:mc="http://schemas.openxmlformats.org/markup-compatibility/2006" xmlns:aink="http://schemas.microsoft.com/office/drawing/2016/ink" xmlns:am3d="http://schemas.microsoft.com/office/drawing/2017/model3d" xmlns:o="urn:schemas-microsoft-com:office:office" xmlns:oel="http://schemas.microsoft.com/office/2019/extlst" xmlns:r="http://schemas.openxmlformats.org/officeDocument/2006/relationships" xmlns:m="http://schemas.openxmlformats.org/officeDocument/2006/math" xmlns:v="urn:schemas-microsoft-com:vml" xmlns:wp14="http://schemas.microsoft.com/office/word/2010/wordprocessingDrawing" xmlns:wp="http://schemas.openxmlformats.org/drawingml/2006/wordprocessingDrawing" xmlns:w10="urn:schemas-microsoft-com:office:word" xmlns:w="http://schemas.openxmlformats.org/wordprocessingml/2006/main" xmlns:w14="http://schemas.microsoft.com/office/word/2010/wordml" xmlns:w15="http://schemas.microsoft.com/office/word/2012/wordml" xmlns:w16cex="http://schemas.microsoft.com/office/word/2018/wordml/cex" xmlns:w16cid="http://schemas.microsoft.com/office/word/2016/wordml/cid" xmlns:w16="http://schemas.microsoft.com/office/word/2018/wordml" xmlns:w16du="http://schemas.microsoft.com/office/word/2023/wordml/word16du" xmlns:w16sdtdh="http://schemas.microsoft.com/office/word/2020/wordml/sdtdatahash" xmlns:w16sdtfl="http://schemas.microsoft.com/office/word/2024/wordml/sdtformatlock" xmlns:w16se="http://schemas.microsoft.com/office/word/2015/wordml/symex" xmlns:wpg="http://schemas.microsoft.com/office/word/2010/wordprocessingGroup" xmlns:wpi="http://schemas.microsoft.com/office/word/2010/wordprocessingInk" xmlns:wne="http://schemas.microsoft.com/office/word/2006/wordml" xmlns:wps="http://schemas.microsoft.com/office/word/2010/wordprocessingShape" mc:Ignorable="w14 w15 w16se w16cid w16 w16cex w16sdtdh w16sdtfl w16du wp14">
   <w:sdt>
     <w:sdtPr>
       <w:id w:val="-764069077"/>
@@ -2699,7 +2907,6 @@
         <w:docPartUnique/>
       </w:docPartObj>
     </w:sdtPr>
-    <w:sdtEndPr/>
     <w:sdtContent>
       <w:sdt>
         <w:sdtPr>
@@ -2709,7 +2916,6 @@
             <w:docPartUnique/>
           </w:docPartObj>
         </w:sdtPr>
-        <w:sdtEndPr/>
         <w:sdtContent>
           <w:tbl>
             <w:tblPr>
@@ -2843,7 +3049,7 @@
 </file>
 
 <file path=word/footer2.xml><?xml version="1.0" encoding="utf-8"?>
-<w:ftr xmlns:wpc="http://schemas.microsoft.com/office/word/2010/wordprocessingCanvas" xmlns:cx="http://schemas.microsoft.com/office/drawing/2014/chartex" xmlns:mc="http://schemas.openxmlformats.org/markup-compatibility/2006" xmlns:o="urn:schemas-microsoft-com:office:office" xmlns:r="http://schemas.openxmlformats.org/officeDocument/2006/relationships" xmlns:m="http://schemas.openxmlformats.org/officeDocument/2006/math" xmlns:v="urn:schemas-microsoft-com:vml" xmlns:wp14="http://schemas.microsoft.com/office/word/2010/wordprocessingDrawing" xmlns:wp="http://schemas.openxmlformats.org/drawingml/2006/wordprocessingDrawing" xmlns:w10="urn:schemas-microsoft-com:office:word" xmlns:w="http://schemas.openxmlformats.org/wordprocessingml/2006/main" xmlns:w14="http://schemas.microsoft.com/office/word/2010/wordml" xmlns:w15="http://schemas.microsoft.com/office/word/2012/wordml" xmlns:w16se="http://schemas.microsoft.com/office/word/2015/wordml/symex" xmlns:wpg="http://schemas.microsoft.com/office/word/2010/wordprocessingGroup" xmlns:wpi="http://schemas.microsoft.com/office/word/2010/wordprocessingInk" xmlns:wne="http://schemas.microsoft.com/office/word/2006/wordml" xmlns:wps="http://schemas.microsoft.com/office/word/2010/wordprocessingShape" mc:Ignorable="w14 w15 w16se wp14">
+<w:ftr xmlns:wpc="http://schemas.microsoft.com/office/word/2010/wordprocessingCanvas" xmlns:cx="http://schemas.microsoft.com/office/drawing/2014/chartex" xmlns:cx1="http://schemas.microsoft.com/office/drawing/2015/9/8/chartex" xmlns:cx2="http://schemas.microsoft.com/office/drawing/2015/10/21/chartex" xmlns:cx3="http://schemas.microsoft.com/office/drawing/2016/5/9/chartex" xmlns:cx4="http://schemas.microsoft.com/office/drawing/2016/5/10/chartex" xmlns:cx5="http://schemas.microsoft.com/office/drawing/2016/5/11/chartex" xmlns:cx6="http://schemas.microsoft.com/office/drawing/2016/5/12/chartex" xmlns:cx7="http://schemas.microsoft.com/office/drawing/2016/5/13/chartex" xmlns:cx8="http://schemas.microsoft.com/office/drawing/2016/5/14/chartex" xmlns:mc="http://schemas.openxmlformats.org/markup-compatibility/2006" xmlns:aink="http://schemas.microsoft.com/office/drawing/2016/ink" xmlns:am3d="http://schemas.microsoft.com/office/drawing/2017/model3d" xmlns:o="urn:schemas-microsoft-com:office:office" xmlns:oel="http://schemas.microsoft.com/office/2019/extlst" xmlns:r="http://schemas.openxmlformats.org/officeDocument/2006/relationships" xmlns:m="http://schemas.openxmlformats.org/officeDocument/2006/math" xmlns:v="urn:schemas-microsoft-com:vml" xmlns:wp14="http://schemas.microsoft.com/office/word/2010/wordprocessingDrawing" xmlns:wp="http://schemas.openxmlformats.org/drawingml/2006/wordprocessingDrawing" xmlns:w10="urn:schemas-microsoft-com:office:word" xmlns:w="http://schemas.openxmlformats.org/wordprocessingml/2006/main" xmlns:w14="http://schemas.microsoft.com/office/word/2010/wordml" xmlns:w15="http://schemas.microsoft.com/office/word/2012/wordml" xmlns:w16cex="http://schemas.microsoft.com/office/word/2018/wordml/cex" xmlns:w16cid="http://schemas.microsoft.com/office/word/2016/wordml/cid" xmlns:w16="http://schemas.microsoft.com/office/word/2018/wordml" xmlns:w16du="http://schemas.microsoft.com/office/word/2023/wordml/word16du" xmlns:w16sdtdh="http://schemas.microsoft.com/office/word/2020/wordml/sdtdatahash" xmlns:w16sdtfl="http://schemas.microsoft.com/office/word/2024/wordml/sdtformatlock" xmlns:w16se="http://schemas.microsoft.com/office/word/2015/wordml/symex" xmlns:wpg="http://schemas.microsoft.com/office/word/2010/wordprocessingGroup" xmlns:wpi="http://schemas.microsoft.com/office/word/2010/wordprocessingInk" xmlns:wne="http://schemas.microsoft.com/office/word/2006/wordml" xmlns:wps="http://schemas.microsoft.com/office/word/2010/wordprocessingShape" mc:Ignorable="w14 w15 w16se w16cid w16 w16cex w16sdtdh w16sdtfl w16du wp14">
   <w:sdt>
     <w:sdtPr>
       <w:id w:val="131537374"/>
@@ -2852,7 +3058,6 @@
         <w:docPartUnique/>
       </w:docPartObj>
     </w:sdtPr>
-    <w:sdtEndPr/>
     <w:sdtContent>
       <w:sdt>
         <w:sdtPr>
@@ -2862,7 +3067,6 @@
             <w:docPartUnique/>
           </w:docPartObj>
         </w:sdtPr>
-        <w:sdtEndPr/>
         <w:sdtContent>
           <w:tbl>
             <w:tblPr>
@@ -2994,7 +3198,7 @@
 </file>
 
 <file path=word/footnotes.xml><?xml version="1.0" encoding="utf-8"?>
-<w:footnotes xmlns:wpc="http://schemas.microsoft.com/office/word/2010/wordprocessingCanvas" xmlns:cx="http://schemas.microsoft.com/office/drawing/2014/chartex" xmlns:mc="http://schemas.openxmlformats.org/markup-compatibility/2006" xmlns:o="urn:schemas-microsoft-com:office:office" xmlns:r="http://schemas.openxmlformats.org/officeDocument/2006/relationships" xmlns:m="http://schemas.openxmlformats.org/officeDocument/2006/math" xmlns:v="urn:schemas-microsoft-com:vml" xmlns:wp14="http://schemas.microsoft.com/office/word/2010/wordprocessingDrawing" xmlns:wp="http://schemas.openxmlformats.org/drawingml/2006/wordprocessingDrawing" xmlns:w10="urn:schemas-microsoft-com:office:word" xmlns:w="http://schemas.openxmlformats.org/wordprocessingml/2006/main" xmlns:w14="http://schemas.microsoft.com/office/word/2010/wordml" xmlns:w15="http://schemas.microsoft.com/office/word/2012/wordml" xmlns:w16se="http://schemas.microsoft.com/office/word/2015/wordml/symex" xmlns:wpg="http://schemas.microsoft.com/office/word/2010/wordprocessingGroup" xmlns:wpi="http://schemas.microsoft.com/office/word/2010/wordprocessingInk" xmlns:wne="http://schemas.microsoft.com/office/word/2006/wordml" xmlns:wps="http://schemas.microsoft.com/office/word/2010/wordprocessingShape" mc:Ignorable="w14 w15 w16se wp14">
+<w:footnotes xmlns:wpc="http://schemas.microsoft.com/office/word/2010/wordprocessingCanvas" xmlns:cx="http://schemas.microsoft.com/office/drawing/2014/chartex" xmlns:cx1="http://schemas.microsoft.com/office/drawing/2015/9/8/chartex" xmlns:cx2="http://schemas.microsoft.com/office/drawing/2015/10/21/chartex" xmlns:cx3="http://schemas.microsoft.com/office/drawing/2016/5/9/chartex" xmlns:cx4="http://schemas.microsoft.com/office/drawing/2016/5/10/chartex" xmlns:cx5="http://schemas.microsoft.com/office/drawing/2016/5/11/chartex" xmlns:cx6="http://schemas.microsoft.com/office/drawing/2016/5/12/chartex" xmlns:cx7="http://schemas.microsoft.com/office/drawing/2016/5/13/chartex" xmlns:cx8="http://schemas.microsoft.com/office/drawing/2016/5/14/chartex" xmlns:mc="http://schemas.openxmlformats.org/markup-compatibility/2006" xmlns:aink="http://schemas.microsoft.com/office/drawing/2016/ink" xmlns:am3d="http://schemas.microsoft.com/office/drawing/2017/model3d" xmlns:o="urn:schemas-microsoft-com:office:office" xmlns:oel="http://schemas.microsoft.com/office/2019/extlst" xmlns:r="http://schemas.openxmlformats.org/officeDocument/2006/relationships" xmlns:m="http://schemas.openxmlformats.org/officeDocument/2006/math" xmlns:v="urn:schemas-microsoft-com:vml" xmlns:wp14="http://schemas.microsoft.com/office/word/2010/wordprocessingDrawing" xmlns:wp="http://schemas.openxmlformats.org/drawingml/2006/wordprocessingDrawing" xmlns:w10="urn:schemas-microsoft-com:office:word" xmlns:w="http://schemas.openxmlformats.org/wordprocessingml/2006/main" xmlns:w14="http://schemas.microsoft.com/office/word/2010/wordml" xmlns:w15="http://schemas.microsoft.com/office/word/2012/wordml" xmlns:w16cex="http://schemas.microsoft.com/office/word/2018/wordml/cex" xmlns:w16cid="http://schemas.microsoft.com/office/word/2016/wordml/cid" xmlns:w16="http://schemas.microsoft.com/office/word/2018/wordml" xmlns:w16du="http://schemas.microsoft.com/office/word/2023/wordml/word16du" xmlns:w16sdtdh="http://schemas.microsoft.com/office/word/2020/wordml/sdtdatahash" xmlns:w16sdtfl="http://schemas.microsoft.com/office/word/2024/wordml/sdtformatlock" xmlns:w16se="http://schemas.microsoft.com/office/word/2015/wordml/symex" xmlns:wpg="http://schemas.microsoft.com/office/word/2010/wordprocessingGroup" xmlns:wpi="http://schemas.microsoft.com/office/word/2010/wordprocessingInk" xmlns:wne="http://schemas.microsoft.com/office/word/2006/wordml" xmlns:wps="http://schemas.microsoft.com/office/word/2010/wordprocessingShape" mc:Ignorable="w14 w15 w16se w16cid w16 w16cex w16sdtdh w16sdtfl w16du wp14">
   <w:footnote w:type="separator" w:id="-1">
     <w:p>
       <w:pPr>
@@ -3019,7 +3223,7 @@
 </file>
 
 <file path=word/header1.xml><?xml version="1.0" encoding="utf-8"?>
-<w:hdr xmlns:wpc="http://schemas.microsoft.com/office/word/2010/wordprocessingCanvas" xmlns:cx="http://schemas.microsoft.com/office/drawing/2014/chartex" xmlns:mc="http://schemas.openxmlformats.org/markup-compatibility/2006" xmlns:o="urn:schemas-microsoft-com:office:office" xmlns:r="http://schemas.openxmlformats.org/officeDocument/2006/relationships" xmlns:m="http://schemas.openxmlformats.org/officeDocument/2006/math" xmlns:v="urn:schemas-microsoft-com:vml" xmlns:wp14="http://schemas.microsoft.com/office/word/2010/wordprocessingDrawing" xmlns:wp="http://schemas.openxmlformats.org/drawingml/2006/wordprocessingDrawing" xmlns:w10="urn:schemas-microsoft-com:office:word" xmlns:w="http://schemas.openxmlformats.org/wordprocessingml/2006/main" xmlns:w14="http://schemas.microsoft.com/office/word/2010/wordml" xmlns:w15="http://schemas.microsoft.com/office/word/2012/wordml" xmlns:w16se="http://schemas.microsoft.com/office/word/2015/wordml/symex" xmlns:wpg="http://schemas.microsoft.com/office/word/2010/wordprocessingGroup" xmlns:wpi="http://schemas.microsoft.com/office/word/2010/wordprocessingInk" xmlns:wne="http://schemas.microsoft.com/office/word/2006/wordml" xmlns:wps="http://schemas.microsoft.com/office/word/2010/wordprocessingShape" mc:Ignorable="w14 w15 w16se wp14">
+<w:hdr xmlns:wpc="http://schemas.microsoft.com/office/word/2010/wordprocessingCanvas" xmlns:cx="http://schemas.microsoft.com/office/drawing/2014/chartex" xmlns:cx1="http://schemas.microsoft.com/office/drawing/2015/9/8/chartex" xmlns:cx2="http://schemas.microsoft.com/office/drawing/2015/10/21/chartex" xmlns:cx3="http://schemas.microsoft.com/office/drawing/2016/5/9/chartex" xmlns:cx4="http://schemas.microsoft.com/office/drawing/2016/5/10/chartex" xmlns:cx5="http://schemas.microsoft.com/office/drawing/2016/5/11/chartex" xmlns:cx6="http://schemas.microsoft.com/office/drawing/2016/5/12/chartex" xmlns:cx7="http://schemas.microsoft.com/office/drawing/2016/5/13/chartex" xmlns:cx8="http://schemas.microsoft.com/office/drawing/2016/5/14/chartex" xmlns:mc="http://schemas.openxmlformats.org/markup-compatibility/2006" xmlns:aink="http://schemas.microsoft.com/office/drawing/2016/ink" xmlns:am3d="http://schemas.microsoft.com/office/drawing/2017/model3d" xmlns:o="urn:schemas-microsoft-com:office:office" xmlns:oel="http://schemas.microsoft.com/office/2019/extlst" xmlns:r="http://schemas.openxmlformats.org/officeDocument/2006/relationships" xmlns:m="http://schemas.openxmlformats.org/officeDocument/2006/math" xmlns:v="urn:schemas-microsoft-com:vml" xmlns:wp14="http://schemas.microsoft.com/office/word/2010/wordprocessingDrawing" xmlns:wp="http://schemas.openxmlformats.org/drawingml/2006/wordprocessingDrawing" xmlns:w10="urn:schemas-microsoft-com:office:word" xmlns:w="http://schemas.openxmlformats.org/wordprocessingml/2006/main" xmlns:w14="http://schemas.microsoft.com/office/word/2010/wordml" xmlns:w15="http://schemas.microsoft.com/office/word/2012/wordml" xmlns:w16cex="http://schemas.microsoft.com/office/word/2018/wordml/cex" xmlns:w16cid="http://schemas.microsoft.com/office/word/2016/wordml/cid" xmlns:w16="http://schemas.microsoft.com/office/word/2018/wordml" xmlns:w16du="http://schemas.microsoft.com/office/word/2023/wordml/word16du" xmlns:w16sdtdh="http://schemas.microsoft.com/office/word/2020/wordml/sdtdatahash" xmlns:w16sdtfl="http://schemas.microsoft.com/office/word/2024/wordml/sdtformatlock" xmlns:w16se="http://schemas.microsoft.com/office/word/2015/wordml/symex" xmlns:wpg="http://schemas.microsoft.com/office/word/2010/wordprocessingGroup" xmlns:wpi="http://schemas.microsoft.com/office/word/2010/wordprocessingInk" xmlns:wne="http://schemas.microsoft.com/office/word/2006/wordml" xmlns:wps="http://schemas.microsoft.com/office/word/2010/wordprocessingShape" mc:Ignorable="w14 w15 w16se w16cid w16 w16cex w16sdtdh w16sdtfl w16du wp14">
   <w:tbl>
     <w:tblPr>
       <w:tblStyle w:val="Tablaconcuadrcula"/>
@@ -3199,7 +3403,7 @@
 </file>
 
 <file path=word/header2.xml><?xml version="1.0" encoding="utf-8"?>
-<w:hdr xmlns:wpc="http://schemas.microsoft.com/office/word/2010/wordprocessingCanvas" xmlns:cx="http://schemas.microsoft.com/office/drawing/2014/chartex" xmlns:mc="http://schemas.openxmlformats.org/markup-compatibility/2006" xmlns:o="urn:schemas-microsoft-com:office:office" xmlns:r="http://schemas.openxmlformats.org/officeDocument/2006/relationships" xmlns:m="http://schemas.openxmlformats.org/officeDocument/2006/math" xmlns:v="urn:schemas-microsoft-com:vml" xmlns:wp14="http://schemas.microsoft.com/office/word/2010/wordprocessingDrawing" xmlns:wp="http://schemas.openxmlformats.org/drawingml/2006/wordprocessingDrawing" xmlns:w10="urn:schemas-microsoft-com:office:word" xmlns:w="http://schemas.openxmlformats.org/wordprocessingml/2006/main" xmlns:w14="http://schemas.microsoft.com/office/word/2010/wordml" xmlns:w15="http://schemas.microsoft.com/office/word/2012/wordml" xmlns:w16se="http://schemas.microsoft.com/office/word/2015/wordml/symex" xmlns:wpg="http://schemas.microsoft.com/office/word/2010/wordprocessingGroup" xmlns:wpi="http://schemas.microsoft.com/office/word/2010/wordprocessingInk" xmlns:wne="http://schemas.microsoft.com/office/word/2006/wordml" xmlns:wps="http://schemas.microsoft.com/office/word/2010/wordprocessingShape" mc:Ignorable="w14 w15 w16se wp14">
+<w:hdr xmlns:wpc="http://schemas.microsoft.com/office/word/2010/wordprocessingCanvas" xmlns:cx="http://schemas.microsoft.com/office/drawing/2014/chartex" xmlns:cx1="http://schemas.microsoft.com/office/drawing/2015/9/8/chartex" xmlns:cx2="http://schemas.microsoft.com/office/drawing/2015/10/21/chartex" xmlns:cx3="http://schemas.microsoft.com/office/drawing/2016/5/9/chartex" xmlns:cx4="http://schemas.microsoft.com/office/drawing/2016/5/10/chartex" xmlns:cx5="http://schemas.microsoft.com/office/drawing/2016/5/11/chartex" xmlns:cx6="http://schemas.microsoft.com/office/drawing/2016/5/12/chartex" xmlns:cx7="http://schemas.microsoft.com/office/drawing/2016/5/13/chartex" xmlns:cx8="http://schemas.microsoft.com/office/drawing/2016/5/14/chartex" xmlns:mc="http://schemas.openxmlformats.org/markup-compatibility/2006" xmlns:aink="http://schemas.microsoft.com/office/drawing/2016/ink" xmlns:am3d="http://schemas.microsoft.com/office/drawing/2017/model3d" xmlns:o="urn:schemas-microsoft-com:office:office" xmlns:oel="http://schemas.microsoft.com/office/2019/extlst" xmlns:r="http://schemas.openxmlformats.org/officeDocument/2006/relationships" xmlns:m="http://schemas.openxmlformats.org/officeDocument/2006/math" xmlns:v="urn:schemas-microsoft-com:vml" xmlns:wp14="http://schemas.microsoft.com/office/word/2010/wordprocessingDrawing" xmlns:wp="http://schemas.openxmlformats.org/drawingml/2006/wordprocessingDrawing" xmlns:w10="urn:schemas-microsoft-com:office:word" xmlns:w="http://schemas.openxmlformats.org/wordprocessingml/2006/main" xmlns:w14="http://schemas.microsoft.com/office/word/2010/wordml" xmlns:w15="http://schemas.microsoft.com/office/word/2012/wordml" xmlns:w16cex="http://schemas.microsoft.com/office/word/2018/wordml/cex" xmlns:w16cid="http://schemas.microsoft.com/office/word/2016/wordml/cid" xmlns:w16="http://schemas.microsoft.com/office/word/2018/wordml" xmlns:w16du="http://schemas.microsoft.com/office/word/2023/wordml/word16du" xmlns:w16sdtdh="http://schemas.microsoft.com/office/word/2020/wordml/sdtdatahash" xmlns:w16sdtfl="http://schemas.microsoft.com/office/word/2024/wordml/sdtformatlock" xmlns:w16se="http://schemas.microsoft.com/office/word/2015/wordml/symex" xmlns:wpg="http://schemas.microsoft.com/office/word/2010/wordprocessingGroup" xmlns:wpi="http://schemas.microsoft.com/office/word/2010/wordprocessingInk" xmlns:wne="http://schemas.microsoft.com/office/word/2006/wordml" xmlns:wps="http://schemas.microsoft.com/office/word/2010/wordprocessingShape" mc:Ignorable="w14 w15 w16se w16cid w16 w16cex w16sdtdh w16sdtfl w16du wp14">
   <w:tbl>
     <w:tblPr>
       <w:tblStyle w:val="Tablaconcuadrcula"/>
@@ -3374,7 +3578,7 @@
 </file>
 
 <file path=word/numbering.xml><?xml version="1.0" encoding="utf-8"?>
-<w:numbering xmlns:wpc="http://schemas.microsoft.com/office/word/2010/wordprocessingCanvas" xmlns:cx="http://schemas.microsoft.com/office/drawing/2014/chartex" xmlns:mc="http://schemas.openxmlformats.org/markup-compatibility/2006" xmlns:o="urn:schemas-microsoft-com:office:office" xmlns:r="http://schemas.openxmlformats.org/officeDocument/2006/relationships" xmlns:m="http://schemas.openxmlformats.org/officeDocument/2006/math" xmlns:v="urn:schemas-microsoft-com:vml" xmlns:wp14="http://schemas.microsoft.com/office/word/2010/wordprocessingDrawing" xmlns:wp="http://schemas.openxmlformats.org/drawingml/2006/wordprocessingDrawing" xmlns:w10="urn:schemas-microsoft-com:office:word" xmlns:w="http://schemas.openxmlformats.org/wordprocessingml/2006/main" xmlns:w14="http://schemas.microsoft.com/office/word/2010/wordml" xmlns:w15="http://schemas.microsoft.com/office/word/2012/wordml" xmlns:w16se="http://schemas.microsoft.com/office/word/2015/wordml/symex" xmlns:wpg="http://schemas.microsoft.com/office/word/2010/wordprocessingGroup" xmlns:wpi="http://schemas.microsoft.com/office/word/2010/wordprocessingInk" xmlns:wne="http://schemas.microsoft.com/office/word/2006/wordml" xmlns:wps="http://schemas.microsoft.com/office/word/2010/wordprocessingShape" mc:Ignorable="w14 w15 w16se wp14">
+<w:numbering xmlns:wpc="http://schemas.microsoft.com/office/word/2010/wordprocessingCanvas" xmlns:cx="http://schemas.microsoft.com/office/drawing/2014/chartex" xmlns:cx1="http://schemas.microsoft.com/office/drawing/2015/9/8/chartex" xmlns:cx2="http://schemas.microsoft.com/office/drawing/2015/10/21/chartex" xmlns:cx3="http://schemas.microsoft.com/office/drawing/2016/5/9/chartex" xmlns:cx4="http://schemas.microsoft.com/office/drawing/2016/5/10/chartex" xmlns:cx5="http://schemas.microsoft.com/office/drawing/2016/5/11/chartex" xmlns:cx6="http://schemas.microsoft.com/office/drawing/2016/5/12/chartex" xmlns:cx7="http://schemas.microsoft.com/office/drawing/2016/5/13/chartex" xmlns:cx8="http://schemas.microsoft.com/office/drawing/2016/5/14/chartex" xmlns:mc="http://schemas.openxmlformats.org/markup-compatibility/2006" xmlns:aink="http://schemas.microsoft.com/office/drawing/2016/ink" xmlns:am3d="http://schemas.microsoft.com/office/drawing/2017/model3d" xmlns:o="urn:schemas-microsoft-com:office:office" xmlns:oel="http://schemas.microsoft.com/office/2019/extlst" xmlns:r="http://schemas.openxmlformats.org/officeDocument/2006/relationships" xmlns:m="http://schemas.openxmlformats.org/officeDocument/2006/math" xmlns:v="urn:schemas-microsoft-com:vml" xmlns:wp14="http://schemas.microsoft.com/office/word/2010/wordprocessingDrawing" xmlns:wp="http://schemas.openxmlformats.org/drawingml/2006/wordprocessingDrawing" xmlns:w10="urn:schemas-microsoft-com:office:word" xmlns:w="http://schemas.openxmlformats.org/wordprocessingml/2006/main" xmlns:w14="http://schemas.microsoft.com/office/word/2010/wordml" xmlns:w15="http://schemas.microsoft.com/office/word/2012/wordml" xmlns:w16cex="http://schemas.microsoft.com/office/word/2018/wordml/cex" xmlns:w16cid="http://schemas.microsoft.com/office/word/2016/wordml/cid" xmlns:w16="http://schemas.microsoft.com/office/word/2018/wordml" xmlns:w16du="http://schemas.microsoft.com/office/word/2023/wordml/word16du" xmlns:w16sdtdh="http://schemas.microsoft.com/office/word/2020/wordml/sdtdatahash" xmlns:w16sdtfl="http://schemas.microsoft.com/office/word/2024/wordml/sdtformatlock" xmlns:w16se="http://schemas.microsoft.com/office/word/2015/wordml/symex" xmlns:wpg="http://schemas.microsoft.com/office/word/2010/wordprocessingGroup" xmlns:wpi="http://schemas.microsoft.com/office/word/2010/wordprocessingInk" xmlns:wne="http://schemas.microsoft.com/office/word/2006/wordml" xmlns:wps="http://schemas.microsoft.com/office/word/2010/wordprocessingShape" mc:Ignorable="w14 w15 w16se w16cid w16 w16cex w16sdtdh w16sdtfl w16du wp14">
   <w:abstractNum w:abstractNumId="0" w15:restartNumberingAfterBreak="0">
     <w:nsid w:val="074D565E"/>
     <w:multiLevelType w:val="hybridMultilevel"/>
@@ -6176,92 +6380,92 @@
       </w:rPr>
     </w:lvl>
   </w:abstractNum>
-  <w:num w:numId="1">
+  <w:num w:numId="1" w16cid:durableId="2135638189">
     <w:abstractNumId w:val="23"/>
   </w:num>
-  <w:num w:numId="2">
+  <w:num w:numId="2" w16cid:durableId="990712267">
     <w:abstractNumId w:val="0"/>
   </w:num>
-  <w:num w:numId="3">
+  <w:num w:numId="3" w16cid:durableId="1306355022">
     <w:abstractNumId w:val="26"/>
   </w:num>
-  <w:num w:numId="4">
+  <w:num w:numId="4" w16cid:durableId="21565032">
     <w:abstractNumId w:val="20"/>
   </w:num>
-  <w:num w:numId="5">
+  <w:num w:numId="5" w16cid:durableId="881096725">
     <w:abstractNumId w:val="17"/>
   </w:num>
-  <w:num w:numId="6">
+  <w:num w:numId="6" w16cid:durableId="225921922">
     <w:abstractNumId w:val="9"/>
   </w:num>
-  <w:num w:numId="7">
+  <w:num w:numId="7" w16cid:durableId="1940021731">
     <w:abstractNumId w:val="2"/>
   </w:num>
-  <w:num w:numId="8">
+  <w:num w:numId="8" w16cid:durableId="366369746">
     <w:abstractNumId w:val="21"/>
   </w:num>
-  <w:num w:numId="9">
+  <w:num w:numId="9" w16cid:durableId="37635549">
     <w:abstractNumId w:val="11"/>
   </w:num>
-  <w:num w:numId="10">
+  <w:num w:numId="10" w16cid:durableId="369964320">
     <w:abstractNumId w:val="13"/>
   </w:num>
-  <w:num w:numId="11">
+  <w:num w:numId="11" w16cid:durableId="401368912">
     <w:abstractNumId w:val="5"/>
   </w:num>
-  <w:num w:numId="12">
+  <w:num w:numId="12" w16cid:durableId="76487736">
     <w:abstractNumId w:val="15"/>
   </w:num>
-  <w:num w:numId="13">
+  <w:num w:numId="13" w16cid:durableId="894051689">
     <w:abstractNumId w:val="10"/>
   </w:num>
-  <w:num w:numId="14">
+  <w:num w:numId="14" w16cid:durableId="448667009">
     <w:abstractNumId w:val="18"/>
   </w:num>
-  <w:num w:numId="15">
+  <w:num w:numId="15" w16cid:durableId="1590699676">
     <w:abstractNumId w:val="4"/>
   </w:num>
-  <w:num w:numId="16">
+  <w:num w:numId="16" w16cid:durableId="1213886352">
     <w:abstractNumId w:val="14"/>
   </w:num>
-  <w:num w:numId="17">
+  <w:num w:numId="17" w16cid:durableId="1339426570">
     <w:abstractNumId w:val="24"/>
   </w:num>
-  <w:num w:numId="18">
+  <w:num w:numId="18" w16cid:durableId="1906064032">
     <w:abstractNumId w:val="25"/>
   </w:num>
-  <w:num w:numId="19">
+  <w:num w:numId="19" w16cid:durableId="1627277160">
     <w:abstractNumId w:val="1"/>
   </w:num>
-  <w:num w:numId="20">
+  <w:num w:numId="20" w16cid:durableId="1980188569">
     <w:abstractNumId w:val="6"/>
   </w:num>
-  <w:num w:numId="21">
+  <w:num w:numId="21" w16cid:durableId="976837251">
     <w:abstractNumId w:val="7"/>
   </w:num>
-  <w:num w:numId="22">
+  <w:num w:numId="22" w16cid:durableId="1034303419">
     <w:abstractNumId w:val="8"/>
   </w:num>
-  <w:num w:numId="23">
+  <w:num w:numId="23" w16cid:durableId="1837769685">
     <w:abstractNumId w:val="3"/>
   </w:num>
-  <w:num w:numId="24">
+  <w:num w:numId="24" w16cid:durableId="795955453">
     <w:abstractNumId w:val="22"/>
   </w:num>
-  <w:num w:numId="25">
+  <w:num w:numId="25" w16cid:durableId="724987936">
     <w:abstractNumId w:val="19"/>
   </w:num>
-  <w:num w:numId="26">
+  <w:num w:numId="26" w16cid:durableId="248319827">
     <w:abstractNumId w:val="16"/>
   </w:num>
-  <w:num w:numId="27">
+  <w:num w:numId="27" w16cid:durableId="1859540817">
     <w:abstractNumId w:val="12"/>
   </w:num>
 </w:numbering>
 </file>
 
 <file path=word/styles.xml><?xml version="1.0" encoding="utf-8"?>
-<w:styles xmlns:mc="http://schemas.openxmlformats.org/markup-compatibility/2006" xmlns:r="http://schemas.openxmlformats.org/officeDocument/2006/relationships" xmlns:w="http://schemas.openxmlformats.org/wordprocessingml/2006/main" xmlns:w14="http://schemas.microsoft.com/office/word/2010/wordml" xmlns:w15="http://schemas.microsoft.com/office/word/2012/wordml" xmlns:w16se="http://schemas.microsoft.com/office/word/2015/wordml/symex" mc:Ignorable="w14 w15 w16se">
+<w:styles xmlns:mc="http://schemas.openxmlformats.org/markup-compatibility/2006" xmlns:r="http://schemas.openxmlformats.org/officeDocument/2006/relationships" xmlns:w="http://schemas.openxmlformats.org/wordprocessingml/2006/main" xmlns:w14="http://schemas.microsoft.com/office/word/2010/wordml" xmlns:w15="http://schemas.microsoft.com/office/word/2012/wordml" xmlns:w16cex="http://schemas.microsoft.com/office/word/2018/wordml/cex" xmlns:w16cid="http://schemas.microsoft.com/office/word/2016/wordml/cid" xmlns:w16="http://schemas.microsoft.com/office/word/2018/wordml" xmlns:w16du="http://schemas.microsoft.com/office/word/2023/wordml/word16du" xmlns:w16sdtdh="http://schemas.microsoft.com/office/word/2020/wordml/sdtdatahash" xmlns:w16sdtfl="http://schemas.microsoft.com/office/word/2024/wordml/sdtformatlock" xmlns:w16se="http://schemas.microsoft.com/office/word/2015/wordml/symex" mc:Ignorable="w14 w15 w16se w16cid w16 w16cex w16sdtdh w16sdtfl w16du">
   <w:docDefaults>
     <w:rPrDefault>
       <w:rPr>
@@ -6279,7 +6483,7 @@
       </w:pPr>
     </w:pPrDefault>
   </w:docDefaults>
-  <w:latentStyles w:defLockedState="0" w:defUIPriority="99" w:defSemiHidden="0" w:defUnhideWhenUsed="0" w:defQFormat="0" w:count="371">
+  <w:latentStyles w:defLockedState="0" w:defUIPriority="99" w:defSemiHidden="0" w:defUnhideWhenUsed="0" w:defQFormat="0" w:count="376">
     <w:lsdException w:name="Normal" w:uiPriority="0" w:qFormat="1"/>
     <w:lsdException w:name="heading 1" w:uiPriority="9" w:qFormat="1"/>
     <w:lsdException w:name="heading 2" w:semiHidden="1" w:uiPriority="9" w:unhideWhenUsed="1" w:qFormat="1"/>
@@ -6651,6 +6855,11 @@
     <w:lsdException w:name="List Table 5 Dark Accent 6" w:uiPriority="50"/>
     <w:lsdException w:name="List Table 6 Colorful Accent 6" w:uiPriority="51"/>
     <w:lsdException w:name="List Table 7 Colorful Accent 6" w:uiPriority="52"/>
+    <w:lsdException w:name="Mention" w:semiHidden="1" w:unhideWhenUsed="1"/>
+    <w:lsdException w:name="Smart Hyperlink" w:semiHidden="1" w:unhideWhenUsed="1"/>
+    <w:lsdException w:name="Hashtag" w:semiHidden="1" w:unhideWhenUsed="1"/>
+    <w:lsdException w:name="Unresolved Mention" w:semiHidden="1" w:unhideWhenUsed="1"/>
+    <w:lsdException w:name="Smart Link" w:semiHidden="1" w:unhideWhenUsed="1"/>
   </w:latentStyles>
   <w:style w:type="paragraph" w:default="1" w:styleId="Normal">
     <w:name w:val="Normal"/>
@@ -6949,8 +7158,8 @@
       <w:u w:val="single"/>
     </w:rPr>
   </w:style>
-  <w:style w:type="character" w:customStyle="1" w:styleId="UnresolvedMention">
-    <w:name w:val="Unresolved Mention"/>
+  <w:style w:type="character" w:customStyle="1" w:styleId="Mencinsinresolver1">
+    <w:name w:val="Mención sin resolver1"/>
     <w:basedOn w:val="Fuentedeprrafopredeter"/>
     <w:uiPriority w:val="99"/>
     <w:semiHidden/>
@@ -6985,6 +7194,34 @@
       <w:spacing w:after="100"/>
       <w:ind w:left="220"/>
     </w:pPr>
+  </w:style>
+  <w:style w:type="paragraph" w:styleId="NormalWeb">
+    <w:name w:val="Normal (Web)"/>
+    <w:basedOn w:val="Normal"/>
+    <w:uiPriority w:val="99"/>
+    <w:semiHidden/>
+    <w:unhideWhenUsed/>
+    <w:rsid w:val="00D82C0C"/>
+    <w:pPr>
+      <w:spacing w:before="100" w:beforeAutospacing="1" w:after="100" w:afterAutospacing="1" w:line="240" w:lineRule="auto"/>
+    </w:pPr>
+    <w:rPr>
+      <w:rFonts w:ascii="Times New Roman" w:eastAsia="Times New Roman" w:hAnsi="Times New Roman" w:cs="Times New Roman"/>
+      <w:kern w:val="0"/>
+      <w:szCs w:val="24"/>
+      <w:lang w:eastAsia="es-ES"/>
+      <w14:ligatures w14:val="none"/>
+    </w:rPr>
+  </w:style>
+  <w:style w:type="character" w:customStyle="1" w:styleId="text-block-with-attachment">
+    <w:name w:val="text-block-with-attachment"/>
+    <w:basedOn w:val="Fuentedeprrafopredeter"/>
+    <w:rsid w:val="00D82C0C"/>
+  </w:style>
+  <w:style w:type="character" w:customStyle="1" w:styleId="label">
+    <w:name w:val="label"/>
+    <w:basedOn w:val="Fuentedeprrafopredeter"/>
+    <w:rsid w:val="00D82C0C"/>
   </w:style>
 </w:styles>
 </file>

</xml_diff>

<commit_message>
fase diseño y programacion
</commit_message>
<xml_diff>
--- a/InformeProyecto_MarioGonzalezDeLaIglesia/InformeProyecto_MarioGonzálezDeLaIglesia.docx
+++ b/InformeProyecto_MarioGonzalezDeLaIglesia/InformeProyecto_MarioGonzálezDeLaIglesia.docx
@@ -796,7 +796,7 @@
                 <w:noProof/>
                 <w:webHidden/>
               </w:rPr>
-              <w:t>4</w:t>
+              <w:t>5</w:t>
             </w:r>
             <w:r>
               <w:rPr>
@@ -868,7 +868,7 @@
                 <w:noProof/>
                 <w:webHidden/>
               </w:rPr>
-              <w:t>4</w:t>
+              <w:t>5</w:t>
             </w:r>
             <w:r>
               <w:rPr>
@@ -940,7 +940,7 @@
                 <w:noProof/>
                 <w:webHidden/>
               </w:rPr>
-              <w:t>4</w:t>
+              <w:t>5</w:t>
             </w:r>
             <w:r>
               <w:rPr>
@@ -1030,7 +1030,7 @@
                 <w:noProof/>
                 <w:webHidden/>
               </w:rPr>
-              <w:t>5</w:t>
+              <w:t>7</w:t>
             </w:r>
             <w:r>
               <w:rPr>
@@ -1120,7 +1120,7 @@
                 <w:noProof/>
                 <w:webHidden/>
               </w:rPr>
-              <w:t>6</w:t>
+              <w:t>9</w:t>
             </w:r>
             <w:r>
               <w:rPr>
@@ -1210,7 +1210,7 @@
                 <w:noProof/>
                 <w:webHidden/>
               </w:rPr>
-              <w:t>7</w:t>
+              <w:t>12</w:t>
             </w:r>
             <w:r>
               <w:rPr>
@@ -1287,20 +1287,16 @@
                 <w:noProof/>
                 <w:webHidden/>
               </w:rPr>
-            </w:r>
-            <w:r>
-              <w:rPr>
+              <w:fldChar w:fldCharType="separate"/>
+            </w:r>
+            <w:r>
+              <w:rPr>
+                <w:b/>
+                <w:bCs/>
                 <w:noProof/>
                 <w:webHidden/>
               </w:rPr>
-              <w:fldChar w:fldCharType="separate"/>
-            </w:r>
-            <w:r>
-              <w:rPr>
-                <w:noProof/>
-                <w:webHidden/>
-              </w:rPr>
-              <w:t>8</w:t>
+              <w:t>¡Error! Marcador no definido.</w:t>
             </w:r>
             <w:r>
               <w:rPr>
@@ -1377,20 +1373,16 @@
                 <w:noProof/>
                 <w:webHidden/>
               </w:rPr>
-            </w:r>
-            <w:r>
-              <w:rPr>
+              <w:fldChar w:fldCharType="separate"/>
+            </w:r>
+            <w:r>
+              <w:rPr>
+                <w:b/>
+                <w:bCs/>
                 <w:noProof/>
                 <w:webHidden/>
               </w:rPr>
-              <w:fldChar w:fldCharType="separate"/>
-            </w:r>
-            <w:r>
-              <w:rPr>
-                <w:noProof/>
-                <w:webHidden/>
-              </w:rPr>
-              <w:t>9</w:t>
+              <w:t>¡Error! Marcador no definido.</w:t>
             </w:r>
             <w:r>
               <w:rPr>
@@ -1458,10 +1450,10 @@
         <w:tblLook w:val="04A0" w:firstRow="1" w:lastRow="0" w:firstColumn="1" w:lastColumn="0" w:noHBand="0" w:noVBand="1"/>
       </w:tblPr>
       <w:tblGrid>
-        <w:gridCol w:w="1129"/>
+        <w:gridCol w:w="1271"/>
         <w:gridCol w:w="1843"/>
-        <w:gridCol w:w="2385"/>
-        <w:gridCol w:w="1699"/>
+        <w:gridCol w:w="4258"/>
+        <w:gridCol w:w="1690"/>
       </w:tblGrid>
       <w:tr>
         <w:trPr>
@@ -1469,7 +1461,7 @@
         </w:trPr>
         <w:tc>
           <w:tcPr>
-            <w:tcW w:w="1129" w:type="dxa"/>
+            <w:tcW w:w="1271" w:type="dxa"/>
           </w:tcPr>
           <w:p>
             <w:pPr>
@@ -1505,7 +1497,7 @@
         </w:tc>
         <w:tc>
           <w:tcPr>
-            <w:tcW w:w="2385" w:type="dxa"/>
+            <w:tcW w:w="4258" w:type="dxa"/>
           </w:tcPr>
           <w:p>
             <w:pPr>
@@ -1523,7 +1515,7 @@
         </w:tc>
         <w:tc>
           <w:tcPr>
-            <w:tcW w:w="1699" w:type="dxa"/>
+            <w:tcW w:w="1690" w:type="dxa"/>
           </w:tcPr>
           <w:p>
             <w:pPr>
@@ -1546,7 +1538,8 @@
         </w:trPr>
         <w:tc>
           <w:tcPr>
-            <w:tcW w:w="1129" w:type="dxa"/>
+            <w:tcW w:w="1271" w:type="dxa"/>
+            <w:vAlign w:val="center"/>
           </w:tcPr>
           <w:p>
             <w:pPr>
@@ -1560,6 +1553,7 @@
         <w:tc>
           <w:tcPr>
             <w:tcW w:w="1843" w:type="dxa"/>
+            <w:vAlign w:val="center"/>
           </w:tcPr>
           <w:p>
             <w:pPr>
@@ -1575,7 +1569,8 @@
         </w:tc>
         <w:tc>
           <w:tcPr>
-            <w:tcW w:w="2385" w:type="dxa"/>
+            <w:tcW w:w="4258" w:type="dxa"/>
+            <w:vAlign w:val="center"/>
           </w:tcPr>
           <w:p>
             <w:pPr>
@@ -1584,11 +1579,15 @@
             <w:r>
               <w:t>Introducción y la fase análisis</w:t>
             </w:r>
+            <w:r>
+              <w:t>.</w:t>
+            </w:r>
           </w:p>
         </w:tc>
         <w:tc>
           <w:tcPr>
-            <w:tcW w:w="1699" w:type="dxa"/>
+            <w:tcW w:w="1690" w:type="dxa"/>
+            <w:vAlign w:val="center"/>
           </w:tcPr>
           <w:p>
             <w:pPr>
@@ -1606,7 +1605,8 @@
         </w:trPr>
         <w:tc>
           <w:tcPr>
-            <w:tcW w:w="1129" w:type="dxa"/>
+            <w:tcW w:w="1271" w:type="dxa"/>
+            <w:vAlign w:val="center"/>
           </w:tcPr>
           <w:p>
             <w:pPr>
@@ -1620,6 +1620,7 @@
         <w:tc>
           <w:tcPr>
             <w:tcW w:w="1843" w:type="dxa"/>
+            <w:vAlign w:val="center"/>
           </w:tcPr>
           <w:p>
             <w:pPr>
@@ -1632,7 +1633,8 @@
         </w:tc>
         <w:tc>
           <w:tcPr>
-            <w:tcW w:w="2385" w:type="dxa"/>
+            <w:tcW w:w="4258" w:type="dxa"/>
+            <w:vAlign w:val="center"/>
           </w:tcPr>
           <w:p>
             <w:pPr>
@@ -1641,11 +1643,15 @@
             <w:r>
               <w:t>Modificación de fase análisis</w:t>
             </w:r>
+            <w:r>
+              <w:t>.</w:t>
+            </w:r>
           </w:p>
         </w:tc>
         <w:tc>
           <w:tcPr>
-            <w:tcW w:w="1699" w:type="dxa"/>
+            <w:tcW w:w="1690" w:type="dxa"/>
+            <w:vAlign w:val="center"/>
           </w:tcPr>
           <w:p>
             <w:pPr>
@@ -1663,7 +1669,8 @@
         </w:trPr>
         <w:tc>
           <w:tcPr>
-            <w:tcW w:w="1129" w:type="dxa"/>
+            <w:tcW w:w="1271" w:type="dxa"/>
+            <w:vAlign w:val="center"/>
           </w:tcPr>
           <w:p>
             <w:pPr>
@@ -1680,6 +1687,7 @@
         <w:tc>
           <w:tcPr>
             <w:tcW w:w="1843" w:type="dxa"/>
+            <w:vAlign w:val="center"/>
           </w:tcPr>
           <w:p>
             <w:pPr>
@@ -1692,7 +1700,8 @@
         </w:tc>
         <w:tc>
           <w:tcPr>
-            <w:tcW w:w="2385" w:type="dxa"/>
+            <w:tcW w:w="4258" w:type="dxa"/>
+            <w:vAlign w:val="center"/>
           </w:tcPr>
           <w:p>
             <w:pPr>
@@ -1701,21 +1710,34 @@
             <w:r>
               <w:t>Modificación de fase análisis</w:t>
             </w:r>
+            <w:r>
+              <w:t>.</w:t>
+            </w:r>
           </w:p>
         </w:tc>
         <w:tc>
           <w:tcPr>
-            <w:tcW w:w="1699" w:type="dxa"/>
+            <w:tcW w:w="1690" w:type="dxa"/>
+            <w:vAlign w:val="center"/>
           </w:tcPr>
           <w:p>
             <w:pPr>
               <w:jc w:val="center"/>
             </w:pPr>
             <w:r>
+              <w:t>0</w:t>
+            </w:r>
+            <w:r>
               <w:t>7</w:t>
             </w:r>
             <w:r>
-              <w:t>/5/2026</w:t>
+              <w:t>/</w:t>
+            </w:r>
+            <w:r>
+              <w:t>0</w:t>
+            </w:r>
+            <w:r>
+              <w:t>5/2026</w:t>
             </w:r>
           </w:p>
         </w:tc>
@@ -1726,7 +1748,8 @@
         </w:trPr>
         <w:tc>
           <w:tcPr>
-            <w:tcW w:w="1129" w:type="dxa"/>
+            <w:tcW w:w="1271" w:type="dxa"/>
+            <w:vAlign w:val="center"/>
           </w:tcPr>
           <w:p>
             <w:pPr>
@@ -1740,6 +1763,7 @@
         <w:tc>
           <w:tcPr>
             <w:tcW w:w="1843" w:type="dxa"/>
+            <w:vAlign w:val="center"/>
           </w:tcPr>
           <w:p>
             <w:pPr>
@@ -1752,7 +1776,8 @@
         </w:tc>
         <w:tc>
           <w:tcPr>
-            <w:tcW w:w="2385" w:type="dxa"/>
+            <w:tcW w:w="4258" w:type="dxa"/>
+            <w:vAlign w:val="center"/>
           </w:tcPr>
           <w:p>
             <w:pPr>
@@ -1761,18 +1786,31 @@
             <w:r>
               <w:t>Documentar la fase de diseño</w:t>
             </w:r>
+            <w:r>
+              <w:t>.</w:t>
+            </w:r>
           </w:p>
         </w:tc>
         <w:tc>
           <w:tcPr>
-            <w:tcW w:w="1699" w:type="dxa"/>
+            <w:tcW w:w="1690" w:type="dxa"/>
+            <w:vAlign w:val="center"/>
           </w:tcPr>
           <w:p>
             <w:pPr>
               <w:jc w:val="center"/>
             </w:pPr>
             <w:r>
-              <w:t>8/5/2026</w:t>
+              <w:t>0</w:t>
+            </w:r>
+            <w:r>
+              <w:t>8/</w:t>
+            </w:r>
+            <w:r>
+              <w:t>0</w:t>
+            </w:r>
+            <w:r>
+              <w:t>5/2026</w:t>
             </w:r>
           </w:p>
         </w:tc>
@@ -1783,7 +1821,130 @@
         </w:trPr>
         <w:tc>
           <w:tcPr>
-            <w:tcW w:w="1129" w:type="dxa"/>
+            <w:tcW w:w="1271" w:type="dxa"/>
+            <w:vAlign w:val="center"/>
+          </w:tcPr>
+          <w:p>
+            <w:pPr>
+              <w:jc w:val="center"/>
+            </w:pPr>
+            <w:r>
+              <w:t>1.3</w:t>
+            </w:r>
+          </w:p>
+        </w:tc>
+        <w:tc>
+          <w:tcPr>
+            <w:tcW w:w="1843" w:type="dxa"/>
+            <w:vAlign w:val="center"/>
+          </w:tcPr>
+          <w:p>
+            <w:pPr>
+              <w:jc w:val="center"/>
+            </w:pPr>
+            <w:r>
+              <w:t>Mario González</w:t>
+            </w:r>
+          </w:p>
+        </w:tc>
+        <w:tc>
+          <w:tcPr>
+            <w:tcW w:w="4258" w:type="dxa"/>
+            <w:vAlign w:val="center"/>
+          </w:tcPr>
+          <w:p>
+            <w:pPr>
+              <w:jc w:val="center"/>
+            </w:pPr>
+            <w:r>
+              <w:t>Arreglo de la introducción y fase análisis por comentarios. Y cambio de fase diseño completamente.</w:t>
+            </w:r>
+          </w:p>
+        </w:tc>
+        <w:tc>
+          <w:tcPr>
+            <w:tcW w:w="1690" w:type="dxa"/>
+            <w:vAlign w:val="center"/>
+          </w:tcPr>
+          <w:p>
+            <w:pPr>
+              <w:jc w:val="center"/>
+            </w:pPr>
+            <w:r>
+              <w:t>10/05/2026</w:t>
+            </w:r>
+          </w:p>
+        </w:tc>
+      </w:tr>
+      <w:tr>
+        <w:trPr>
+          <w:jc w:val="center"/>
+        </w:trPr>
+        <w:tc>
+          <w:tcPr>
+            <w:tcW w:w="1271" w:type="dxa"/>
+            <w:vAlign w:val="center"/>
+          </w:tcPr>
+          <w:p>
+            <w:pPr>
+              <w:jc w:val="center"/>
+            </w:pPr>
+            <w:r>
+              <w:t>1.4</w:t>
+            </w:r>
+          </w:p>
+        </w:tc>
+        <w:tc>
+          <w:tcPr>
+            <w:tcW w:w="1843" w:type="dxa"/>
+            <w:vAlign w:val="center"/>
+          </w:tcPr>
+          <w:p>
+            <w:pPr>
+              <w:jc w:val="center"/>
+            </w:pPr>
+            <w:r>
+              <w:t>Mario González</w:t>
+            </w:r>
+          </w:p>
+        </w:tc>
+        <w:tc>
+          <w:tcPr>
+            <w:tcW w:w="4258" w:type="dxa"/>
+            <w:vAlign w:val="center"/>
+          </w:tcPr>
+          <w:p>
+            <w:pPr>
+              <w:jc w:val="center"/>
+            </w:pPr>
+            <w:r>
+              <w:t>Documentar la fase de programación.</w:t>
+            </w:r>
+          </w:p>
+        </w:tc>
+        <w:tc>
+          <w:tcPr>
+            <w:tcW w:w="1690" w:type="dxa"/>
+            <w:vAlign w:val="center"/>
+          </w:tcPr>
+          <w:p>
+            <w:pPr>
+              <w:jc w:val="center"/>
+            </w:pPr>
+            <w:r>
+              <w:t>11/05/2026</w:t>
+            </w:r>
+          </w:p>
+        </w:tc>
+      </w:tr>
+      <w:tr>
+        <w:trPr>
+          <w:jc w:val="center"/>
+        </w:trPr>
+        <w:tc>
+          <w:tcPr>
+            <w:tcW w:w="1271" w:type="dxa"/>
+            <w:vAlign w:val="center"/>
           </w:tcPr>
           <w:p>
             <w:pPr>
@@ -1794,19 +1955,7 @@
         <w:tc>
           <w:tcPr>
             <w:tcW w:w="1843" w:type="dxa"/>
-          </w:tcPr>
-          <w:p>
-            <w:pPr>
-              <w:jc w:val="center"/>
-            </w:pPr>
-            <w:r>
-              <w:t>Mario González</w:t>
-            </w:r>
-          </w:p>
-        </w:tc>
-        <w:tc>
-          <w:tcPr>
-            <w:tcW w:w="2385" w:type="dxa"/>
+            <w:vAlign w:val="center"/>
           </w:tcPr>
           <w:p>
             <w:pPr>
@@ -1816,7 +1965,19 @@
         </w:tc>
         <w:tc>
           <w:tcPr>
-            <w:tcW w:w="1699" w:type="dxa"/>
+            <w:tcW w:w="4258" w:type="dxa"/>
+            <w:vAlign w:val="center"/>
+          </w:tcPr>
+          <w:p>
+            <w:pPr>
+              <w:jc w:val="center"/>
+            </w:pPr>
+          </w:p>
+        </w:tc>
+        <w:tc>
+          <w:tcPr>
+            <w:tcW w:w="1690" w:type="dxa"/>
+            <w:vAlign w:val="center"/>
           </w:tcPr>
           <w:p>
             <w:pPr>
@@ -1831,7 +1992,8 @@
         </w:trPr>
         <w:tc>
           <w:tcPr>
-            <w:tcW w:w="1129" w:type="dxa"/>
+            <w:tcW w:w="1271" w:type="dxa"/>
+            <w:vAlign w:val="center"/>
           </w:tcPr>
           <w:p>
             <w:pPr>
@@ -1842,19 +2004,7 @@
         <w:tc>
           <w:tcPr>
             <w:tcW w:w="1843" w:type="dxa"/>
-          </w:tcPr>
-          <w:p>
-            <w:pPr>
-              <w:jc w:val="center"/>
-            </w:pPr>
-            <w:r>
-              <w:t>Mario González</w:t>
-            </w:r>
-          </w:p>
-        </w:tc>
-        <w:tc>
-          <w:tcPr>
-            <w:tcW w:w="2385" w:type="dxa"/>
+            <w:vAlign w:val="center"/>
           </w:tcPr>
           <w:p>
             <w:pPr>
@@ -1864,7 +2014,166 @@
         </w:tc>
         <w:tc>
           <w:tcPr>
-            <w:tcW w:w="1699" w:type="dxa"/>
+            <w:tcW w:w="4258" w:type="dxa"/>
+            <w:vAlign w:val="center"/>
+          </w:tcPr>
+          <w:p>
+            <w:pPr>
+              <w:jc w:val="center"/>
+            </w:pPr>
+          </w:p>
+        </w:tc>
+        <w:tc>
+          <w:tcPr>
+            <w:tcW w:w="1690" w:type="dxa"/>
+            <w:vAlign w:val="center"/>
+          </w:tcPr>
+          <w:p>
+            <w:pPr>
+              <w:jc w:val="center"/>
+            </w:pPr>
+          </w:p>
+        </w:tc>
+      </w:tr>
+      <w:tr>
+        <w:trPr>
+          <w:jc w:val="center"/>
+        </w:trPr>
+        <w:tc>
+          <w:tcPr>
+            <w:tcW w:w="1271" w:type="dxa"/>
+            <w:vAlign w:val="center"/>
+          </w:tcPr>
+          <w:p>
+            <w:pPr>
+              <w:jc w:val="center"/>
+            </w:pPr>
+          </w:p>
+        </w:tc>
+        <w:tc>
+          <w:tcPr>
+            <w:tcW w:w="1843" w:type="dxa"/>
+            <w:vAlign w:val="center"/>
+          </w:tcPr>
+          <w:p>
+            <w:pPr>
+              <w:jc w:val="center"/>
+            </w:pPr>
+          </w:p>
+        </w:tc>
+        <w:tc>
+          <w:tcPr>
+            <w:tcW w:w="4258" w:type="dxa"/>
+            <w:vAlign w:val="center"/>
+          </w:tcPr>
+          <w:p>
+            <w:pPr>
+              <w:jc w:val="center"/>
+            </w:pPr>
+          </w:p>
+        </w:tc>
+        <w:tc>
+          <w:tcPr>
+            <w:tcW w:w="1690" w:type="dxa"/>
+            <w:vAlign w:val="center"/>
+          </w:tcPr>
+          <w:p>
+            <w:pPr>
+              <w:jc w:val="center"/>
+            </w:pPr>
+          </w:p>
+        </w:tc>
+      </w:tr>
+      <w:tr>
+        <w:trPr>
+          <w:jc w:val="center"/>
+        </w:trPr>
+        <w:tc>
+          <w:tcPr>
+            <w:tcW w:w="1271" w:type="dxa"/>
+            <w:vAlign w:val="center"/>
+          </w:tcPr>
+          <w:p>
+            <w:pPr>
+              <w:jc w:val="center"/>
+            </w:pPr>
+          </w:p>
+        </w:tc>
+        <w:tc>
+          <w:tcPr>
+            <w:tcW w:w="1843" w:type="dxa"/>
+            <w:vAlign w:val="center"/>
+          </w:tcPr>
+          <w:p>
+            <w:pPr>
+              <w:jc w:val="center"/>
+            </w:pPr>
+          </w:p>
+        </w:tc>
+        <w:tc>
+          <w:tcPr>
+            <w:tcW w:w="4258" w:type="dxa"/>
+            <w:vAlign w:val="center"/>
+          </w:tcPr>
+          <w:p>
+            <w:pPr>
+              <w:jc w:val="center"/>
+            </w:pPr>
+          </w:p>
+        </w:tc>
+        <w:tc>
+          <w:tcPr>
+            <w:tcW w:w="1690" w:type="dxa"/>
+            <w:vAlign w:val="center"/>
+          </w:tcPr>
+          <w:p>
+            <w:pPr>
+              <w:jc w:val="center"/>
+            </w:pPr>
+          </w:p>
+        </w:tc>
+      </w:tr>
+      <w:tr>
+        <w:trPr>
+          <w:jc w:val="center"/>
+        </w:trPr>
+        <w:tc>
+          <w:tcPr>
+            <w:tcW w:w="1271" w:type="dxa"/>
+            <w:vAlign w:val="center"/>
+          </w:tcPr>
+          <w:p>
+            <w:pPr>
+              <w:jc w:val="center"/>
+            </w:pPr>
+          </w:p>
+        </w:tc>
+        <w:tc>
+          <w:tcPr>
+            <w:tcW w:w="1843" w:type="dxa"/>
+            <w:vAlign w:val="center"/>
+          </w:tcPr>
+          <w:p>
+            <w:pPr>
+              <w:jc w:val="center"/>
+            </w:pPr>
+          </w:p>
+        </w:tc>
+        <w:tc>
+          <w:tcPr>
+            <w:tcW w:w="4258" w:type="dxa"/>
+            <w:vAlign w:val="center"/>
+          </w:tcPr>
+          <w:p>
+            <w:pPr>
+              <w:jc w:val="center"/>
+            </w:pPr>
+          </w:p>
+        </w:tc>
+        <w:tc>
+          <w:tcPr>
+            <w:tcW w:w="1690" w:type="dxa"/>
+            <w:vAlign w:val="center"/>
           </w:tcPr>
           <w:p>
             <w:pPr>
@@ -1901,7 +2210,16 @@
         <w:jc w:val="both"/>
       </w:pPr>
       <w:r>
-        <w:t xml:space="preserve">Buenas, aquí podréis ver de forma más detallada el informe seguido para un proyecto de java, donde se podrá ver un seguimiento, para poder recrearlo sin tener mucha idea. El proyecto trata de una </w:t>
+        <w:t>En este documento</w:t>
+      </w:r>
+      <w:r>
+        <w:t xml:space="preserve">, podréis ver de forma más detallada el informe seguido para un proyecto de java, donde se podrá ver un seguimiento, para poder recrearlo sin </w:t>
+      </w:r>
+      <w:r>
+        <w:t>tener contexto del proyecto</w:t>
+      </w:r>
+      <w:r>
+        <w:t xml:space="preserve">. El proyecto trata de una </w:t>
       </w:r>
       <w:r>
         <w:rPr>
@@ -1918,7 +2236,25 @@
         <w:jc w:val="both"/>
       </w:pPr>
       <w:r>
-        <w:t xml:space="preserve">Aquí les explicaremos sus requisitos necesarios para que sepamos si funciona, un diseño claro para recrear sus objetos, y un intento de explicación de la programación para poder hacer sus funciones correctamente, además de un aparatado solamente de pruebas, para que veáis en lo que puede llegar a fallar de esos requisitos. </w:t>
+        <w:t xml:space="preserve">Aquí les explicaremos sus requisitos necesarios para que sepamos si funciona, un diseño claro para recrear </w:t>
+      </w:r>
+      <w:r>
+        <w:t>todos sus apartados</w:t>
+      </w:r>
+      <w:r>
+        <w:t xml:space="preserve">, y </w:t>
+      </w:r>
+      <w:r>
+        <w:t>una</w:t>
+      </w:r>
+      <w:r>
+        <w:t xml:space="preserve"> explicación de la programación para poder hacer sus funciones correctamente, además de un apartado solamente de pruebas, para </w:t>
+      </w:r>
+      <w:r>
+        <w:t>comprobar y validar los requisitos funcionales,</w:t>
+      </w:r>
+      <w:r>
+        <w:t xml:space="preserve"> en lo que puede llegar a fallar. </w:t>
       </w:r>
     </w:p>
     <w:p>
@@ -2002,6 +2338,9 @@
       <w:r>
         <w:t>Dispondrá de dos usuarios dentro del sistema, de los cuales tendrán diferentes elecciones.</w:t>
       </w:r>
+      <w:r>
+        <w:t xml:space="preserve"> Por una parte, estará el ‘Cliente’ y por detrás el ‘Administrador’.</w:t>
+      </w:r>
     </w:p>
     <w:p>
       <w:pPr>
@@ -2207,7 +2546,7 @@
         </w:numPr>
       </w:pPr>
       <w:r>
-        <w:t>Asegurar la escalabilidad de la aplicación mediante una arquitectura de paquetes y colecciones que permita aumentar el número de ranuras o productos sin degradar el rendimiento.</w:t>
+        <w:t>Introducción de comentarios para detallar el código.</w:t>
       </w:r>
     </w:p>
     <w:p>
@@ -2219,7 +2558,7 @@
         </w:numPr>
       </w:pPr>
       <w:r>
-        <w:t>Facilitar la extensibilidad del software utilizando herencia y polimorfismo para que sea sencillo añadir nuevos tipos de productos o métodos de pago en el futuro.</w:t>
+        <w:t>Asegurar la escalabilidad de la aplicación mediante una arquitectura de paquetes y colecciones que permita aumentar el número de ranuras o productos sin degradar el rendimiento.</w:t>
       </w:r>
     </w:p>
     <w:p>
@@ -2231,7 +2570,7 @@
         </w:numPr>
       </w:pPr>
       <w:r>
-        <w:t>Implementar un protocolo de seguridad que restrinja el acceso al menú de gestión mediante un PIN alfanumérico y bloquee los intentos tras tres fallos consecutivos.</w:t>
+        <w:t>Facilitar la extensibilidad del software utilizando herencia y polimorfismo para que sea sencillo añadir nuevos tipos de productos o métodos de pago en el futuro.</w:t>
       </w:r>
     </w:p>
     <w:p>
@@ -2243,7 +2582,7 @@
         </w:numPr>
       </w:pPr>
       <w:r>
-        <w:t>Introducción de comentarios para detallar el código.</w:t>
+        <w:t>Implementar un protocolo de seguridad que restrinja el acceso al menú de gestión mediante un PIN alfanumérico y bloquee los intentos tras tres fallos consecutivos.</w:t>
       </w:r>
     </w:p>
     <w:p>
@@ -2254,11 +2593,6 @@
           <w:numId w:val="21"/>
         </w:numPr>
       </w:pPr>
-      <w:r>
-        <w:t>Uso de BigDecimal para una precisión decimal más exactitud.</w:t>
-      </w:r>
-    </w:p>
-    <w:p>
       <w:r>
         <w:br w:type="page"/>
       </w:r>
@@ -2285,243 +2619,215 @@
     <w:p>
       <w:pPr>
         <w:jc w:val="both"/>
+      </w:pPr>
+      <w:r>
+        <w:t xml:space="preserve">De primeras, nos tenemos que asegurar de que el diseño cumple con el </w:t>
+      </w:r>
+      <w:r>
         <w:rPr>
-          <w:lang w:eastAsia="es-ES"/>
+          <w:b/>
+          <w:bCs/>
         </w:rPr>
-      </w:pPr>
+        <w:t>[RF1]</w:t>
+      </w:r>
+      <w:r>
+        <w:t xml:space="preserve">, y presente en pantalla una portada de la Maquina Vending con una lista visual y organizada de todos los artículos disponibles. Este catálogo no solo muestra el código y el nombre de cada producto, sino que también realiza una operación automática para mostrar el precio final que el cliente debe pagar, asegurando que la información sea clara desde el primer segundo. Esto se relaciona con el </w:t>
+      </w:r>
       <w:r>
         <w:rPr>
-          <w:lang w:eastAsia="es-ES"/>
+          <w:b/>
+          <w:bCs/>
         </w:rPr>
-        <w:t xml:space="preserve">Mira, siéntate que te voy a contar cómo saqué esto adelante, porque al principio me parecía un mundo, pero luego, cuando vas encajando las piezas, todo cobra sentido. </w:t>
+        <w:t>[RF2]</w:t>
+      </w:r>
+      <w:r>
+        <w:t xml:space="preserve">, </w:t>
+      </w:r>
+      <w:r>
+        <w:t>que divide el funcionamiento de la máquina en dos entornos totalmente separados: una interfaz clara y sencilla para el cliente que solo desear llegar a comprar un producto, y un panel de control oculto destinado exclusivamente al administrador, para las tareas de gestión interna.</w:t>
       </w:r>
     </w:p>
     <w:p>
       <w:pPr>
         <w:jc w:val="both"/>
-        <w:rPr>
-          <w:lang w:eastAsia="es-ES"/>
-        </w:rPr>
-      </w:pPr>
-      <w:r>
-        <w:rPr>
-          <w:lang w:eastAsia="es-ES"/>
-        </w:rPr>
-        <w:t xml:space="preserve">Empecé por lo más básico, que son los productos, y ahí me di cuenta de que no podía volverme loco creando una lógica distinta para cada cosa que se vendiera. Pensé en un molde general, algo que llamé Producto, donde simplemente guardaba lo que todos tienen: un nombre y un precio. Pero claro, el trabajo pedía que hubiera snacks y bebidas, así que lo que hice fue usar ese molde base y "estirarlo". Para las bebidas, creé un molde específico que heredaba todo lo del </w:t>
-      </w:r>
-      <w:r>
-        <w:rPr>
-          <w:lang w:eastAsia="es-ES"/>
-        </w:rPr>
-        <w:t>anterior,</w:t>
-      </w:r>
-      <w:r>
-        <w:rPr>
-          <w:lang w:eastAsia="es-ES"/>
-        </w:rPr>
-        <w:t xml:space="preserve"> pero le añadía el tamaño o si tenía azúcar, y para los snacks hice lo </w:t>
-      </w:r>
-      <w:r>
-        <w:rPr>
-          <w:lang w:eastAsia="es-ES"/>
-        </w:rPr>
-        <w:t>mismo,</w:t>
-      </w:r>
-      <w:r>
-        <w:rPr>
-          <w:lang w:eastAsia="es-ES"/>
-        </w:rPr>
-        <w:t xml:space="preserve"> pero añadiendo s</w:t>
-      </w:r>
-      <w:r>
-        <w:rPr>
-          <w:lang w:eastAsia="es-ES"/>
-        </w:rPr>
-        <w:t xml:space="preserve">olo su tamaño donde solo podían ser </w:t>
-      </w:r>
-      <w:r>
-        <w:rPr>
-          <w:i/>
-          <w:iCs/>
-          <w:lang w:eastAsia="es-ES"/>
-        </w:rPr>
-        <w:t>Large, Medium o Small</w:t>
-      </w:r>
-      <w:r>
-        <w:rPr>
-          <w:lang w:eastAsia="es-ES"/>
-        </w:rPr>
-        <w:t xml:space="preserve">. </w:t>
+      </w:pPr>
+      <w:r>
+        <w:t> </w:t>
       </w:r>
     </w:p>
     <w:p>
       <w:pPr>
         <w:jc w:val="both"/>
+      </w:pPr>
+      <w:r>
+        <w:t xml:space="preserve">En cuanto el manejo del dinero en base a introducirlo según el </w:t>
+      </w:r>
+      <w:r>
         <w:rPr>
-          <w:lang w:eastAsia="es-ES"/>
+          <w:b/>
+          <w:bCs/>
         </w:rPr>
-      </w:pPr>
+        <w:t>[RF3]</w:t>
+      </w:r>
+      <w:r>
+        <w:t>,</w:t>
+      </w:r>
+      <w:r>
+        <w:t xml:space="preserve"> el sistema cuenta con un contador inteligente que reconoce cada moneda de curso legal que entra por la ranura. A medida que el usuario introduce monedas, el sistema actualiza de forma inmediata una cifra en pantalla para que la persona sepa exactamente cuánto dinero lleva acumulado. Para que el proceso de compra sea ordenado, el </w:t>
+      </w:r>
       <w:r>
         <w:rPr>
-          <w:lang w:eastAsia="es-ES"/>
+          <w:b/>
+          <w:bCs/>
         </w:rPr>
-        <w:t xml:space="preserve">Así, cuando la máquina mira un producto, sabe que es un </w:t>
+        <w:t>[RF4]</w:t>
+      </w:r>
+      <w:r>
+        <w:t xml:space="preserve"> actúa como una guardia que supervisa los códigos introducidos por el teclado. Si el usuario intenta marcar una casilla que no existe o se equivoca en el formato de letras y números, el sistema le avisa para que lo corrija. Una vez introducido un código válido, el </w:t>
       </w:r>
       <w:r>
         <w:rPr>
-          <w:lang w:eastAsia="es-ES"/>
+          <w:b/>
+          <w:bCs/>
         </w:rPr>
-        <w:t>producto,</w:t>
-      </w:r>
-      <w:r>
-        <w:rPr>
-          <w:lang w:eastAsia="es-ES"/>
-        </w:rPr>
-        <w:t xml:space="preserve"> pero también sabe si tiene que tratarlo como bebida o snack, y eso me ahorró un montón de problemas porque el sistema ya sabe de qué familia viene cada objeto sin que yo se lo tenga que repetir mil veces.</w:t>
+        <w:t>[RF5]</w:t>
+      </w:r>
+      <w:r>
+        <w:t xml:space="preserve"> hace una doble comprobación: mira si todavía quedan unidades del producto deseado y verifica si el dinero acumulado por el cliente alcanza para pagarlo.</w:t>
       </w:r>
     </w:p>
     <w:p>
       <w:pPr>
         <w:jc w:val="both"/>
-        <w:rPr>
-          <w:lang w:eastAsia="es-ES"/>
-        </w:rPr>
-      </w:pPr>
-      <w:r>
-        <w:rPr>
-          <w:lang w:eastAsia="es-ES"/>
-        </w:rPr>
-        <w:t>Una vez que tuve los productos, el siguiente lío fue dónde meterlos, porque una máquina de vending no es un saco donde tiras todo, sino que está súper ordenada por ranuras. Así que me puse a diseñar esa estructura de cajones, una cuadrícula donde cada hueco sabe exactamente qué producto guarda y, lo más importante, cuántos quedan. Tuve que programar que cada vez que alguien compra, la máquina vaya a esa ranura específica y reste uno al stock</w:t>
-      </w:r>
-      <w:r>
-        <w:rPr>
-          <w:lang w:eastAsia="es-ES"/>
-        </w:rPr>
-        <w:t>.</w:t>
+      </w:pPr>
+      <w:r>
+        <w:t> </w:t>
       </w:r>
     </w:p>
     <w:p>
       <w:pPr>
         <w:jc w:val="both"/>
+      </w:pPr>
+      <w:r>
+        <w:t xml:space="preserve">Cuando se confirma todo, el </w:t>
+      </w:r>
+      <w:r>
         <w:rPr>
-          <w:lang w:eastAsia="es-ES"/>
+          <w:b/>
+          <w:bCs/>
         </w:rPr>
-      </w:pPr>
+        <w:t>[RF6]</w:t>
+      </w:r>
+      <w:r>
+        <w:t xml:space="preserve"> pone en marcha el mecanismo de entrega, dejando caer el articulo para el cliente y restando esa unidad del inventario para que la cuenta siempre sea exacta. Al mismo tiempo, el dinero introducido pasa a formar parte de la caja de la máquina. Si sobra dinero, el </w:t>
+      </w:r>
       <w:r>
         <w:rPr>
-          <w:lang w:eastAsia="es-ES"/>
+          <w:b/>
+          <w:bCs/>
         </w:rPr>
-        <w:t>Pero para que todo esto del dinero no fallara nunca, porque con el dinero no se juega, me creé un depósito de monedas súper estricto. En lugar de dejar que el usuario metiera cualquier número, hice una lista cerrada, un "enumerado", donde solo existen las monedas de verdad: la de 5 céntimos, 10, 20, 50, 1 euro y 2 euros. Si no es una de esas, la máquina ni la mira. Esto me dio una seguridad brutal porque el sistema sabe exactamente qué tipo de monedas tiene en la hucha y cuántas de cada una hay para poder devolver el cambio luego.</w:t>
+        <w:t>[RF7]</w:t>
+      </w:r>
+      <w:r>
+        <w:t xml:space="preserve"> activa un plan de devolución que busca entregar las vueltas utilizando la menor cantidad de monedas posible, mirando siempre que monedas tiene disponibles en ese momento para no quedarse sin cambio. Por el contrario, el </w:t>
+      </w:r>
+      <w:r>
+        <w:rPr>
+          <w:b/>
+          <w:bCs/>
+        </w:rPr>
+        <w:t>[RF8]</w:t>
+      </w:r>
+      <w:r>
+        <w:t xml:space="preserve"> protege al cliente devolviendo todo su dinero si este decide no comprar nada a última hora o si la máquina detecta que no tiene monedas suficientes para darle su cambio exacto de forma segura, aunque hay otros factores que pueden ocasionar esto.</w:t>
       </w:r>
     </w:p>
     <w:p>
       <w:pPr>
         <w:jc w:val="both"/>
-        <w:rPr>
-          <w:lang w:eastAsia="es-ES"/>
-        </w:rPr>
-      </w:pPr>
-      <w:r>
-        <w:rPr>
-          <w:lang w:eastAsia="es-ES"/>
-        </w:rPr>
-        <w:t>Y hablando del cambio, ahí es donde metí toda la lógica "gorda" dentro de lo que sería el cerebro de la máquina. Diseñé un proceso que es como un cajero automático minúsculo: cuando tú terminas de comprar, el cerebro mira cuánto dinero le has dado y cuánto vale el producto, saca la diferencia y empieza a rebuscar en el depósito de monedas. Lo hice de forma que siempre intente darte la moneda más grande que tenga disponible para acabar rápido y no llenarte el bolsillo de chatarra. Si te tiene que dar un euro, prefiere darte una moneda de un euro que dos de cincuenta. Todo esto lo guardé en una clase principal que controla la máquina, que es la que se encarga de conectar el depósito con las ranuras.</w:t>
+      </w:pPr>
+      <w:r>
+        <w:t> </w:t>
       </w:r>
     </w:p>
     <w:p>
       <w:pPr>
         <w:jc w:val="both"/>
+      </w:pPr>
+      <w:r>
+        <w:t xml:space="preserve">La seguridad del panel administrativo se gestiona mediante </w:t>
+      </w:r>
+      <w:r>
         <w:rPr>
-          <w:lang w:eastAsia="es-ES"/>
+          <w:b/>
+          <w:bCs/>
         </w:rPr>
-      </w:pPr>
+        <w:t>[RF9]</w:t>
+      </w:r>
+      <w:r>
+        <w:t xml:space="preserve">, que solicita una clave de números. Para evitar que personas ajenas intenten adivinarla, el sistema cuenta los fallos y, si llega a tres intentos incorrectos, te enviaran a la zona de clientes para menos compromiso. Una vez dentro, el administrador puede usar el </w:t>
+      </w:r>
       <w:r>
         <w:rPr>
-          <w:lang w:eastAsia="es-ES"/>
+          <w:b/>
+          <w:bCs/>
         </w:rPr>
-        <w:t>Pero claro, faltaba separar quién puede tocar qué, así que me inventé dos moldes de usuario totalmente distintos para que la lógica no se mezclara. Por un lado, el usuario normal, el cliente, que solo tiene permiso para meter monedas</w:t>
+        <w:t>[RF10]</w:t>
+      </w:r>
+      <w:r>
+        <w:t xml:space="preserve"> para reponer los productos que se han ido vendiendo, teniendo siempre un tope de diez unidades para que el mecanismo no se </w:t>
+      </w:r>
+      <w:r>
+        <w:lastRenderedPageBreak/>
+        <w:t xml:space="preserve">atasque por el exceso de carga. Además, el </w:t>
       </w:r>
       <w:r>
         <w:rPr>
-          <w:lang w:eastAsia="es-ES"/>
+          <w:b/>
+          <w:bCs/>
         </w:rPr>
-        <w:t>,</w:t>
+        <w:t>[RF11]</w:t>
+      </w:r>
+      <w:r>
+        <w:t xml:space="preserve"> ofrece la libertad de reorganizar la máquina permitiendo poner productos nuevos en huecos que estaban vacíos o quitar aquellos que ya no se quieran vender más.</w:t>
+      </w:r>
+    </w:p>
+    <w:p>
+      <w:pPr>
+        <w:jc w:val="both"/>
+      </w:pPr>
+      <w:r>
+        <w:t> </w:t>
+      </w:r>
+    </w:p>
+    <w:p>
+      <w:pPr>
+        <w:jc w:val="both"/>
+      </w:pPr>
+      <w:r>
+        <w:t xml:space="preserve">Para llevar un control impecable de las ganancias, el </w:t>
       </w:r>
       <w:r>
         <w:rPr>
-          <w:lang w:eastAsia="es-ES"/>
+          <w:b/>
+          <w:bCs/>
         </w:rPr>
-        <w:t xml:space="preserve"> comprar</w:t>
+        <w:t>[RF12]</w:t>
+      </w:r>
+      <w:r>
+        <w:t xml:space="preserve"> genera un informe de cuentas muy detallado. En este documento interno, el administrador puede ver exactamente cuántas monedas hay de cada valor y cuál es el total de dinero recaudado por todas las ventas realizadas hasta el momento. Finalmente, para que el sistema siga siendo seguro con el paso del tiempo, el </w:t>
       </w:r>
       <w:r>
         <w:rPr>
-          <w:lang w:eastAsia="es-ES"/>
+          <w:b/>
+          <w:bCs/>
         </w:rPr>
-        <w:t xml:space="preserve"> productos y pedir el crédito</w:t>
-      </w:r>
-      <w:r>
-        <w:rPr>
-          <w:lang w:eastAsia="es-ES"/>
-        </w:rPr>
-        <w:t xml:space="preserve">. Su lógica es sencilla: interactúa con la pantalla y recibe su producto. </w:t>
-      </w:r>
-      <w:r>
-        <w:rPr>
-          <w:lang w:eastAsia="es-ES"/>
-        </w:rPr>
-        <w:t>Pero,</w:t>
-      </w:r>
-      <w:r>
-        <w:rPr>
-          <w:lang w:eastAsia="es-ES"/>
-        </w:rPr>
-        <w:t xml:space="preserve"> por otro lado, creé el </w:t>
-      </w:r>
-      <w:r>
-        <w:rPr>
-          <w:lang w:eastAsia="es-ES"/>
-        </w:rPr>
-        <w:lastRenderedPageBreak/>
-        <w:t>molde del administrador, que es como el dueño que tiene la llave maestra. Este usuario tiene una lógica aparte que está protegida</w:t>
-      </w:r>
-      <w:r>
-        <w:rPr>
-          <w:lang w:eastAsia="es-ES"/>
-        </w:rPr>
-        <w:t>,</w:t>
-      </w:r>
-      <w:r>
-        <w:rPr>
-          <w:lang w:eastAsia="es-ES"/>
-        </w:rPr>
-        <w:t xml:space="preserve"> él puede ver cuánta recaudación total lleva la máquina desde que se encendió, puede rellenar las ranuras cuando se vacían o incluso </w:t>
-      </w:r>
-      <w:r>
-        <w:rPr>
-          <w:lang w:eastAsia="es-ES"/>
-        </w:rPr>
-        <w:t>ver</w:t>
-      </w:r>
-      <w:r>
-        <w:rPr>
-          <w:lang w:eastAsia="es-ES"/>
-        </w:rPr>
-        <w:t xml:space="preserve"> la caja de moneda</w:t>
-      </w:r>
-      <w:r>
-        <w:rPr>
-          <w:lang w:eastAsia="es-ES"/>
-        </w:rPr>
-        <w:t>s</w:t>
-      </w:r>
-      <w:r>
-        <w:rPr>
-          <w:lang w:eastAsia="es-ES"/>
-        </w:rPr>
-        <w:t>. Lo bueno de separarlos así es que el código del cliente no sabe nada de cómo se cambia un precio o cómo se ve la recaudación, manteniendo esa seguridad de que nadie va a tocar donde no debe. Fue como construir una tienda pequeña donde el mostrador separa perfectamente lo que hace el cliente de lo que hace el dependiente en el almacén, y así, poco a poco, conectando el depósito con las ranuras y los usuarios con la máquina, es como conseguí que todo funcionara como un reloj sin que se me escapara ningún detalle.</w:t>
+        <w:t>[RF13]</w:t>
+      </w:r>
+      <w:r>
+        <w:t xml:space="preserve"> permite que el responsable cambie su clave de acceso siempre que lo necesite, obligando a que la nueva contraseña cumpla con unas normas básicas de protección para que nadie pueda descifrarla fácilmente.</w:t>
       </w:r>
     </w:p>
-    <w:p/>
     <w:p>
       <w:r>
         <w:br w:type="page"/>
@@ -2545,6 +2851,365 @@
       <w:bookmarkEnd w:id="9"/>
     </w:p>
     <w:p>
+      <w:pPr>
+        <w:jc w:val="both"/>
+      </w:pPr>
+      <w:r>
+        <w:t xml:space="preserve">El desarrollo comenzó con la creación de una sólida base de datos en memoria para el </w:t>
+      </w:r>
+      <w:r>
+        <w:rPr>
+          <w:b/>
+          <w:bCs/>
+        </w:rPr>
+        <w:t>[RF1]</w:t>
+      </w:r>
+      <w:r>
+        <w:t xml:space="preserve">, implementada a través de una arquitectura de herencia en el paquete de productos. Se definió una clase madre abstracta denominada Productos, la cual establece los atributos esenciales de identidad y precio. No obstante, el procedimiento de diseño delegó la lógica de precios a las subclases especializadas Bebida y Snack. Mediante la </w:t>
+      </w:r>
+      <w:r>
+        <w:t>implementación</w:t>
+      </w:r>
+      <w:r>
+        <w:t xml:space="preserve"> del método abstracto calcularPrecio, cada objeto adquiere la capacidad de procesar sus propias variables de </w:t>
+      </w:r>
+      <w:r>
+        <w:t xml:space="preserve">negocio – como el volumen, el contenido de azúcar o el tamaño definido en el enumerado TamanioSnacks – permitiendo que, al iniciar el sistema, la clase Stock genere un catálogo dinámico donde los precios reflejan con exactitud las propiedades de cada </w:t>
+      </w:r>
+      <w:r>
+        <w:t>artículo</w:t>
+      </w:r>
+      <w:r>
+        <w:t xml:space="preserve"> en tiempo real.</w:t>
+      </w:r>
+    </w:p>
+    <w:p>
+      <w:pPr>
+        <w:jc w:val="both"/>
+      </w:pPr>
+    </w:p>
+    <w:p>
+      <w:pPr>
+        <w:jc w:val="both"/>
+      </w:pPr>
+      <w:r>
+        <w:t xml:space="preserve">Para dar cumplimiento al </w:t>
+      </w:r>
+      <w:r>
+        <w:rPr>
+          <w:b/>
+          <w:bCs/>
+        </w:rPr>
+        <w:t>[RF2]</w:t>
+      </w:r>
+      <w:r>
+        <w:t xml:space="preserve">, se ha diseñador un modelo de interacción segmentado mediante el uso de roles diferenciados, representados en las clases Cliente y Administrador. El procedimiento consistió en centralizar el flujo de operación pública en el controlador del cliente, mientras que las funciones de gestión criticas se encapsularon en un módulo administrativo independiente. Esta separación de responsabilidades asegura que la integridad del sistema no se vea comprometida, ya que el acceso a las funciones de mantenimiento requiere una transición de estado validada. Ambos roles interactúan con una instancia central de MaquinaVending, la cual actúa como un mediador que garantiza la coherencia de los datos entre la interfaz de usuario y la lógica de control interna. </w:t>
+      </w:r>
+    </w:p>
+    <w:p>
+      <w:pPr>
+        <w:jc w:val="both"/>
+      </w:pPr>
+    </w:p>
+    <w:p>
+      <w:pPr>
+        <w:jc w:val="both"/>
+      </w:pPr>
+      <w:r>
+        <w:t xml:space="preserve">La gestión del flujo monetario y las validaciones de seguridad para los </w:t>
+      </w:r>
+      <w:r>
+        <w:t>requisitos</w:t>
+      </w:r>
+      <w:r>
+        <w:t xml:space="preserve"> </w:t>
+      </w:r>
+      <w:r>
+        <w:rPr>
+          <w:b/>
+          <w:bCs/>
+        </w:rPr>
+        <w:t>[RF3]</w:t>
+      </w:r>
+      <w:r>
+        <w:t xml:space="preserve">, </w:t>
+      </w:r>
+      <w:r>
+        <w:rPr>
+          <w:b/>
+          <w:bCs/>
+        </w:rPr>
+        <w:t>[RF4]</w:t>
+      </w:r>
+      <w:r>
+        <w:t xml:space="preserve"> y </w:t>
+      </w:r>
+      <w:r>
+        <w:rPr>
+          <w:b/>
+          <w:bCs/>
+        </w:rPr>
+        <w:t>[RF5]</w:t>
+      </w:r>
+      <w:r>
+        <w:rPr>
+          <w:b/>
+          <w:bCs/>
+        </w:rPr>
+        <w:t xml:space="preserve"> </w:t>
+      </w:r>
+      <w:r>
+        <w:t>impulsaron la creación de un sistema de control financiero de alta precisión. Se desarrollo la clase Deposito, la cual emplea un enumMap para gestionar el inventario de la clase Monedas. El procedimiento técnico exigió</w:t>
+      </w:r>
+      <w:r>
+        <w:t xml:space="preserve"> al uso exclusivo de la clase BigDecimal para todas las operaciones aritméticas, eliminando cualquier riesgo de error en el redondeo decimal. Simultáneamente, se integro una capa de validación en la clase Stock mediante el método de validarFormatoCodigo, el cual utiliza expresiones regulares para asegurar que solo las coordenadas dentro del rango A1-D4 sean procesadas. Este diseño permite que el sistema ejecute una secuencia de comprobación exhaustiva antes de cada venta, verificando de forma concurrente la validez del código, la existencia de los productos y la suficiencia del crédito acumulado.</w:t>
+      </w:r>
+    </w:p>
+    <w:p>
+      <w:pPr>
+        <w:jc w:val="both"/>
+      </w:pPr>
+    </w:p>
+    <w:p>
+      <w:pPr>
+        <w:jc w:val="both"/>
+      </w:pPr>
+    </w:p>
+    <w:p>
+      <w:pPr>
+        <w:jc w:val="both"/>
+      </w:pPr>
+      <w:r>
+        <w:lastRenderedPageBreak/>
+        <w:t xml:space="preserve">El núcleo de la lógica de negocio, correspondiente a la ejecución de la venta y la devolución de crédito sobrante </w:t>
+      </w:r>
+      <w:r>
+        <w:rPr>
+          <w:b/>
+          <w:bCs/>
+        </w:rPr>
+        <w:t>[RF6]</w:t>
+      </w:r>
+      <w:r>
+        <w:t xml:space="preserve">, </w:t>
+      </w:r>
+      <w:r>
+        <w:rPr>
+          <w:b/>
+          <w:bCs/>
+        </w:rPr>
+        <w:t>[RF7]</w:t>
+      </w:r>
+      <w:r>
+        <w:t xml:space="preserve"> y </w:t>
+      </w:r>
+      <w:r>
+        <w:rPr>
+          <w:b/>
+          <w:bCs/>
+        </w:rPr>
+        <w:t>[RF8]</w:t>
+      </w:r>
+      <w:r>
+        <w:t>, se resolvió mediante algoritmos de control de transacciones. El procedimiento de dispensación se diseñó para ser atómico, asegurando que la reducción del stock en la clase Ranuras y la actualización de la recaudación en la caja se realicen de forma coordinada. Para la devolución del cambio, se implementó un algoritmo ávido (</w:t>
+      </w:r>
+      <w:proofErr w:type="spellStart"/>
+      <w:r>
+        <w:t>greddy</w:t>
+      </w:r>
+      <w:proofErr w:type="spellEnd"/>
+      <w:r>
+        <w:t xml:space="preserve">) en el método </w:t>
+      </w:r>
+      <w:proofErr w:type="spellStart"/>
+      <w:r>
+        <w:t>calcularCambioNecesario</w:t>
+      </w:r>
+      <w:proofErr w:type="spellEnd"/>
+      <w:r>
+        <w:t>, el cual prioriza las denominaciones de mayor valor para optimizar el inventario de monedas. Una característica distintiva de este diseño es la inclusión de una rutina de pre-verificacion de solvencia</w:t>
+      </w:r>
+      <w:r>
+        <w:t>, ya que el sistema simula el proceso de cambio antes de finalizar la transacción y, en cas de detectar una carencia de monedas físicas, activa un protocolo de cancelación que restituye el crédito íntegramente al usuario para cumplir con estándares de seguridad y fiabilidad.</w:t>
+      </w:r>
+    </w:p>
+    <w:p>
+      <w:pPr>
+        <w:jc w:val="both"/>
+      </w:pPr>
+    </w:p>
+    <w:p>
+      <w:pPr>
+        <w:jc w:val="both"/>
+      </w:pPr>
+      <w:r>
+        <w:t xml:space="preserve">Finalmente, la administración del sistema y la auditoría técnica se consolidaron mediante módulos de supervisión en las clases Administrador y Stock. Para el </w:t>
+      </w:r>
+      <w:r>
+        <w:rPr>
+          <w:b/>
+          <w:bCs/>
+        </w:rPr>
+        <w:t>[RF9]</w:t>
+      </w:r>
+      <w:r>
+        <w:t xml:space="preserve">, se programo un sistema de control de acceso que monitoriza los intentos de entrada, bloqueando el panel de gestión tras superar el </w:t>
+      </w:r>
+      <w:r>
+        <w:t>límite</w:t>
+      </w:r>
+      <w:r>
+        <w:t xml:space="preserve"> de seguridad establecido</w:t>
+      </w:r>
+      <w:r>
+        <w:t>, para ello deberá introducir un pin de 4 números el cual tiene una validación interna para que no puedan introducir más números o alguna letra de por medio</w:t>
+      </w:r>
+      <w:r>
+        <w:t>.</w:t>
+      </w:r>
+    </w:p>
+    <w:p>
+      <w:pPr>
+        <w:jc w:val="both"/>
+      </w:pPr>
+    </w:p>
+    <w:p>
+      <w:pPr>
+        <w:jc w:val="both"/>
+      </w:pPr>
+      <w:r>
+        <w:t xml:space="preserve">El control de existencias definido en el </w:t>
+      </w:r>
+      <w:r>
+        <w:rPr>
+          <w:b/>
+          <w:bCs/>
+        </w:rPr>
+        <w:t>[RF10]</w:t>
+      </w:r>
+      <w:r>
+        <w:t xml:space="preserve"> se fundamenta en la clase Ranuras, la cual actúa como un contenedor inteligente. Para garantizar que no se sobrepase el límite físico de la máquina, se ha establecido una constante denominada MAX_PRODUCTOS con un valor de 10. La seguridad de este requisito se consigue mediante un método “setter” con lógica de guarda. Que actúa como filtro preventivo antes de realizar la asignación al atributo. Para facilitar la reposición, se implementó el método </w:t>
+      </w:r>
+      <w:proofErr w:type="gramStart"/>
+      <w:r>
+        <w:t>añadirCantidad(</w:t>
+      </w:r>
+      <w:proofErr w:type="gramEnd"/>
+      <w:r>
+        <w:t>int cantidad), el cual invoca internamente el “</w:t>
+      </w:r>
+      <w:r>
+        <w:t>setter” mencionado</w:t>
+      </w:r>
+      <w:r>
+        <w:t>, heredando todas sus restricciones de seguridad.</w:t>
+      </w:r>
+    </w:p>
+    <w:p>
+      <w:pPr>
+        <w:jc w:val="both"/>
+      </w:pPr>
+    </w:p>
+    <w:p>
+      <w:pPr>
+        <w:jc w:val="both"/>
+      </w:pPr>
+      <w:r>
+        <w:t xml:space="preserve">En cuanto al </w:t>
+      </w:r>
+      <w:r>
+        <w:rPr>
+          <w:b/>
+          <w:bCs/>
+        </w:rPr>
+        <w:t>[RF11]</w:t>
+      </w:r>
+      <w:r>
+        <w:t xml:space="preserve">, la </w:t>
+      </w:r>
+      <w:r>
+        <w:t>inserción</w:t>
+      </w:r>
+      <w:r>
+        <w:t xml:space="preserve"> de nuevos productos se gestiona a través del método </w:t>
+      </w:r>
+      <w:proofErr w:type="gramStart"/>
+      <w:r>
+        <w:t>añadirProducto(</w:t>
+      </w:r>
+      <w:proofErr w:type="gramEnd"/>
+      <w:r>
+        <w:t>String código, Productos nuevoProducto, int cantidad)</w:t>
+      </w:r>
+      <w:r>
+        <w:t xml:space="preserve"> localizado en la clase Stock. El procedimiento técnico para lograr una inserción exitosa sigue una secuencia de validaciones en cascada. Por otro lado, la eliminación de productos consigue mediante el método </w:t>
+      </w:r>
+      <w:proofErr w:type="gramStart"/>
+      <w:r>
+        <w:t>eliminarProducto(</w:t>
+      </w:r>
+      <w:proofErr w:type="gramEnd"/>
+      <w:r>
+        <w:t xml:space="preserve">String código). El funcionamiento interno de este proceso es una operación de limpieza lógica y referencial, tras validar que el código de la ranura existe en el HashMap de la clase Stock, el sistema invoca el método </w:t>
+      </w:r>
+      <w:proofErr w:type="gramStart"/>
+      <w:r>
+        <w:t>vaciar(</w:t>
+      </w:r>
+      <w:proofErr w:type="gramEnd"/>
+      <w:r>
+        <w:t>) de la clase Ranuras.</w:t>
+      </w:r>
+    </w:p>
+    <w:p>
+      <w:pPr>
+        <w:jc w:val="both"/>
+      </w:pPr>
+    </w:p>
+    <w:p>
+      <w:pPr>
+        <w:jc w:val="both"/>
+      </w:pPr>
+    </w:p>
+    <w:p>
+      <w:pPr>
+        <w:jc w:val="both"/>
+      </w:pPr>
+      <w:r>
+        <w:lastRenderedPageBreak/>
+        <w:t xml:space="preserve">Para la rendición de </w:t>
+      </w:r>
+      <w:r>
+        <w:t>cuentas</w:t>
+      </w:r>
+      <w:r>
+        <w:t xml:space="preserve"> exigida en el </w:t>
+      </w:r>
+      <w:r>
+        <w:rPr>
+          <w:b/>
+          <w:bCs/>
+        </w:rPr>
+        <w:t>[RF12]</w:t>
+      </w:r>
+      <w:r>
+        <w:t xml:space="preserve">, se desarrolló un motor de informes que procesa las colecciones de datos que ofrecer un desglose pormenorizado del efectivo y el estado del stock. El diseño culmina con el cumplimiento del </w:t>
+      </w:r>
+      <w:r>
+        <w:rPr>
+          <w:b/>
+          <w:bCs/>
+        </w:rPr>
+        <w:t>[RF13]</w:t>
+      </w:r>
+      <w:r>
+        <w:t>, proporcionando un mecanismo de actualización de credenciales que valida la complejidad y el formato del nuevo PIN, asegurando que la infraestructura de control administrativo permanezca protegida contra accesos no autorizados mediante una lógica de validación rigurosa.</w:t>
+      </w:r>
+    </w:p>
+    <w:p>
+      <w:pPr>
+        <w:jc w:val="both"/>
+      </w:pPr>
       <w:r>
         <w:br w:type="page"/>
       </w:r>
@@ -2566,299 +3231,9 @@
       </w:r>
       <w:bookmarkEnd w:id="10"/>
     </w:p>
-    <w:p>
-      <w:r>
-        <w:br w:type="page"/>
-      </w:r>
-    </w:p>
-    <w:p>
-      <w:pPr>
-        <w:pStyle w:val="Ttulo1"/>
-        <w:numPr>
-          <w:ilvl w:val="0"/>
-          <w:numId w:val="2"/>
-        </w:numPr>
-        <w:spacing w:line="360" w:lineRule="auto"/>
-        <w:ind w:left="426" w:hanging="426"/>
-      </w:pPr>
-      <w:bookmarkStart w:id="11" w:name="_Toc224033576"/>
-      <w:r>
-        <w:lastRenderedPageBreak/>
-        <w:t>EXPLOTACIÓN</w:t>
-      </w:r>
-      <w:bookmarkStart w:id="12" w:name="_Hlk140747344"/>
-      <w:bookmarkEnd w:id="11"/>
-    </w:p>
-    <w:p>
-      <w:r>
-        <w:br w:type="page"/>
-      </w:r>
-    </w:p>
-    <w:p/>
-    <w:p>
-      <w:pPr>
-        <w:pStyle w:val="Ttulo1"/>
-        <w:numPr>
-          <w:ilvl w:val="0"/>
-          <w:numId w:val="2"/>
-        </w:numPr>
-        <w:spacing w:line="360" w:lineRule="auto"/>
-        <w:ind w:left="426" w:hanging="426"/>
-      </w:pPr>
-      <w:bookmarkStart w:id="13" w:name="_Toc224033577"/>
-      <w:r>
-        <w:t>MANTENIMIENTO</w:t>
-      </w:r>
-      <w:bookmarkEnd w:id="3"/>
-      <w:bookmarkEnd w:id="7"/>
-      <w:bookmarkEnd w:id="8"/>
-      <w:bookmarkEnd w:id="12"/>
-      <w:bookmarkEnd w:id="13"/>
-    </w:p>
-    <w:tbl>
-      <w:tblPr>
-        <w:tblStyle w:val="Tablaconcuadrcula"/>
-        <w:tblW w:w="9316" w:type="dxa"/>
-        <w:tblLook w:val="04A0" w:firstRow="1" w:lastRow="0" w:firstColumn="1" w:lastColumn="0" w:noHBand="0" w:noVBand="1"/>
-      </w:tblPr>
-      <w:tblGrid>
-        <w:gridCol w:w="1725"/>
-        <w:gridCol w:w="1156"/>
-        <w:gridCol w:w="2599"/>
-        <w:gridCol w:w="2484"/>
-        <w:gridCol w:w="1352"/>
-      </w:tblGrid>
-      <w:tr>
-        <w:trPr>
-          <w:trHeight w:val="541"/>
-        </w:trPr>
-        <w:tc>
-          <w:tcPr>
-            <w:tcW w:w="0" w:type="auto"/>
-          </w:tcPr>
-          <w:p>
-            <w:r>
-              <w:t>Cod. defecto</w:t>
-            </w:r>
-          </w:p>
-        </w:tc>
-        <w:tc>
-          <w:tcPr>
-            <w:tcW w:w="0" w:type="auto"/>
-          </w:tcPr>
-          <w:p>
-            <w:r>
-              <w:t>Usuario</w:t>
-            </w:r>
-          </w:p>
-        </w:tc>
-        <w:tc>
-          <w:tcPr>
-            <w:tcW w:w="0" w:type="auto"/>
-          </w:tcPr>
-          <w:p>
-            <w:r>
-              <w:t>Descripción del fallo</w:t>
-            </w:r>
-          </w:p>
-        </w:tc>
-        <w:tc>
-          <w:tcPr>
-            <w:tcW w:w="0" w:type="auto"/>
-          </w:tcPr>
-          <w:p>
-            <w:r>
-              <w:t>Solución propuesta</w:t>
-            </w:r>
-          </w:p>
-        </w:tc>
-        <w:tc>
-          <w:tcPr>
-            <w:tcW w:w="0" w:type="auto"/>
-          </w:tcPr>
-          <w:p>
-            <w:r>
-              <w:t>Evidencia</w:t>
-            </w:r>
-          </w:p>
-        </w:tc>
-      </w:tr>
-      <w:tr>
-        <w:trPr>
-          <w:trHeight w:val="694"/>
-        </w:trPr>
-        <w:tc>
-          <w:tcPr>
-            <w:tcW w:w="0" w:type="auto"/>
-          </w:tcPr>
-          <w:p/>
-        </w:tc>
-        <w:tc>
-          <w:tcPr>
-            <w:tcW w:w="0" w:type="auto"/>
-          </w:tcPr>
-          <w:p/>
-        </w:tc>
-        <w:tc>
-          <w:tcPr>
-            <w:tcW w:w="0" w:type="auto"/>
-          </w:tcPr>
-          <w:p/>
-        </w:tc>
-        <w:tc>
-          <w:tcPr>
-            <w:tcW w:w="0" w:type="auto"/>
-          </w:tcPr>
-          <w:p/>
-        </w:tc>
-        <w:tc>
-          <w:tcPr>
-            <w:tcW w:w="0" w:type="auto"/>
-          </w:tcPr>
-          <w:p/>
-        </w:tc>
-      </w:tr>
-      <w:tr>
-        <w:trPr>
-          <w:trHeight w:val="694"/>
-        </w:trPr>
-        <w:tc>
-          <w:tcPr>
-            <w:tcW w:w="0" w:type="auto"/>
-          </w:tcPr>
-          <w:p/>
-        </w:tc>
-        <w:tc>
-          <w:tcPr>
-            <w:tcW w:w="0" w:type="auto"/>
-          </w:tcPr>
-          <w:p/>
-        </w:tc>
-        <w:tc>
-          <w:tcPr>
-            <w:tcW w:w="0" w:type="auto"/>
-          </w:tcPr>
-          <w:p/>
-        </w:tc>
-        <w:tc>
-          <w:tcPr>
-            <w:tcW w:w="0" w:type="auto"/>
-          </w:tcPr>
-          <w:p/>
-        </w:tc>
-        <w:tc>
-          <w:tcPr>
-            <w:tcW w:w="0" w:type="auto"/>
-          </w:tcPr>
-          <w:p/>
-        </w:tc>
-      </w:tr>
-      <w:tr>
-        <w:trPr>
-          <w:trHeight w:val="656"/>
-        </w:trPr>
-        <w:tc>
-          <w:tcPr>
-            <w:tcW w:w="0" w:type="auto"/>
-          </w:tcPr>
-          <w:p/>
-        </w:tc>
-        <w:tc>
-          <w:tcPr>
-            <w:tcW w:w="0" w:type="auto"/>
-          </w:tcPr>
-          <w:p/>
-        </w:tc>
-        <w:tc>
-          <w:tcPr>
-            <w:tcW w:w="0" w:type="auto"/>
-          </w:tcPr>
-          <w:p/>
-        </w:tc>
-        <w:tc>
-          <w:tcPr>
-            <w:tcW w:w="0" w:type="auto"/>
-          </w:tcPr>
-          <w:p/>
-        </w:tc>
-        <w:tc>
-          <w:tcPr>
-            <w:tcW w:w="0" w:type="auto"/>
-          </w:tcPr>
-          <w:p/>
-        </w:tc>
-      </w:tr>
-      <w:tr>
-        <w:trPr>
-          <w:trHeight w:val="694"/>
-        </w:trPr>
-        <w:tc>
-          <w:tcPr>
-            <w:tcW w:w="0" w:type="auto"/>
-          </w:tcPr>
-          <w:p/>
-        </w:tc>
-        <w:tc>
-          <w:tcPr>
-            <w:tcW w:w="0" w:type="auto"/>
-          </w:tcPr>
-          <w:p/>
-        </w:tc>
-        <w:tc>
-          <w:tcPr>
-            <w:tcW w:w="0" w:type="auto"/>
-          </w:tcPr>
-          <w:p/>
-        </w:tc>
-        <w:tc>
-          <w:tcPr>
-            <w:tcW w:w="0" w:type="auto"/>
-          </w:tcPr>
-          <w:p/>
-        </w:tc>
-        <w:tc>
-          <w:tcPr>
-            <w:tcW w:w="0" w:type="auto"/>
-          </w:tcPr>
-          <w:p/>
-        </w:tc>
-      </w:tr>
-      <w:tr>
-        <w:trPr>
-          <w:trHeight w:val="656"/>
-        </w:trPr>
-        <w:tc>
-          <w:tcPr>
-            <w:tcW w:w="0" w:type="auto"/>
-          </w:tcPr>
-          <w:p/>
-        </w:tc>
-        <w:tc>
-          <w:tcPr>
-            <w:tcW w:w="0" w:type="auto"/>
-          </w:tcPr>
-          <w:p/>
-        </w:tc>
-        <w:tc>
-          <w:tcPr>
-            <w:tcW w:w="0" w:type="auto"/>
-          </w:tcPr>
-          <w:p/>
-        </w:tc>
-        <w:tc>
-          <w:tcPr>
-            <w:tcW w:w="0" w:type="auto"/>
-          </w:tcPr>
-          <w:p/>
-        </w:tc>
-        <w:tc>
-          <w:tcPr>
-            <w:tcW w:w="0" w:type="auto"/>
-          </w:tcPr>
-          <w:p/>
-        </w:tc>
-      </w:tr>
-    </w:tbl>
+    <w:bookmarkEnd w:id="3"/>
+    <w:bookmarkEnd w:id="7"/>
+    <w:bookmarkEnd w:id="8"/>
     <w:p/>
     <w:sectPr>
       <w:headerReference w:type="first" r:id="rId11"/>
@@ -3589,7 +3964,7 @@
       <w:lvlText w:val="%1."/>
       <w:lvlJc w:val="left"/>
       <w:pPr>
-        <w:ind w:left="720" w:hanging="360"/>
+        <w:ind w:left="4187" w:hanging="360"/>
       </w:pPr>
       <w:rPr>
         <w:rFonts w:hint="default"/>
@@ -3758,6 +4133,119 @@
     </w:lvl>
   </w:abstractNum>
   <w:abstractNum w:abstractNumId="2" w15:restartNumberingAfterBreak="0">
+    <w:nsid w:val="07B7205F"/>
+    <w:multiLevelType w:val="hybridMultilevel"/>
+    <w:tmpl w:val="33129B0C"/>
+    <w:lvl w:ilvl="0" w:tplc="C54EED6E">
+      <w:start w:val="1"/>
+      <w:numFmt w:val="bullet"/>
+      <w:lvlText w:val="-"/>
+      <w:lvlJc w:val="left"/>
+      <w:pPr>
+        <w:ind w:left="420" w:hanging="360"/>
+      </w:pPr>
+      <w:rPr>
+        <w:rFonts w:ascii="Calibri" w:eastAsiaTheme="minorHAnsi" w:hAnsi="Calibri" w:cs="Calibri" w:hint="default"/>
+      </w:rPr>
+    </w:lvl>
+    <w:lvl w:ilvl="1" w:tplc="0C0A0003" w:tentative="1">
+      <w:start w:val="1"/>
+      <w:numFmt w:val="bullet"/>
+      <w:lvlText w:val="o"/>
+      <w:lvlJc w:val="left"/>
+      <w:pPr>
+        <w:ind w:left="1140" w:hanging="360"/>
+      </w:pPr>
+      <w:rPr>
+        <w:rFonts w:ascii="Courier New" w:hAnsi="Courier New" w:cs="Courier New" w:hint="default"/>
+      </w:rPr>
+    </w:lvl>
+    <w:lvl w:ilvl="2" w:tplc="0C0A0005" w:tentative="1">
+      <w:start w:val="1"/>
+      <w:numFmt w:val="bullet"/>
+      <w:lvlText w:val=""/>
+      <w:lvlJc w:val="left"/>
+      <w:pPr>
+        <w:ind w:left="1860" w:hanging="360"/>
+      </w:pPr>
+      <w:rPr>
+        <w:rFonts w:ascii="Wingdings" w:hAnsi="Wingdings" w:hint="default"/>
+      </w:rPr>
+    </w:lvl>
+    <w:lvl w:ilvl="3" w:tplc="0C0A0001" w:tentative="1">
+      <w:start w:val="1"/>
+      <w:numFmt w:val="bullet"/>
+      <w:lvlText w:val=""/>
+      <w:lvlJc w:val="left"/>
+      <w:pPr>
+        <w:ind w:left="2580" w:hanging="360"/>
+      </w:pPr>
+      <w:rPr>
+        <w:rFonts w:ascii="Symbol" w:hAnsi="Symbol" w:hint="default"/>
+      </w:rPr>
+    </w:lvl>
+    <w:lvl w:ilvl="4" w:tplc="0C0A0003" w:tentative="1">
+      <w:start w:val="1"/>
+      <w:numFmt w:val="bullet"/>
+      <w:lvlText w:val="o"/>
+      <w:lvlJc w:val="left"/>
+      <w:pPr>
+        <w:ind w:left="3300" w:hanging="360"/>
+      </w:pPr>
+      <w:rPr>
+        <w:rFonts w:ascii="Courier New" w:hAnsi="Courier New" w:cs="Courier New" w:hint="default"/>
+      </w:rPr>
+    </w:lvl>
+    <w:lvl w:ilvl="5" w:tplc="0C0A0005" w:tentative="1">
+      <w:start w:val="1"/>
+      <w:numFmt w:val="bullet"/>
+      <w:lvlText w:val=""/>
+      <w:lvlJc w:val="left"/>
+      <w:pPr>
+        <w:ind w:left="4020" w:hanging="360"/>
+      </w:pPr>
+      <w:rPr>
+        <w:rFonts w:ascii="Wingdings" w:hAnsi="Wingdings" w:hint="default"/>
+      </w:rPr>
+    </w:lvl>
+    <w:lvl w:ilvl="6" w:tplc="0C0A0001" w:tentative="1">
+      <w:start w:val="1"/>
+      <w:numFmt w:val="bullet"/>
+      <w:lvlText w:val=""/>
+      <w:lvlJc w:val="left"/>
+      <w:pPr>
+        <w:ind w:left="4740" w:hanging="360"/>
+      </w:pPr>
+      <w:rPr>
+        <w:rFonts w:ascii="Symbol" w:hAnsi="Symbol" w:hint="default"/>
+      </w:rPr>
+    </w:lvl>
+    <w:lvl w:ilvl="7" w:tplc="0C0A0003" w:tentative="1">
+      <w:start w:val="1"/>
+      <w:numFmt w:val="bullet"/>
+      <w:lvlText w:val="o"/>
+      <w:lvlJc w:val="left"/>
+      <w:pPr>
+        <w:ind w:left="5460" w:hanging="360"/>
+      </w:pPr>
+      <w:rPr>
+        <w:rFonts w:ascii="Courier New" w:hAnsi="Courier New" w:cs="Courier New" w:hint="default"/>
+      </w:rPr>
+    </w:lvl>
+    <w:lvl w:ilvl="8" w:tplc="0C0A0005" w:tentative="1">
+      <w:start w:val="1"/>
+      <w:numFmt w:val="bullet"/>
+      <w:lvlText w:val=""/>
+      <w:lvlJc w:val="left"/>
+      <w:pPr>
+        <w:ind w:left="6180" w:hanging="360"/>
+      </w:pPr>
+      <w:rPr>
+        <w:rFonts w:ascii="Wingdings" w:hAnsi="Wingdings" w:hint="default"/>
+      </w:rPr>
+    </w:lvl>
+  </w:abstractNum>
+  <w:abstractNum w:abstractNumId="3" w15:restartNumberingAfterBreak="0">
     <w:nsid w:val="084E3FC2"/>
     <w:multiLevelType w:val="multilevel"/>
     <w:tmpl w:val="7A7453B0"/>
@@ -3870,7 +4358,7 @@
       </w:rPr>
     </w:lvl>
   </w:abstractNum>
-  <w:abstractNum w:abstractNumId="3" w15:restartNumberingAfterBreak="0">
+  <w:abstractNum w:abstractNumId="4" w15:restartNumberingAfterBreak="0">
     <w:nsid w:val="09AD6ADC"/>
     <w:multiLevelType w:val="hybridMultilevel"/>
     <w:tmpl w:val="B4000372"/>
@@ -3961,7 +4449,7 @@
       </w:pPr>
     </w:lvl>
   </w:abstractNum>
-  <w:abstractNum w:abstractNumId="4" w15:restartNumberingAfterBreak="0">
+  <w:abstractNum w:abstractNumId="5" w15:restartNumberingAfterBreak="0">
     <w:nsid w:val="0CD46445"/>
     <w:multiLevelType w:val="hybridMultilevel"/>
     <w:tmpl w:val="97F4EE72"/>
@@ -4075,7 +4563,7 @@
       </w:rPr>
     </w:lvl>
   </w:abstractNum>
-  <w:abstractNum w:abstractNumId="5" w15:restartNumberingAfterBreak="0">
+  <w:abstractNum w:abstractNumId="6" w15:restartNumberingAfterBreak="0">
     <w:nsid w:val="1AF55B59"/>
     <w:multiLevelType w:val="multilevel"/>
     <w:tmpl w:val="4950FAF6"/>
@@ -4188,7 +4676,93 @@
       </w:rPr>
     </w:lvl>
   </w:abstractNum>
-  <w:abstractNum w:abstractNumId="6" w15:restartNumberingAfterBreak="0">
+  <w:abstractNum w:abstractNumId="7" w15:restartNumberingAfterBreak="0">
+    <w:nsid w:val="1B024DCF"/>
+    <w:multiLevelType w:val="hybridMultilevel"/>
+    <w:tmpl w:val="6BDAE510"/>
+    <w:lvl w:ilvl="0" w:tplc="0C0A000F">
+      <w:start w:val="1"/>
+      <w:numFmt w:val="decimal"/>
+      <w:lvlText w:val="%1."/>
+      <w:lvlJc w:val="left"/>
+      <w:pPr>
+        <w:ind w:left="720" w:hanging="360"/>
+      </w:pPr>
+    </w:lvl>
+    <w:lvl w:ilvl="1" w:tplc="0C0A0019" w:tentative="1">
+      <w:start w:val="1"/>
+      <w:numFmt w:val="lowerLetter"/>
+      <w:lvlText w:val="%2."/>
+      <w:lvlJc w:val="left"/>
+      <w:pPr>
+        <w:ind w:left="1440" w:hanging="360"/>
+      </w:pPr>
+    </w:lvl>
+    <w:lvl w:ilvl="2" w:tplc="0C0A001B" w:tentative="1">
+      <w:start w:val="1"/>
+      <w:numFmt w:val="lowerRoman"/>
+      <w:lvlText w:val="%3."/>
+      <w:lvlJc w:val="right"/>
+      <w:pPr>
+        <w:ind w:left="2160" w:hanging="180"/>
+      </w:pPr>
+    </w:lvl>
+    <w:lvl w:ilvl="3" w:tplc="0C0A000F" w:tentative="1">
+      <w:start w:val="1"/>
+      <w:numFmt w:val="decimal"/>
+      <w:lvlText w:val="%4."/>
+      <w:lvlJc w:val="left"/>
+      <w:pPr>
+        <w:ind w:left="2880" w:hanging="360"/>
+      </w:pPr>
+    </w:lvl>
+    <w:lvl w:ilvl="4" w:tplc="0C0A0019" w:tentative="1">
+      <w:start w:val="1"/>
+      <w:numFmt w:val="lowerLetter"/>
+      <w:lvlText w:val="%5."/>
+      <w:lvlJc w:val="left"/>
+      <w:pPr>
+        <w:ind w:left="3600" w:hanging="360"/>
+      </w:pPr>
+    </w:lvl>
+    <w:lvl w:ilvl="5" w:tplc="0C0A001B" w:tentative="1">
+      <w:start w:val="1"/>
+      <w:numFmt w:val="lowerRoman"/>
+      <w:lvlText w:val="%6."/>
+      <w:lvlJc w:val="right"/>
+      <w:pPr>
+        <w:ind w:left="4320" w:hanging="180"/>
+      </w:pPr>
+    </w:lvl>
+    <w:lvl w:ilvl="6" w:tplc="0C0A000F" w:tentative="1">
+      <w:start w:val="1"/>
+      <w:numFmt w:val="decimal"/>
+      <w:lvlText w:val="%7."/>
+      <w:lvlJc w:val="left"/>
+      <w:pPr>
+        <w:ind w:left="5040" w:hanging="360"/>
+      </w:pPr>
+    </w:lvl>
+    <w:lvl w:ilvl="7" w:tplc="0C0A0019" w:tentative="1">
+      <w:start w:val="1"/>
+      <w:numFmt w:val="lowerLetter"/>
+      <w:lvlText w:val="%8."/>
+      <w:lvlJc w:val="left"/>
+      <w:pPr>
+        <w:ind w:left="5760" w:hanging="360"/>
+      </w:pPr>
+    </w:lvl>
+    <w:lvl w:ilvl="8" w:tplc="0C0A001B" w:tentative="1">
+      <w:start w:val="1"/>
+      <w:numFmt w:val="lowerRoman"/>
+      <w:lvlText w:val="%9."/>
+      <w:lvlJc w:val="right"/>
+      <w:pPr>
+        <w:ind w:left="6480" w:hanging="180"/>
+      </w:pPr>
+    </w:lvl>
+  </w:abstractNum>
+  <w:abstractNum w:abstractNumId="8" w15:restartNumberingAfterBreak="0">
     <w:nsid w:val="21E049D7"/>
     <w:multiLevelType w:val="hybridMultilevel"/>
     <w:tmpl w:val="2304C7A2"/>
@@ -4279,7 +4853,7 @@
       </w:pPr>
     </w:lvl>
   </w:abstractNum>
-  <w:abstractNum w:abstractNumId="7" w15:restartNumberingAfterBreak="0">
+  <w:abstractNum w:abstractNumId="9" w15:restartNumberingAfterBreak="0">
     <w:nsid w:val="21E46DCB"/>
     <w:multiLevelType w:val="hybridMultilevel"/>
     <w:tmpl w:val="9EBE5D12"/>
@@ -4370,7 +4944,7 @@
       </w:pPr>
     </w:lvl>
   </w:abstractNum>
-  <w:abstractNum w:abstractNumId="8" w15:restartNumberingAfterBreak="0">
+  <w:abstractNum w:abstractNumId="10" w15:restartNumberingAfterBreak="0">
     <w:nsid w:val="25DA5F70"/>
     <w:multiLevelType w:val="hybridMultilevel"/>
     <w:tmpl w:val="5D108B8A"/>
@@ -4483,7 +5057,7 @@
       </w:rPr>
     </w:lvl>
   </w:abstractNum>
-  <w:abstractNum w:abstractNumId="9" w15:restartNumberingAfterBreak="0">
+  <w:abstractNum w:abstractNumId="11" w15:restartNumberingAfterBreak="0">
     <w:nsid w:val="294F68E2"/>
     <w:multiLevelType w:val="multilevel"/>
     <w:tmpl w:val="EC2C131A"/>
@@ -4596,7 +5170,7 @@
       </w:rPr>
     </w:lvl>
   </w:abstractNum>
-  <w:abstractNum w:abstractNumId="10" w15:restartNumberingAfterBreak="0">
+  <w:abstractNum w:abstractNumId="12" w15:restartNumberingAfterBreak="0">
     <w:nsid w:val="2FF214F7"/>
     <w:multiLevelType w:val="hybridMultilevel"/>
     <w:tmpl w:val="CF7C626E"/>
@@ -4710,7 +5284,7 @@
       </w:rPr>
     </w:lvl>
   </w:abstractNum>
-  <w:abstractNum w:abstractNumId="11" w15:restartNumberingAfterBreak="0">
+  <w:abstractNum w:abstractNumId="13" w15:restartNumberingAfterBreak="0">
     <w:nsid w:val="309578A3"/>
     <w:multiLevelType w:val="multilevel"/>
     <w:tmpl w:val="A62A4396"/>
@@ -4823,7 +5397,7 @@
       </w:rPr>
     </w:lvl>
   </w:abstractNum>
-  <w:abstractNum w:abstractNumId="12" w15:restartNumberingAfterBreak="0">
+  <w:abstractNum w:abstractNumId="14" w15:restartNumberingAfterBreak="0">
     <w:nsid w:val="30C06199"/>
     <w:multiLevelType w:val="multilevel"/>
     <w:tmpl w:val="7742AFDA"/>
@@ -4940,7 +5514,7 @@
       </w:rPr>
     </w:lvl>
   </w:abstractNum>
-  <w:abstractNum w:abstractNumId="13" w15:restartNumberingAfterBreak="0">
+  <w:abstractNum w:abstractNumId="15" w15:restartNumberingAfterBreak="0">
     <w:nsid w:val="400B2895"/>
     <w:multiLevelType w:val="multilevel"/>
     <w:tmpl w:val="29CA851A"/>
@@ -5053,7 +5627,7 @@
       </w:rPr>
     </w:lvl>
   </w:abstractNum>
-  <w:abstractNum w:abstractNumId="14" w15:restartNumberingAfterBreak="0">
+  <w:abstractNum w:abstractNumId="16" w15:restartNumberingAfterBreak="0">
     <w:nsid w:val="45A9145B"/>
     <w:multiLevelType w:val="hybridMultilevel"/>
     <w:tmpl w:val="282A5A02"/>
@@ -5142,7 +5716,7 @@
       </w:pPr>
     </w:lvl>
   </w:abstractNum>
-  <w:abstractNum w:abstractNumId="15" w15:restartNumberingAfterBreak="0">
+  <w:abstractNum w:abstractNumId="17" w15:restartNumberingAfterBreak="0">
     <w:nsid w:val="54785330"/>
     <w:multiLevelType w:val="hybridMultilevel"/>
     <w:tmpl w:val="1BB42C98"/>
@@ -5253,7 +5827,7 @@
       </w:rPr>
     </w:lvl>
   </w:abstractNum>
-  <w:abstractNum w:abstractNumId="16" w15:restartNumberingAfterBreak="0">
+  <w:abstractNum w:abstractNumId="18" w15:restartNumberingAfterBreak="0">
     <w:nsid w:val="593E7642"/>
     <w:multiLevelType w:val="hybridMultilevel"/>
     <w:tmpl w:val="013226C0"/>
@@ -5344,7 +5918,7 @@
       </w:pPr>
     </w:lvl>
   </w:abstractNum>
-  <w:abstractNum w:abstractNumId="17" w15:restartNumberingAfterBreak="0">
+  <w:abstractNum w:abstractNumId="19" w15:restartNumberingAfterBreak="0">
     <w:nsid w:val="59654BDA"/>
     <w:multiLevelType w:val="multilevel"/>
     <w:tmpl w:val="7B140CEC"/>
@@ -5457,7 +6031,7 @@
       </w:rPr>
     </w:lvl>
   </w:abstractNum>
-  <w:abstractNum w:abstractNumId="18" w15:restartNumberingAfterBreak="0">
+  <w:abstractNum w:abstractNumId="20" w15:restartNumberingAfterBreak="0">
     <w:nsid w:val="59B41EC9"/>
     <w:multiLevelType w:val="hybridMultilevel"/>
     <w:tmpl w:val="9E6287E8"/>
@@ -5571,7 +6145,7 @@
       </w:rPr>
     </w:lvl>
   </w:abstractNum>
-  <w:abstractNum w:abstractNumId="19" w15:restartNumberingAfterBreak="0">
+  <w:abstractNum w:abstractNumId="21" w15:restartNumberingAfterBreak="0">
     <w:nsid w:val="5D3214D4"/>
     <w:multiLevelType w:val="hybridMultilevel"/>
     <w:tmpl w:val="952C518C"/>
@@ -5662,7 +6236,7 @@
       </w:pPr>
     </w:lvl>
   </w:abstractNum>
-  <w:abstractNum w:abstractNumId="20" w15:restartNumberingAfterBreak="0">
+  <w:abstractNum w:abstractNumId="22" w15:restartNumberingAfterBreak="0">
     <w:nsid w:val="65A83448"/>
     <w:multiLevelType w:val="multilevel"/>
     <w:tmpl w:val="C4A0D928"/>
@@ -5775,7 +6349,7 @@
       </w:rPr>
     </w:lvl>
   </w:abstractNum>
-  <w:abstractNum w:abstractNumId="21" w15:restartNumberingAfterBreak="0">
+  <w:abstractNum w:abstractNumId="23" w15:restartNumberingAfterBreak="0">
     <w:nsid w:val="6A38221D"/>
     <w:multiLevelType w:val="multilevel"/>
     <w:tmpl w:val="EA58F970"/>
@@ -5888,7 +6462,7 @@
       </w:rPr>
     </w:lvl>
   </w:abstractNum>
-  <w:abstractNum w:abstractNumId="22" w15:restartNumberingAfterBreak="0">
+  <w:abstractNum w:abstractNumId="24" w15:restartNumberingAfterBreak="0">
     <w:nsid w:val="6C6B144B"/>
     <w:multiLevelType w:val="hybridMultilevel"/>
     <w:tmpl w:val="860A9000"/>
@@ -5979,7 +6553,7 @@
       </w:pPr>
     </w:lvl>
   </w:abstractNum>
-  <w:abstractNum w:abstractNumId="23" w15:restartNumberingAfterBreak="0">
+  <w:abstractNum w:abstractNumId="25" w15:restartNumberingAfterBreak="0">
     <w:nsid w:val="73EA1DEB"/>
     <w:multiLevelType w:val="hybridMultilevel"/>
     <w:tmpl w:val="9AC27004"/>
@@ -6068,7 +6642,7 @@
       </w:pPr>
     </w:lvl>
   </w:abstractNum>
-  <w:abstractNum w:abstractNumId="24" w15:restartNumberingAfterBreak="0">
+  <w:abstractNum w:abstractNumId="26" w15:restartNumberingAfterBreak="0">
     <w:nsid w:val="77E86306"/>
     <w:multiLevelType w:val="hybridMultilevel"/>
     <w:tmpl w:val="5012487C"/>
@@ -6154,7 +6728,7 @@
       </w:pPr>
     </w:lvl>
   </w:abstractNum>
-  <w:abstractNum w:abstractNumId="25" w15:restartNumberingAfterBreak="0">
+  <w:abstractNum w:abstractNumId="27" w15:restartNumberingAfterBreak="0">
     <w:nsid w:val="7E6365E8"/>
     <w:multiLevelType w:val="hybridMultilevel"/>
     <w:tmpl w:val="468CCF2A"/>
@@ -6267,7 +6841,7 @@
       </w:rPr>
     </w:lvl>
   </w:abstractNum>
-  <w:abstractNum w:abstractNumId="26" w15:restartNumberingAfterBreak="0">
+  <w:abstractNum w:abstractNumId="28" w15:restartNumberingAfterBreak="0">
     <w:nsid w:val="7F687E8B"/>
     <w:multiLevelType w:val="multilevel"/>
     <w:tmpl w:val="ED9287FE"/>
@@ -6381,85 +6955,91 @@
     </w:lvl>
   </w:abstractNum>
   <w:num w:numId="1" w16cid:durableId="2135638189">
-    <w:abstractNumId w:val="23"/>
+    <w:abstractNumId w:val="25"/>
   </w:num>
   <w:num w:numId="2" w16cid:durableId="990712267">
     <w:abstractNumId w:val="0"/>
   </w:num>
   <w:num w:numId="3" w16cid:durableId="1306355022">
+    <w:abstractNumId w:val="28"/>
+  </w:num>
+  <w:num w:numId="4" w16cid:durableId="21565032">
+    <w:abstractNumId w:val="22"/>
+  </w:num>
+  <w:num w:numId="5" w16cid:durableId="881096725">
+    <w:abstractNumId w:val="19"/>
+  </w:num>
+  <w:num w:numId="6" w16cid:durableId="225921922">
+    <w:abstractNumId w:val="11"/>
+  </w:num>
+  <w:num w:numId="7" w16cid:durableId="1940021731">
+    <w:abstractNumId w:val="3"/>
+  </w:num>
+  <w:num w:numId="8" w16cid:durableId="366369746">
+    <w:abstractNumId w:val="23"/>
+  </w:num>
+  <w:num w:numId="9" w16cid:durableId="37635549">
+    <w:abstractNumId w:val="13"/>
+  </w:num>
+  <w:num w:numId="10" w16cid:durableId="369964320">
+    <w:abstractNumId w:val="15"/>
+  </w:num>
+  <w:num w:numId="11" w16cid:durableId="401368912">
+    <w:abstractNumId w:val="6"/>
+  </w:num>
+  <w:num w:numId="12" w16cid:durableId="76487736">
+    <w:abstractNumId w:val="17"/>
+  </w:num>
+  <w:num w:numId="13" w16cid:durableId="894051689">
+    <w:abstractNumId w:val="12"/>
+  </w:num>
+  <w:num w:numId="14" w16cid:durableId="448667009">
+    <w:abstractNumId w:val="20"/>
+  </w:num>
+  <w:num w:numId="15" w16cid:durableId="1590699676">
+    <w:abstractNumId w:val="5"/>
+  </w:num>
+  <w:num w:numId="16" w16cid:durableId="1213886352">
+    <w:abstractNumId w:val="16"/>
+  </w:num>
+  <w:num w:numId="17" w16cid:durableId="1339426570">
     <w:abstractNumId w:val="26"/>
   </w:num>
-  <w:num w:numId="4" w16cid:durableId="21565032">
-    <w:abstractNumId w:val="20"/>
-  </w:num>
-  <w:num w:numId="5" w16cid:durableId="881096725">
-    <w:abstractNumId w:val="17"/>
-  </w:num>
-  <w:num w:numId="6" w16cid:durableId="225921922">
-    <w:abstractNumId w:val="9"/>
-  </w:num>
-  <w:num w:numId="7" w16cid:durableId="1940021731">
-    <w:abstractNumId w:val="2"/>
-  </w:num>
-  <w:num w:numId="8" w16cid:durableId="366369746">
-    <w:abstractNumId w:val="21"/>
-  </w:num>
-  <w:num w:numId="9" w16cid:durableId="37635549">
-    <w:abstractNumId w:val="11"/>
-  </w:num>
-  <w:num w:numId="10" w16cid:durableId="369964320">
-    <w:abstractNumId w:val="13"/>
-  </w:num>
-  <w:num w:numId="11" w16cid:durableId="401368912">
-    <w:abstractNumId w:val="5"/>
-  </w:num>
-  <w:num w:numId="12" w16cid:durableId="76487736">
-    <w:abstractNumId w:val="15"/>
-  </w:num>
-  <w:num w:numId="13" w16cid:durableId="894051689">
-    <w:abstractNumId w:val="10"/>
-  </w:num>
-  <w:num w:numId="14" w16cid:durableId="448667009">
-    <w:abstractNumId w:val="18"/>
-  </w:num>
-  <w:num w:numId="15" w16cid:durableId="1590699676">
-    <w:abstractNumId w:val="4"/>
-  </w:num>
-  <w:num w:numId="16" w16cid:durableId="1213886352">
-    <w:abstractNumId w:val="14"/>
-  </w:num>
-  <w:num w:numId="17" w16cid:durableId="1339426570">
-    <w:abstractNumId w:val="24"/>
-  </w:num>
   <w:num w:numId="18" w16cid:durableId="1906064032">
-    <w:abstractNumId w:val="25"/>
+    <w:abstractNumId w:val="27"/>
   </w:num>
   <w:num w:numId="19" w16cid:durableId="1627277160">
     <w:abstractNumId w:val="1"/>
   </w:num>
   <w:num w:numId="20" w16cid:durableId="1980188569">
-    <w:abstractNumId w:val="6"/>
+    <w:abstractNumId w:val="8"/>
   </w:num>
   <w:num w:numId="21" w16cid:durableId="976837251">
-    <w:abstractNumId w:val="7"/>
+    <w:abstractNumId w:val="9"/>
   </w:num>
   <w:num w:numId="22" w16cid:durableId="1034303419">
-    <w:abstractNumId w:val="8"/>
+    <w:abstractNumId w:val="10"/>
   </w:num>
   <w:num w:numId="23" w16cid:durableId="1837769685">
-    <w:abstractNumId w:val="3"/>
+    <w:abstractNumId w:val="4"/>
   </w:num>
   <w:num w:numId="24" w16cid:durableId="795955453">
-    <w:abstractNumId w:val="22"/>
+    <w:abstractNumId w:val="24"/>
   </w:num>
   <w:num w:numId="25" w16cid:durableId="724987936">
-    <w:abstractNumId w:val="19"/>
+    <w:abstractNumId w:val="21"/>
   </w:num>
   <w:num w:numId="26" w16cid:durableId="248319827">
-    <w:abstractNumId w:val="16"/>
+    <w:abstractNumId w:val="18"/>
   </w:num>
   <w:num w:numId="27" w16cid:durableId="1859540817">
-    <w:abstractNumId w:val="12"/>
+    <w:abstractNumId w:val="14"/>
+  </w:num>
+  <w:num w:numId="28" w16cid:durableId="1029798795">
+    <w:abstractNumId w:val="2"/>
+  </w:num>
+  <w:num w:numId="29" w16cid:durableId="1353260404">
+    <w:abstractNumId w:val="7"/>
   </w:num>
 </w:numbering>
 </file>
@@ -7223,6 +7803,34 @@
     <w:basedOn w:val="Fuentedeprrafopredeter"/>
     <w:rsid w:val="00D82C0C"/>
   </w:style>
+  <w:style w:type="character" w:styleId="CdigoHTML">
+    <w:name w:val="HTML Code"/>
+    <w:basedOn w:val="Fuentedeprrafopredeter"/>
+    <w:uiPriority w:val="99"/>
+    <w:semiHidden/>
+    <w:unhideWhenUsed/>
+    <w:rsid w:val="00334370"/>
+    <w:rPr>
+      <w:rFonts w:ascii="Courier New" w:eastAsia="Times New Roman" w:hAnsi="Courier New" w:cs="Courier New"/>
+      <w:sz w:val="20"/>
+      <w:szCs w:val="20"/>
+    </w:rPr>
+  </w:style>
+  <w:style w:type="paragraph" w:customStyle="1" w:styleId="query-text-line">
+    <w:name w:val="query-text-line"/>
+    <w:basedOn w:val="Normal"/>
+    <w:rsid w:val="00195000"/>
+    <w:pPr>
+      <w:spacing w:before="100" w:beforeAutospacing="1" w:after="100" w:afterAutospacing="1" w:line="240" w:lineRule="auto"/>
+    </w:pPr>
+    <w:rPr>
+      <w:rFonts w:ascii="Times New Roman" w:eastAsia="Times New Roman" w:hAnsi="Times New Roman" w:cs="Times New Roman"/>
+      <w:kern w:val="0"/>
+      <w:szCs w:val="24"/>
+      <w:lang w:eastAsia="es-ES"/>
+      <w14:ligatures w14:val="none"/>
+    </w:rPr>
+  </w:style>
 </w:styles>
 </file>
 

</xml_diff>

<commit_message>
Excel modificado para las pruebas
</commit_message>
<xml_diff>
--- a/InformeProyecto_MarioGonzalezDeLaIglesia/InformeProyecto_MarioGonzálezDeLaIglesia.docx
+++ b/InformeProyecto_MarioGonzalezDeLaIglesia/InformeProyecto_MarioGonzálezDeLaIglesia.docx
@@ -261,16 +261,45 @@
                 <w:szCs w:val="32"/>
               </w:rPr>
             </w:pPr>
-            <w:r>
-              <w:rPr>
-                <w:b/>
-                <w:bCs/>
-                <w:sz w:val="32"/>
-                <w:szCs w:val="32"/>
-                <w:highlight w:val="yellow"/>
-              </w:rPr>
-              <w:t>ENLACE AL BLOG</w:t>
-            </w:r>
+            <w:hyperlink r:id="rId9" w:history="1">
+              <w:proofErr w:type="spellStart"/>
+              <w:r>
+                <w:rPr>
+                  <w:rStyle w:val="Hipervnculo"/>
+                  <w:b/>
+                  <w:bCs/>
+                  <w:sz w:val="32"/>
+                  <w:szCs w:val="32"/>
+                  <w:highlight w:val="yellow"/>
+                </w:rPr>
+                <w:t>Sys</w:t>
+              </w:r>
+              <w:proofErr w:type="spellEnd"/>
+              <w:r>
+                <w:rPr>
+                  <w:rStyle w:val="Hipervnculo"/>
+                  <w:b/>
+                  <w:bCs/>
+                  <w:sz w:val="32"/>
+                  <w:szCs w:val="32"/>
+                  <w:highlight w:val="yellow"/>
+                </w:rPr>
+                <w:t>-Mario/</w:t>
+              </w:r>
+              <w:proofErr w:type="spellStart"/>
+              <w:r>
+                <w:rPr>
+                  <w:rStyle w:val="Hipervnculo"/>
+                  <w:b/>
+                  <w:bCs/>
+                  <w:sz w:val="32"/>
+                  <w:szCs w:val="32"/>
+                  <w:highlight w:val="yellow"/>
+                </w:rPr>
+                <w:t>EclipseProyectoMaquinaVending</w:t>
+              </w:r>
+              <w:proofErr w:type="spellEnd"/>
+            </w:hyperlink>
           </w:p>
           <w:p>
             <w:pPr>
@@ -283,6 +312,32 @@
                 <w:szCs w:val="32"/>
               </w:rPr>
             </w:pPr>
+            <w:hyperlink r:id="rId10" w:history="1">
+              <w:proofErr w:type="spellStart"/>
+              <w:r>
+                <w:rPr>
+                  <w:rStyle w:val="Hipervnculo"/>
+                  <w:b/>
+                  <w:bCs/>
+                  <w:sz w:val="32"/>
+                  <w:szCs w:val="32"/>
+                  <w:highlight w:val="yellow"/>
+                </w:rPr>
+                <w:t>Sys</w:t>
+              </w:r>
+              <w:proofErr w:type="spellEnd"/>
+              <w:r>
+                <w:rPr>
+                  <w:rStyle w:val="Hipervnculo"/>
+                  <w:b/>
+                  <w:bCs/>
+                  <w:sz w:val="32"/>
+                  <w:szCs w:val="32"/>
+                  <w:highlight w:val="yellow"/>
+                </w:rPr>
+                <w:t>-Mario/UT-p2-Maquina-Vending</w:t>
+              </w:r>
+            </w:hyperlink>
           </w:p>
         </w:tc>
       </w:tr>
@@ -458,8 +513,8 @@
           <w:bottom w:val="single" w:sz="6" w:space="1" w:color="auto"/>
         </w:pBdr>
         <w:sectPr>
-          <w:headerReference w:type="default" r:id="rId9"/>
-          <w:footerReference w:type="default" r:id="rId10"/>
+          <w:headerReference w:type="default" r:id="rId11"/>
+          <w:footerReference w:type="default" r:id="rId12"/>
           <w:pgSz w:w="11906" w:h="16838"/>
           <w:pgMar w:top="1134" w:right="1701" w:bottom="1276" w:left="1701" w:header="708" w:footer="708" w:gutter="0"/>
           <w:cols w:space="708"/>
@@ -532,15 +587,14 @@
           <w:pPr>
             <w:pStyle w:val="TDC1"/>
             <w:tabs>
-              <w:tab w:val="left" w:pos="440"/>
+              <w:tab w:val="left" w:pos="480"/>
               <w:tab w:val="right" w:leader="dot" w:pos="9062"/>
             </w:tabs>
             <w:rPr>
               <w:rFonts w:eastAsiaTheme="minorEastAsia"/>
               <w:noProof/>
-              <w:kern w:val="0"/>
+              <w:szCs w:val="24"/>
               <w:lang w:eastAsia="es-ES"/>
-              <w14:ligatures w14:val="none"/>
             </w:rPr>
           </w:pPr>
           <w:r>
@@ -552,7 +606,7 @@
           <w:r>
             <w:fldChar w:fldCharType="separate"/>
           </w:r>
-          <w:hyperlink w:anchor="_Toc224033568" w:history="1">
+          <w:hyperlink w:anchor="_Toc229395722" w:history="1">
             <w:r>
               <w:rPr>
                 <w:rStyle w:val="Hipervnculo"/>
@@ -564,9 +618,8 @@
               <w:rPr>
                 <w:rFonts w:eastAsiaTheme="minorEastAsia"/>
                 <w:noProof/>
-                <w:kern w:val="0"/>
+                <w:szCs w:val="24"/>
                 <w:lang w:eastAsia="es-ES"/>
-                <w14:ligatures w14:val="none"/>
               </w:rPr>
               <w:tab/>
             </w:r>
@@ -596,7 +649,7 @@
                 <w:noProof/>
                 <w:webHidden/>
               </w:rPr>
-              <w:instrText xml:space="preserve"> PAGEREF _Toc224033568 \h </w:instrText>
+              <w:instrText xml:space="preserve"> PAGEREF _Toc229395722 \h </w:instrText>
             </w:r>
             <w:r>
               <w:rPr>
@@ -631,18 +684,17 @@
           <w:pPr>
             <w:pStyle w:val="TDC1"/>
             <w:tabs>
-              <w:tab w:val="left" w:pos="440"/>
+              <w:tab w:val="left" w:pos="480"/>
               <w:tab w:val="right" w:leader="dot" w:pos="9062"/>
             </w:tabs>
             <w:rPr>
               <w:rFonts w:eastAsiaTheme="minorEastAsia"/>
               <w:noProof/>
-              <w:kern w:val="0"/>
+              <w:szCs w:val="24"/>
               <w:lang w:eastAsia="es-ES"/>
-              <w14:ligatures w14:val="none"/>
             </w:rPr>
           </w:pPr>
-          <w:hyperlink w:anchor="_Toc224033569" w:history="1">
+          <w:hyperlink w:anchor="_Toc229395723" w:history="1">
             <w:r>
               <w:rPr>
                 <w:rStyle w:val="Hipervnculo"/>
@@ -654,9 +706,8 @@
               <w:rPr>
                 <w:rFonts w:eastAsiaTheme="minorEastAsia"/>
                 <w:noProof/>
-                <w:kern w:val="0"/>
+                <w:szCs w:val="24"/>
                 <w:lang w:eastAsia="es-ES"/>
-                <w14:ligatures w14:val="none"/>
               </w:rPr>
               <w:tab/>
             </w:r>
@@ -686,7 +737,7 @@
                 <w:noProof/>
                 <w:webHidden/>
               </w:rPr>
-              <w:instrText xml:space="preserve"> PAGEREF _Toc224033569 \h </w:instrText>
+              <w:instrText xml:space="preserve"> PAGEREF _Toc229395723 \h </w:instrText>
             </w:r>
             <w:r>
               <w:rPr>
@@ -721,18 +772,17 @@
           <w:pPr>
             <w:pStyle w:val="TDC1"/>
             <w:tabs>
-              <w:tab w:val="left" w:pos="440"/>
+              <w:tab w:val="left" w:pos="480"/>
               <w:tab w:val="right" w:leader="dot" w:pos="9062"/>
             </w:tabs>
             <w:rPr>
               <w:rFonts w:eastAsiaTheme="minorEastAsia"/>
               <w:noProof/>
-              <w:kern w:val="0"/>
+              <w:szCs w:val="24"/>
               <w:lang w:eastAsia="es-ES"/>
-              <w14:ligatures w14:val="none"/>
             </w:rPr>
           </w:pPr>
-          <w:hyperlink w:anchor="_Toc224033570" w:history="1">
+          <w:hyperlink w:anchor="_Toc229395724" w:history="1">
             <w:r>
               <w:rPr>
                 <w:rStyle w:val="Hipervnculo"/>
@@ -744,9 +794,8 @@
               <w:rPr>
                 <w:rFonts w:eastAsiaTheme="minorEastAsia"/>
                 <w:noProof/>
-                <w:kern w:val="0"/>
+                <w:szCs w:val="24"/>
                 <w:lang w:eastAsia="es-ES"/>
-                <w14:ligatures w14:val="none"/>
               </w:rPr>
               <w:tab/>
             </w:r>
@@ -776,7 +825,7 @@
                 <w:noProof/>
                 <w:webHidden/>
               </w:rPr>
-              <w:instrText xml:space="preserve"> PAGEREF _Toc224033570 \h </w:instrText>
+              <w:instrText xml:space="preserve"> PAGEREF _Toc229395724 \h </w:instrText>
             </w:r>
             <w:r>
               <w:rPr>
@@ -816,12 +865,11 @@
             <w:rPr>
               <w:rFonts w:eastAsiaTheme="minorEastAsia"/>
               <w:noProof/>
-              <w:kern w:val="0"/>
+              <w:szCs w:val="24"/>
               <w:lang w:eastAsia="es-ES"/>
-              <w14:ligatures w14:val="none"/>
             </w:rPr>
           </w:pPr>
-          <w:hyperlink w:anchor="_Toc224033571" w:history="1">
+          <w:hyperlink w:anchor="_Toc229395725" w:history="1">
             <w:r>
               <w:rPr>
                 <w:rStyle w:val="Hipervnculo"/>
@@ -848,7 +896,7 @@
                 <w:noProof/>
                 <w:webHidden/>
               </w:rPr>
-              <w:instrText xml:space="preserve"> PAGEREF _Toc224033571 \h </w:instrText>
+              <w:instrText xml:space="preserve"> PAGEREF _Toc229395725 \h </w:instrText>
             </w:r>
             <w:r>
               <w:rPr>
@@ -888,12 +936,11 @@
             <w:rPr>
               <w:rFonts w:eastAsiaTheme="minorEastAsia"/>
               <w:noProof/>
-              <w:kern w:val="0"/>
+              <w:szCs w:val="24"/>
               <w:lang w:eastAsia="es-ES"/>
-              <w14:ligatures w14:val="none"/>
             </w:rPr>
           </w:pPr>
-          <w:hyperlink w:anchor="_Toc224033572" w:history="1">
+          <w:hyperlink w:anchor="_Toc229395726" w:history="1">
             <w:r>
               <w:rPr>
                 <w:rStyle w:val="Hipervnculo"/>
@@ -920,7 +967,7 @@
                 <w:noProof/>
                 <w:webHidden/>
               </w:rPr>
-              <w:instrText xml:space="preserve"> PAGEREF _Toc224033572 \h </w:instrText>
+              <w:instrText xml:space="preserve"> PAGEREF _Toc229395726 \h </w:instrText>
             </w:r>
             <w:r>
               <w:rPr>
@@ -940,7 +987,7 @@
                 <w:noProof/>
                 <w:webHidden/>
               </w:rPr>
-              <w:t>5</w:t>
+              <w:t>6</w:t>
             </w:r>
             <w:r>
               <w:rPr>
@@ -955,18 +1002,17 @@
           <w:pPr>
             <w:pStyle w:val="TDC1"/>
             <w:tabs>
-              <w:tab w:val="left" w:pos="440"/>
+              <w:tab w:val="left" w:pos="480"/>
               <w:tab w:val="right" w:leader="dot" w:pos="9062"/>
             </w:tabs>
             <w:rPr>
               <w:rFonts w:eastAsiaTheme="minorEastAsia"/>
               <w:noProof/>
-              <w:kern w:val="0"/>
+              <w:szCs w:val="24"/>
               <w:lang w:eastAsia="es-ES"/>
-              <w14:ligatures w14:val="none"/>
             </w:rPr>
           </w:pPr>
-          <w:hyperlink w:anchor="_Toc224033573" w:history="1">
+          <w:hyperlink w:anchor="_Toc229395727" w:history="1">
             <w:r>
               <w:rPr>
                 <w:rStyle w:val="Hipervnculo"/>
@@ -978,9 +1024,8 @@
               <w:rPr>
                 <w:rFonts w:eastAsiaTheme="minorEastAsia"/>
                 <w:noProof/>
-                <w:kern w:val="0"/>
+                <w:szCs w:val="24"/>
                 <w:lang w:eastAsia="es-ES"/>
-                <w14:ligatures w14:val="none"/>
               </w:rPr>
               <w:tab/>
             </w:r>
@@ -1010,7 +1055,7 @@
                 <w:noProof/>
                 <w:webHidden/>
               </w:rPr>
-              <w:instrText xml:space="preserve"> PAGEREF _Toc224033573 \h </w:instrText>
+              <w:instrText xml:space="preserve"> PAGEREF _Toc229395727 \h </w:instrText>
             </w:r>
             <w:r>
               <w:rPr>
@@ -1045,18 +1090,17 @@
           <w:pPr>
             <w:pStyle w:val="TDC1"/>
             <w:tabs>
-              <w:tab w:val="left" w:pos="440"/>
+              <w:tab w:val="left" w:pos="480"/>
               <w:tab w:val="right" w:leader="dot" w:pos="9062"/>
             </w:tabs>
             <w:rPr>
               <w:rFonts w:eastAsiaTheme="minorEastAsia"/>
               <w:noProof/>
-              <w:kern w:val="0"/>
+              <w:szCs w:val="24"/>
               <w:lang w:eastAsia="es-ES"/>
-              <w14:ligatures w14:val="none"/>
             </w:rPr>
           </w:pPr>
-          <w:hyperlink w:anchor="_Toc224033574" w:history="1">
+          <w:hyperlink w:anchor="_Toc229395728" w:history="1">
             <w:r>
               <w:rPr>
                 <w:rStyle w:val="Hipervnculo"/>
@@ -1068,9 +1112,8 @@
               <w:rPr>
                 <w:rFonts w:eastAsiaTheme="minorEastAsia"/>
                 <w:noProof/>
-                <w:kern w:val="0"/>
+                <w:szCs w:val="24"/>
                 <w:lang w:eastAsia="es-ES"/>
-                <w14:ligatures w14:val="none"/>
               </w:rPr>
               <w:tab/>
             </w:r>
@@ -1100,7 +1143,7 @@
                 <w:noProof/>
                 <w:webHidden/>
               </w:rPr>
-              <w:instrText xml:space="preserve"> PAGEREF _Toc224033574 \h </w:instrText>
+              <w:instrText xml:space="preserve"> PAGEREF _Toc229395728 \h </w:instrText>
             </w:r>
             <w:r>
               <w:rPr>
@@ -1135,18 +1178,17 @@
           <w:pPr>
             <w:pStyle w:val="TDC1"/>
             <w:tabs>
-              <w:tab w:val="left" w:pos="440"/>
+              <w:tab w:val="left" w:pos="480"/>
               <w:tab w:val="right" w:leader="dot" w:pos="9062"/>
             </w:tabs>
             <w:rPr>
               <w:rFonts w:eastAsiaTheme="minorEastAsia"/>
               <w:noProof/>
-              <w:kern w:val="0"/>
+              <w:szCs w:val="24"/>
               <w:lang w:eastAsia="es-ES"/>
-              <w14:ligatures w14:val="none"/>
             </w:rPr>
           </w:pPr>
-          <w:hyperlink w:anchor="_Toc224033575" w:history="1">
+          <w:hyperlink w:anchor="_Toc229395729" w:history="1">
             <w:r>
               <w:rPr>
                 <w:rStyle w:val="Hipervnculo"/>
@@ -1158,9 +1200,8 @@
               <w:rPr>
                 <w:rFonts w:eastAsiaTheme="minorEastAsia"/>
                 <w:noProof/>
-                <w:kern w:val="0"/>
+                <w:szCs w:val="24"/>
                 <w:lang w:eastAsia="es-ES"/>
-                <w14:ligatures w14:val="none"/>
               </w:rPr>
               <w:tab/>
             </w:r>
@@ -1190,7 +1231,7 @@
                 <w:noProof/>
                 <w:webHidden/>
               </w:rPr>
-              <w:instrText xml:space="preserve"> PAGEREF _Toc224033575 \h </w:instrText>
+              <w:instrText xml:space="preserve"> PAGEREF _Toc229395729 \h </w:instrText>
             </w:r>
             <w:r>
               <w:rPr>
@@ -1211,178 +1252,6 @@
                 <w:webHidden/>
               </w:rPr>
               <w:t>12</w:t>
-            </w:r>
-            <w:r>
-              <w:rPr>
-                <w:noProof/>
-                <w:webHidden/>
-              </w:rPr>
-              <w:fldChar w:fldCharType="end"/>
-            </w:r>
-          </w:hyperlink>
-        </w:p>
-        <w:p>
-          <w:pPr>
-            <w:pStyle w:val="TDC1"/>
-            <w:tabs>
-              <w:tab w:val="left" w:pos="440"/>
-              <w:tab w:val="right" w:leader="dot" w:pos="9062"/>
-            </w:tabs>
-            <w:rPr>
-              <w:rFonts w:eastAsiaTheme="minorEastAsia"/>
-              <w:noProof/>
-              <w:kern w:val="0"/>
-              <w:lang w:eastAsia="es-ES"/>
-              <w14:ligatures w14:val="none"/>
-            </w:rPr>
-          </w:pPr>
-          <w:hyperlink w:anchor="_Toc224033576" w:history="1">
-            <w:r>
-              <w:rPr>
-                <w:rStyle w:val="Hipervnculo"/>
-                <w:noProof/>
-              </w:rPr>
-              <w:t>7.</w:t>
-            </w:r>
-            <w:r>
-              <w:rPr>
-                <w:rFonts w:eastAsiaTheme="minorEastAsia"/>
-                <w:noProof/>
-                <w:kern w:val="0"/>
-                <w:lang w:eastAsia="es-ES"/>
-                <w14:ligatures w14:val="none"/>
-              </w:rPr>
-              <w:tab/>
-            </w:r>
-            <w:r>
-              <w:rPr>
-                <w:rStyle w:val="Hipervnculo"/>
-                <w:noProof/>
-              </w:rPr>
-              <w:t>EXPLOTACIÓN</w:t>
-            </w:r>
-            <w:r>
-              <w:rPr>
-                <w:noProof/>
-                <w:webHidden/>
-              </w:rPr>
-              <w:tab/>
-            </w:r>
-            <w:r>
-              <w:rPr>
-                <w:noProof/>
-                <w:webHidden/>
-              </w:rPr>
-              <w:fldChar w:fldCharType="begin"/>
-            </w:r>
-            <w:r>
-              <w:rPr>
-                <w:noProof/>
-                <w:webHidden/>
-              </w:rPr>
-              <w:instrText xml:space="preserve"> PAGEREF _Toc224033576 \h </w:instrText>
-            </w:r>
-            <w:r>
-              <w:rPr>
-                <w:noProof/>
-                <w:webHidden/>
-              </w:rPr>
-              <w:fldChar w:fldCharType="separate"/>
-            </w:r>
-            <w:r>
-              <w:rPr>
-                <w:b/>
-                <w:bCs/>
-                <w:noProof/>
-                <w:webHidden/>
-              </w:rPr>
-              <w:t>¡Error! Marcador no definido.</w:t>
-            </w:r>
-            <w:r>
-              <w:rPr>
-                <w:noProof/>
-                <w:webHidden/>
-              </w:rPr>
-              <w:fldChar w:fldCharType="end"/>
-            </w:r>
-          </w:hyperlink>
-        </w:p>
-        <w:p>
-          <w:pPr>
-            <w:pStyle w:val="TDC1"/>
-            <w:tabs>
-              <w:tab w:val="left" w:pos="440"/>
-              <w:tab w:val="right" w:leader="dot" w:pos="9062"/>
-            </w:tabs>
-            <w:rPr>
-              <w:rFonts w:eastAsiaTheme="minorEastAsia"/>
-              <w:noProof/>
-              <w:kern w:val="0"/>
-              <w:lang w:eastAsia="es-ES"/>
-              <w14:ligatures w14:val="none"/>
-            </w:rPr>
-          </w:pPr>
-          <w:hyperlink w:anchor="_Toc224033577" w:history="1">
-            <w:r>
-              <w:rPr>
-                <w:rStyle w:val="Hipervnculo"/>
-                <w:noProof/>
-              </w:rPr>
-              <w:t>8.</w:t>
-            </w:r>
-            <w:r>
-              <w:rPr>
-                <w:rFonts w:eastAsiaTheme="minorEastAsia"/>
-                <w:noProof/>
-                <w:kern w:val="0"/>
-                <w:lang w:eastAsia="es-ES"/>
-                <w14:ligatures w14:val="none"/>
-              </w:rPr>
-              <w:tab/>
-            </w:r>
-            <w:r>
-              <w:rPr>
-                <w:rStyle w:val="Hipervnculo"/>
-                <w:noProof/>
-              </w:rPr>
-              <w:t>MANTENIMIENTO</w:t>
-            </w:r>
-            <w:r>
-              <w:rPr>
-                <w:noProof/>
-                <w:webHidden/>
-              </w:rPr>
-              <w:tab/>
-            </w:r>
-            <w:r>
-              <w:rPr>
-                <w:noProof/>
-                <w:webHidden/>
-              </w:rPr>
-              <w:fldChar w:fldCharType="begin"/>
-            </w:r>
-            <w:r>
-              <w:rPr>
-                <w:noProof/>
-                <w:webHidden/>
-              </w:rPr>
-              <w:instrText xml:space="preserve"> PAGEREF _Toc224033577 \h </w:instrText>
-            </w:r>
-            <w:r>
-              <w:rPr>
-                <w:noProof/>
-                <w:webHidden/>
-              </w:rPr>
-              <w:fldChar w:fldCharType="separate"/>
-            </w:r>
-            <w:r>
-              <w:rPr>
-                <w:b/>
-                <w:bCs/>
-                <w:noProof/>
-                <w:webHidden/>
-              </w:rPr>
-              <w:t>¡Error! Marcador no definido.</w:t>
             </w:r>
             <w:r>
               <w:rPr>
@@ -1435,7 +1304,7 @@
         <w:spacing w:line="360" w:lineRule="auto"/>
         <w:ind w:left="426" w:hanging="426"/>
       </w:pPr>
-      <w:bookmarkStart w:id="0" w:name="_Toc224033568"/>
+      <w:bookmarkStart w:id="0" w:name="_Toc229395722"/>
       <w:r>
         <w:lastRenderedPageBreak/>
         <w:t>CONTROL DE VERSIONES</w:t>
@@ -1950,6 +1819,9 @@
             <w:pPr>
               <w:jc w:val="center"/>
             </w:pPr>
+            <w:r>
+              <w:t>1.4.1</w:t>
+            </w:r>
           </w:p>
         </w:tc>
         <w:tc>
@@ -1961,6 +1833,9 @@
             <w:pPr>
               <w:jc w:val="center"/>
             </w:pPr>
+            <w:r>
+              <w:t>Mario González</w:t>
+            </w:r>
           </w:p>
         </w:tc>
         <w:tc>
@@ -2198,7 +2073,7 @@
         <w:spacing w:line="360" w:lineRule="auto"/>
         <w:ind w:left="426" w:hanging="426"/>
       </w:pPr>
-      <w:bookmarkStart w:id="1" w:name="_Toc224033569"/>
+      <w:bookmarkStart w:id="1" w:name="_Toc229395723"/>
       <w:r>
         <w:lastRenderedPageBreak/>
         <w:t>INTRODUCCIÓN</w:t>
@@ -2272,7 +2147,7 @@
         <w:spacing w:line="360" w:lineRule="auto"/>
         <w:ind w:left="426" w:hanging="426"/>
       </w:pPr>
-      <w:bookmarkStart w:id="2" w:name="_Toc224033570"/>
+      <w:bookmarkStart w:id="2" w:name="_Toc229395724"/>
       <w:r>
         <w:lastRenderedPageBreak/>
         <w:t>FASE ANÁLISIS</w:t>
@@ -2295,7 +2170,7 @@
           <w:szCs w:val="28"/>
         </w:rPr>
       </w:pPr>
-      <w:bookmarkStart w:id="4" w:name="_Toc224033571"/>
+      <w:bookmarkStart w:id="4" w:name="_Toc229395725"/>
       <w:r>
         <w:rPr>
           <w:szCs w:val="28"/>
@@ -2477,7 +2352,6 @@
       <w:r>
         <w:t>Mostrar un informe detallado del estado de la caja que incluya la cantidad de monedas disponibles de cada tipo y la recaudación total por ventas.</w:t>
       </w:r>
-      <w:bookmarkStart w:id="5" w:name="_Toc224033572"/>
     </w:p>
     <w:p>
       <w:pPr>
@@ -2504,6 +2378,7 @@
           <w:szCs w:val="28"/>
         </w:rPr>
       </w:pPr>
+      <w:bookmarkStart w:id="5" w:name="_Toc229395726"/>
       <w:r>
         <w:rPr>
           <w:szCs w:val="28"/>
@@ -2607,14 +2482,73 @@
         <w:spacing w:line="360" w:lineRule="auto"/>
         <w:ind w:left="426" w:hanging="426"/>
       </w:pPr>
-      <w:bookmarkStart w:id="6" w:name="_Toc224033573"/>
-      <w:bookmarkStart w:id="7" w:name="_Hlk140680469"/>
-      <w:bookmarkStart w:id="8" w:name="_Hlk140681490"/>
+      <w:bookmarkStart w:id="6" w:name="_Hlk140680469"/>
+      <w:bookmarkStart w:id="7" w:name="_Hlk140681490"/>
+      <w:bookmarkStart w:id="8" w:name="_Toc229395727"/>
       <w:r>
         <w:lastRenderedPageBreak/>
+        <w:drawing>
+          <wp:anchor distT="0" distB="0" distL="114300" distR="114300" simplePos="0" relativeHeight="251658240" behindDoc="1" locked="0" layoutInCell="1" allowOverlap="1" wp14:anchorId="6F5C997C" wp14:editId="44728E6A">
+            <wp:simplePos x="0" y="0"/>
+            <wp:positionH relativeFrom="margin">
+              <wp:align>right</wp:align>
+            </wp:positionH>
+            <wp:positionV relativeFrom="paragraph">
+              <wp:posOffset>9525</wp:posOffset>
+            </wp:positionV>
+            <wp:extent cx="2674620" cy="4160520"/>
+            <wp:effectExtent l="0" t="0" r="0" b="0"/>
+            <wp:wrapTight wrapText="bothSides">
+              <wp:wrapPolygon edited="0">
+                <wp:start x="0" y="0"/>
+                <wp:lineTo x="0" y="21462"/>
+                <wp:lineTo x="21385" y="21462"/>
+                <wp:lineTo x="21385" y="0"/>
+                <wp:lineTo x="0" y="0"/>
+              </wp:wrapPolygon>
+            </wp:wrapTight>
+            <wp:docPr id="2115749815" name="Imagen 1"/>
+            <wp:cNvGraphicFramePr>
+              <a:graphicFrameLocks xmlns:a="http://schemas.openxmlformats.org/drawingml/2006/main" noChangeAspect="1"/>
+            </wp:cNvGraphicFramePr>
+            <a:graphic xmlns:a="http://schemas.openxmlformats.org/drawingml/2006/main">
+              <a:graphicData uri="http://schemas.openxmlformats.org/drawingml/2006/picture">
+                <pic:pic xmlns:pic="http://schemas.openxmlformats.org/drawingml/2006/picture">
+                  <pic:nvPicPr>
+                    <pic:cNvPr id="2115749815" name=""/>
+                    <pic:cNvPicPr/>
+                  </pic:nvPicPr>
+                  <pic:blipFill>
+                    <a:blip r:embed="rId13">
+                      <a:extLst>
+                        <a:ext uri="{28A0092B-C50C-407E-A947-70E740481C1C}">
+                          <a14:useLocalDpi xmlns:a14="http://schemas.microsoft.com/office/drawing/2010/main" val="0"/>
+                        </a:ext>
+                      </a:extLst>
+                    </a:blip>
+                    <a:stretch>
+                      <a:fillRect/>
+                    </a:stretch>
+                  </pic:blipFill>
+                  <pic:spPr>
+                    <a:xfrm>
+                      <a:off x="0" y="0"/>
+                      <a:ext cx="2674620" cy="4160520"/>
+                    </a:xfrm>
+                    <a:prstGeom prst="rect">
+                      <a:avLst/>
+                    </a:prstGeom>
+                  </pic:spPr>
+                </pic:pic>
+              </a:graphicData>
+            </a:graphic>
+          </wp:anchor>
+        </w:drawing>
+      </w:r>
+      <w:r>
         <w:t>FASE DISEÑO</w:t>
       </w:r>
-      <w:bookmarkEnd w:id="6"/>
+      <w:bookmarkEnd w:id="8"/>
     </w:p>
     <w:p>
       <w:pPr>
@@ -2646,6 +2580,12 @@
       <w:r>
         <w:t>que divide el funcionamiento de la máquina en dos entornos totalmente separados: una interfaz clara y sencilla para el cliente que solo desear llegar a comprar un producto, y un panel de control oculto destinado exclusivamente al administrador, para las tareas de gestión interna.</w:t>
       </w:r>
+      <w:r>
+        <w:rPr>
+          <w:noProof/>
+        </w:rPr>
+        <w:t xml:space="preserve"> </w:t>
+      </w:r>
     </w:p>
     <w:p>
       <w:pPr>
@@ -2739,7 +2679,11 @@
         <w:t>[RF8]</w:t>
       </w:r>
       <w:r>
-        <w:t xml:space="preserve"> protege al cliente devolviendo todo su dinero si este decide no comprar nada a última hora o si la máquina detecta que no tiene monedas suficientes para darle su cambio exacto de forma segura, aunque hay otros factores que pueden ocasionar esto.</w:t>
+        <w:t xml:space="preserve"> protege al cliente devolviendo todo su dinero si este decide no comprar nada a última hora o si la máquina </w:t>
+      </w:r>
+      <w:r>
+        <w:lastRenderedPageBreak/>
+        <w:t>detecta que no tiene monedas suficientes para darle su cambio exacto de forma segura, aunque hay otros factores que pueden ocasionar esto.</w:t>
       </w:r>
     </w:p>
     <w:p>
@@ -2775,11 +2719,7 @@
         <w:t>[RF10]</w:t>
       </w:r>
       <w:r>
-        <w:t xml:space="preserve"> para reponer los productos que se han ido vendiendo, teniendo siempre un tope de diez unidades para que el mecanismo no se </w:t>
-      </w:r>
-      <w:r>
-        <w:lastRenderedPageBreak/>
-        <w:t xml:space="preserve">atasque por el exceso de carga. Además, el </w:t>
+        <w:t xml:space="preserve"> para reponer los productos que se han ido vendiendo, teniendo siempre un tope de diez unidades para que el mecanismo no se atasque por el exceso de carga. Además, el </w:t>
       </w:r>
       <w:r>
         <w:rPr>
@@ -2805,6 +2745,65 @@
         <w:jc w:val="both"/>
       </w:pPr>
       <w:r>
+        <w:drawing>
+          <wp:anchor distT="0" distB="0" distL="114300" distR="114300" simplePos="0" relativeHeight="251659264" behindDoc="1" locked="0" layoutInCell="1" allowOverlap="1" wp14:anchorId="23E165DE" wp14:editId="20E77B28">
+            <wp:simplePos x="0" y="0"/>
+            <wp:positionH relativeFrom="margin">
+              <wp:align>right</wp:align>
+            </wp:positionH>
+            <wp:positionV relativeFrom="paragraph">
+              <wp:posOffset>6985</wp:posOffset>
+            </wp:positionV>
+            <wp:extent cx="2918460" cy="1463040"/>
+            <wp:effectExtent l="0" t="0" r="0" b="3810"/>
+            <wp:wrapTight wrapText="bothSides">
+              <wp:wrapPolygon edited="0">
+                <wp:start x="0" y="0"/>
+                <wp:lineTo x="0" y="21375"/>
+                <wp:lineTo x="21431" y="21375"/>
+                <wp:lineTo x="21431" y="0"/>
+                <wp:lineTo x="0" y="0"/>
+              </wp:wrapPolygon>
+            </wp:wrapTight>
+            <wp:docPr id="549902127" name="Imagen 1"/>
+            <wp:cNvGraphicFramePr>
+              <a:graphicFrameLocks xmlns:a="http://schemas.openxmlformats.org/drawingml/2006/main" noChangeAspect="1"/>
+            </wp:cNvGraphicFramePr>
+            <a:graphic xmlns:a="http://schemas.openxmlformats.org/drawingml/2006/main">
+              <a:graphicData uri="http://schemas.openxmlformats.org/drawingml/2006/picture">
+                <pic:pic xmlns:pic="http://schemas.openxmlformats.org/drawingml/2006/picture">
+                  <pic:nvPicPr>
+                    <pic:cNvPr id="549902127" name=""/>
+                    <pic:cNvPicPr/>
+                  </pic:nvPicPr>
+                  <pic:blipFill>
+                    <a:blip r:embed="rId14">
+                      <a:extLst>
+                        <a:ext uri="{28A0092B-C50C-407E-A947-70E740481C1C}">
+                          <a14:useLocalDpi xmlns:a14="http://schemas.microsoft.com/office/drawing/2010/main" val="0"/>
+                        </a:ext>
+                      </a:extLst>
+                    </a:blip>
+                    <a:stretch>
+                      <a:fillRect/>
+                    </a:stretch>
+                  </pic:blipFill>
+                  <pic:spPr>
+                    <a:xfrm>
+                      <a:off x="0" y="0"/>
+                      <a:ext cx="2918460" cy="1463040"/>
+                    </a:xfrm>
+                    <a:prstGeom prst="rect">
+                      <a:avLst/>
+                    </a:prstGeom>
+                  </pic:spPr>
+                </pic:pic>
+              </a:graphicData>
+            </a:graphic>
+          </wp:anchor>
+        </w:drawing>
+      </w:r>
+      <w:r>
         <w:t xml:space="preserve">Para llevar un control impecable de las ganancias, el </w:t>
       </w:r>
       <w:r>
@@ -2815,7 +2814,15 @@
         <w:t>[RF12]</w:t>
       </w:r>
       <w:r>
-        <w:t xml:space="preserve"> genera un informe de cuentas muy detallado. En este documento interno, el administrador puede ver exactamente cuántas monedas hay de cada valor y cuál es el total de dinero recaudado por todas las ventas realizadas hasta el momento. Finalmente, para que el sistema siga siendo seguro con el paso del tiempo, el </w:t>
+        <w:t xml:space="preserve"> genera un informe de cuentas muy detallado. En este documento interno, el administrador puede ver exactamente cuántas monedas hay de cada valor y cuál es el total de dinero recaudado por todas las ventas realizadas hasta el momento. </w:t>
+      </w:r>
+    </w:p>
+    <w:p>
+      <w:pPr>
+        <w:jc w:val="both"/>
+      </w:pPr>
+      <w:r>
+        <w:t xml:space="preserve">Finalmente, para que el sistema siga siendo seguro con el paso del tiempo, el </w:t>
       </w:r>
       <w:r>
         <w:rPr>
@@ -2826,6 +2833,12 @@
       </w:r>
       <w:r>
         <w:t xml:space="preserve"> permite que el responsable cambie su clave de acceso siempre que lo necesite, obligando a que la nueva contraseña cumpla con unas normas básicas de protección para que nadie pueda descifrarla fácilmente.</w:t>
+      </w:r>
+      <w:r>
+        <w:rPr>
+          <w:noProof/>
+        </w:rPr>
+        <w:t xml:space="preserve"> </w:t>
       </w:r>
     </w:p>
     <w:p>
@@ -2843,7 +2856,7 @@
         <w:spacing w:line="360" w:lineRule="auto"/>
         <w:ind w:left="426" w:hanging="426"/>
       </w:pPr>
-      <w:bookmarkStart w:id="9" w:name="_Toc224033574"/>
+      <w:bookmarkStart w:id="9" w:name="_Toc229395728"/>
       <w:r>
         <w:lastRenderedPageBreak/>
         <w:t>PROGRAMACIÓN</w:t>
@@ -2854,6 +2867,65 @@
       <w:pPr>
         <w:jc w:val="both"/>
       </w:pPr>
+      <w:r>
+        <w:drawing>
+          <wp:anchor distT="0" distB="0" distL="114300" distR="114300" simplePos="0" relativeHeight="251662336" behindDoc="1" locked="0" layoutInCell="1" allowOverlap="1" wp14:anchorId="1CE6F3E7" wp14:editId="78616935">
+            <wp:simplePos x="0" y="0"/>
+            <wp:positionH relativeFrom="margin">
+              <wp:posOffset>-635</wp:posOffset>
+            </wp:positionH>
+            <wp:positionV relativeFrom="paragraph">
+              <wp:posOffset>1021715</wp:posOffset>
+            </wp:positionV>
+            <wp:extent cx="2872740" cy="160020"/>
+            <wp:effectExtent l="0" t="0" r="3810" b="0"/>
+            <wp:wrapTight wrapText="bothSides">
+              <wp:wrapPolygon edited="0">
+                <wp:start x="0" y="0"/>
+                <wp:lineTo x="0" y="18000"/>
+                <wp:lineTo x="21485" y="18000"/>
+                <wp:lineTo x="21485" y="0"/>
+                <wp:lineTo x="0" y="0"/>
+              </wp:wrapPolygon>
+            </wp:wrapTight>
+            <wp:docPr id="1643601067" name="Imagen 1"/>
+            <wp:cNvGraphicFramePr>
+              <a:graphicFrameLocks xmlns:a="http://schemas.openxmlformats.org/drawingml/2006/main" noChangeAspect="1"/>
+            </wp:cNvGraphicFramePr>
+            <a:graphic xmlns:a="http://schemas.openxmlformats.org/drawingml/2006/main">
+              <a:graphicData uri="http://schemas.openxmlformats.org/drawingml/2006/picture">
+                <pic:pic xmlns:pic="http://schemas.openxmlformats.org/drawingml/2006/picture">
+                  <pic:nvPicPr>
+                    <pic:cNvPr id="1643601067" name=""/>
+                    <pic:cNvPicPr/>
+                  </pic:nvPicPr>
+                  <pic:blipFill>
+                    <a:blip r:embed="rId15">
+                      <a:extLst>
+                        <a:ext uri="{28A0092B-C50C-407E-A947-70E740481C1C}">
+                          <a14:useLocalDpi xmlns:a14="http://schemas.microsoft.com/office/drawing/2010/main" val="0"/>
+                        </a:ext>
+                      </a:extLst>
+                    </a:blip>
+                    <a:stretch>
+                      <a:fillRect/>
+                    </a:stretch>
+                  </pic:blipFill>
+                  <pic:spPr>
+                    <a:xfrm>
+                      <a:off x="0" y="0"/>
+                      <a:ext cx="2872740" cy="160020"/>
+                    </a:xfrm>
+                    <a:prstGeom prst="rect">
+                      <a:avLst/>
+                    </a:prstGeom>
+                  </pic:spPr>
+                </pic:pic>
+              </a:graphicData>
+            </a:graphic>
+          </wp:anchor>
+        </w:drawing>
+      </w:r>
       <w:r>
         <w:t xml:space="preserve">El desarrollo comenzó con la creación de una sólida base de datos en memoria para el </w:t>
       </w:r>
@@ -2871,7 +2943,19 @@
         <w:t>implementación</w:t>
       </w:r>
       <w:r>
-        <w:t xml:space="preserve"> del método abstracto calcularPrecio, cada objeto adquiere la capacidad de procesar sus propias variables de </w:t>
+        <w:t xml:space="preserve"> del método </w:t>
+      </w:r>
+      <w:r>
+        <w:t xml:space="preserve">                     </w:t>
+      </w:r>
+      <w:r>
+        <w:t>,</w:t>
+      </w:r>
+      <w:r>
+        <w:t xml:space="preserve"> </w:t>
+      </w:r>
+      <w:r>
+        <w:t xml:space="preserve">cada objeto adquiere la capacidad de procesar sus propias variables de </w:t>
       </w:r>
       <w:r>
         <w:t xml:space="preserve">negocio – como el volumen, el contenido de azúcar o el tamaño definido en el enumerado TamanioSnacks – permitiendo que, al iniciar el sistema, la clase Stock genere un catálogo dinámico donde los precios reflejan con exactitud las propiedades de cada </w:t>
@@ -2916,6 +3000,65 @@
         <w:jc w:val="both"/>
       </w:pPr>
       <w:r>
+        <w:drawing>
+          <wp:anchor distT="0" distB="0" distL="114300" distR="114300" simplePos="0" relativeHeight="251660288" behindDoc="1" locked="0" layoutInCell="1" allowOverlap="1" wp14:anchorId="598D351E" wp14:editId="078719D1">
+            <wp:simplePos x="0" y="0"/>
+            <wp:positionH relativeFrom="margin">
+              <wp:align>center</wp:align>
+            </wp:positionH>
+            <wp:positionV relativeFrom="paragraph">
+              <wp:posOffset>2251710</wp:posOffset>
+            </wp:positionV>
+            <wp:extent cx="2903472" cy="861135"/>
+            <wp:effectExtent l="0" t="0" r="0" b="0"/>
+            <wp:wrapTight wrapText="bothSides">
+              <wp:wrapPolygon edited="0">
+                <wp:start x="0" y="0"/>
+                <wp:lineTo x="0" y="21027"/>
+                <wp:lineTo x="21402" y="21027"/>
+                <wp:lineTo x="21402" y="0"/>
+                <wp:lineTo x="0" y="0"/>
+              </wp:wrapPolygon>
+            </wp:wrapTight>
+            <wp:docPr id="1760361097" name="Imagen 1"/>
+            <wp:cNvGraphicFramePr>
+              <a:graphicFrameLocks xmlns:a="http://schemas.openxmlformats.org/drawingml/2006/main" noChangeAspect="1"/>
+            </wp:cNvGraphicFramePr>
+            <a:graphic xmlns:a="http://schemas.openxmlformats.org/drawingml/2006/main">
+              <a:graphicData uri="http://schemas.openxmlformats.org/drawingml/2006/picture">
+                <pic:pic xmlns:pic="http://schemas.openxmlformats.org/drawingml/2006/picture">
+                  <pic:nvPicPr>
+                    <pic:cNvPr id="1760361097" name=""/>
+                    <pic:cNvPicPr/>
+                  </pic:nvPicPr>
+                  <pic:blipFill>
+                    <a:blip r:embed="rId16">
+                      <a:extLst>
+                        <a:ext uri="{28A0092B-C50C-407E-A947-70E740481C1C}">
+                          <a14:useLocalDpi xmlns:a14="http://schemas.microsoft.com/office/drawing/2010/main" val="0"/>
+                        </a:ext>
+                      </a:extLst>
+                    </a:blip>
+                    <a:stretch>
+                      <a:fillRect/>
+                    </a:stretch>
+                  </pic:blipFill>
+                  <pic:spPr>
+                    <a:xfrm>
+                      <a:off x="0" y="0"/>
+                      <a:ext cx="2903472" cy="861135"/>
+                    </a:xfrm>
+                    <a:prstGeom prst="rect">
+                      <a:avLst/>
+                    </a:prstGeom>
+                  </pic:spPr>
+                </pic:pic>
+              </a:graphicData>
+            </a:graphic>
+          </wp:anchor>
+        </w:drawing>
+      </w:r>
+      <w:r>
         <w:t xml:space="preserve">La gestión del flujo monetario y las validaciones de seguridad para los </w:t>
       </w:r>
       <w:r>
@@ -2979,8 +3122,72 @@
       <w:pPr>
         <w:jc w:val="both"/>
       </w:pPr>
+    </w:p>
+    <w:p>
+      <w:pPr>
+        <w:jc w:val="both"/>
+      </w:pPr>
       <w:r>
         <w:lastRenderedPageBreak/>
+        <w:drawing>
+          <wp:anchor distT="0" distB="0" distL="114300" distR="114300" simplePos="0" relativeHeight="251661312" behindDoc="1" locked="0" layoutInCell="1" allowOverlap="1" wp14:anchorId="5890FFA8" wp14:editId="4C57A412">
+            <wp:simplePos x="0" y="0"/>
+            <wp:positionH relativeFrom="margin">
+              <wp:posOffset>2630170</wp:posOffset>
+            </wp:positionH>
+            <wp:positionV relativeFrom="paragraph">
+              <wp:posOffset>860425</wp:posOffset>
+            </wp:positionV>
+            <wp:extent cx="3329940" cy="1501140"/>
+            <wp:effectExtent l="0" t="0" r="3810" b="3810"/>
+            <wp:wrapTight wrapText="bothSides">
+              <wp:wrapPolygon edited="0">
+                <wp:start x="0" y="0"/>
+                <wp:lineTo x="0" y="21381"/>
+                <wp:lineTo x="21501" y="21381"/>
+                <wp:lineTo x="21501" y="0"/>
+                <wp:lineTo x="0" y="0"/>
+              </wp:wrapPolygon>
+            </wp:wrapTight>
+            <wp:docPr id="517577151" name="Imagen 1"/>
+            <wp:cNvGraphicFramePr>
+              <a:graphicFrameLocks xmlns:a="http://schemas.openxmlformats.org/drawingml/2006/main" noChangeAspect="1"/>
+            </wp:cNvGraphicFramePr>
+            <a:graphic xmlns:a="http://schemas.openxmlformats.org/drawingml/2006/main">
+              <a:graphicData uri="http://schemas.openxmlformats.org/drawingml/2006/picture">
+                <pic:pic xmlns:pic="http://schemas.openxmlformats.org/drawingml/2006/picture">
+                  <pic:nvPicPr>
+                    <pic:cNvPr id="517577151" name=""/>
+                    <pic:cNvPicPr/>
+                  </pic:nvPicPr>
+                  <pic:blipFill>
+                    <a:blip r:embed="rId17">
+                      <a:extLst>
+                        <a:ext uri="{28A0092B-C50C-407E-A947-70E740481C1C}">
+                          <a14:useLocalDpi xmlns:a14="http://schemas.microsoft.com/office/drawing/2010/main" val="0"/>
+                        </a:ext>
+                      </a:extLst>
+                    </a:blip>
+                    <a:stretch>
+                      <a:fillRect/>
+                    </a:stretch>
+                  </pic:blipFill>
+                  <pic:spPr>
+                    <a:xfrm>
+                      <a:off x="0" y="0"/>
+                      <a:ext cx="3329940" cy="1501140"/>
+                    </a:xfrm>
+                    <a:prstGeom prst="rect">
+                      <a:avLst/>
+                    </a:prstGeom>
+                  </pic:spPr>
+                </pic:pic>
+              </a:graphicData>
+            </a:graphic>
+          </wp:anchor>
+        </w:drawing>
+      </w:r>
+      <w:r>
         <w:t xml:space="preserve">El núcleo de la lógica de negocio, correspondiente a la ejecución de la venta y la devolución de crédito sobrante </w:t>
       </w:r>
       <w:r>
@@ -3011,7 +3218,15 @@
         <w:t>[RF8]</w:t>
       </w:r>
       <w:r>
-        <w:t>, se resolvió mediante algoritmos de control de transacciones. El procedimiento de dispensación se diseñó para ser atómico, asegurando que la reducción del stock en la clase Ranuras y la actualización de la recaudación en la caja se realicen de forma coordinada. Para la devolución del cambio, se implementó un algoritmo ávido (</w:t>
+        <w:t xml:space="preserve">, se resolvió mediante algoritmos de control de transacciones. El procedimiento de dispensación se diseñó para ser atómico, asegurando que la reducción del stock en la clase Ranuras y la actualización de la recaudación en la caja se realicen de forma coordinada. </w:t>
+      </w:r>
+    </w:p>
+    <w:p>
+      <w:pPr>
+        <w:jc w:val="both"/>
+      </w:pPr>
+      <w:r>
+        <w:t>Para la devolución del cambio, se implementó un algoritmo ávido (</w:t>
       </w:r>
       <w:proofErr w:type="spellStart"/>
       <w:r>
@@ -3027,7 +3242,15 @@
       </w:r>
       <w:proofErr w:type="spellEnd"/>
       <w:r>
-        <w:t>, el cual prioriza las denominaciones de mayor valor para optimizar el inventario de monedas. Una característica distintiva de este diseño es la inclusión de una rutina de pre-verificacion de solvencia</w:t>
+        <w:t>, el cual prioriza las denominaciones de mayor valor para optimizar el inventario de monedas.</w:t>
+      </w:r>
+    </w:p>
+    <w:p>
+      <w:pPr>
+        <w:jc w:val="both"/>
+      </w:pPr>
+      <w:r>
+        <w:t>Una característica distintiva de este diseño es la inclusión de una rutina de pre-verificacion de solvencia</w:t>
       </w:r>
       <w:r>
         <w:t>, ya que el sistema simula el proceso de cambio antes de finalizar la transacción y, en cas de detectar una carencia de monedas físicas, activa un protocolo de cancelación que restituye el crédito íntegramente al usuario para cumplir con estándares de seguridad y fiabilidad.</w:t>
@@ -3088,15 +3311,7 @@
         <w:t>[RF10]</w:t>
       </w:r>
       <w:r>
-        <w:t xml:space="preserve"> se fundamenta en la clase Ranuras, la cual actúa como un contenedor inteligente. Para garantizar que no se sobrepase el límite físico de la máquina, se ha establecido una constante denominada MAX_PRODUCTOS con un valor de 10. La seguridad de este requisito se consigue mediante un método “setter” con lógica de guarda. Que actúa como filtro preventivo antes de realizar la asignación al atributo. Para facilitar la reposición, se implementó el método </w:t>
-      </w:r>
-      <w:proofErr w:type="gramStart"/>
-      <w:r>
-        <w:t>añadirCantidad(</w:t>
-      </w:r>
-      <w:proofErr w:type="gramEnd"/>
-      <w:r>
-        <w:t>int cantidad), el cual invoca internamente el “</w:t>
+        <w:t xml:space="preserve"> se fundamenta en la clase Ranuras, la cual actúa como un contenedor inteligente. Para garantizar que no se sobrepase el límite físico de la máquina, se ha establecido una constante denominada MAX_PRODUCTOS con un valor de 10. La seguridad de este requisito se consigue mediante un método “setter” con lógica de guarda. Que actúa como filtro preventivo antes de realizar la asignación al atributo. Para facilitar la reposición, se implementó el método añadirCantidad(int cantidad), el cual invoca internamente el “</w:t>
       </w:r>
       <w:r>
         <w:t>setter” mencionado</w:t>
@@ -3131,52 +3346,71 @@
         <w:t>inserción</w:t>
       </w:r>
       <w:r>
-        <w:t xml:space="preserve"> de nuevos productos se gestiona a través del método </w:t>
-      </w:r>
-      <w:proofErr w:type="gramStart"/>
-      <w:r>
-        <w:t>añadirProducto(</w:t>
-      </w:r>
-      <w:proofErr w:type="gramEnd"/>
-      <w:r>
-        <w:t>String código, Productos nuevoProducto, int cantidad)</w:t>
-      </w:r>
-      <w:r>
-        <w:t xml:space="preserve"> localizado en la clase Stock. El procedimiento técnico para lograr una inserción exitosa sigue una secuencia de validaciones en cascada. Por otro lado, la eliminación de productos consigue mediante el método </w:t>
-      </w:r>
-      <w:proofErr w:type="gramStart"/>
-      <w:r>
-        <w:t>eliminarProducto(</w:t>
-      </w:r>
-      <w:proofErr w:type="gramEnd"/>
-      <w:r>
-        <w:t xml:space="preserve">String código). El funcionamiento interno de este proceso es una operación de limpieza lógica y referencial, tras validar que el código de la ranura existe en el HashMap de la clase Stock, el sistema invoca el método </w:t>
-      </w:r>
-      <w:proofErr w:type="gramStart"/>
-      <w:r>
-        <w:t>vaciar(</w:t>
-      </w:r>
-      <w:proofErr w:type="gramEnd"/>
-      <w:r>
-        <w:t>) de la clase Ranuras.</w:t>
+        <w:t xml:space="preserve"> de nuevos productos se gestiona a través del método añadirProducto(String código, Productos nuevoProducto, int cantidad)</w:t>
+      </w:r>
+      <w:r>
+        <w:t xml:space="preserve"> localizado en la clase Stock. El procedimiento técnico para lograr una inserción exitosa sigue una secuencia de validaciones en cascada. Por otro lado, la eliminación de productos consigue mediante el método eliminarProducto(String código). El funcionamiento interno de este proceso es una </w:t>
+      </w:r>
+      <w:r>
+        <w:lastRenderedPageBreak/>
+        <w:t>operación de limpieza lógica y referencial, tras validar que el código de la ranura existe en el HashMap de la clase Stock, el sistema invoca el método vaciar() de la clase Ranuras.</w:t>
       </w:r>
     </w:p>
     <w:p>
       <w:pPr>
         <w:jc w:val="both"/>
       </w:pPr>
+      <w:r>
+        <w:t>Método usado para añadir:</w:t>
+      </w:r>
     </w:p>
     <w:p>
       <w:pPr>
         <w:jc w:val="both"/>
       </w:pPr>
+      <w:r>
+        <w:drawing>
+          <wp:inline distT="0" distB="0" distL="0" distR="0" wp14:anchorId="4FBB2230" wp14:editId="591B6ECB">
+            <wp:extent cx="4663844" cy="2004234"/>
+            <wp:effectExtent l="0" t="0" r="3810" b="0"/>
+            <wp:docPr id="38028287" name="Imagen 1"/>
+            <wp:cNvGraphicFramePr>
+              <a:graphicFrameLocks xmlns:a="http://schemas.openxmlformats.org/drawingml/2006/main" noChangeAspect="1"/>
+            </wp:cNvGraphicFramePr>
+            <a:graphic xmlns:a="http://schemas.openxmlformats.org/drawingml/2006/main">
+              <a:graphicData uri="http://schemas.openxmlformats.org/drawingml/2006/picture">
+                <pic:pic xmlns:pic="http://schemas.openxmlformats.org/drawingml/2006/picture">
+                  <pic:nvPicPr>
+                    <pic:cNvPr id="38028287" name=""/>
+                    <pic:cNvPicPr/>
+                  </pic:nvPicPr>
+                  <pic:blipFill>
+                    <a:blip r:embed="rId18"/>
+                    <a:stretch>
+                      <a:fillRect/>
+                    </a:stretch>
+                  </pic:blipFill>
+                  <pic:spPr>
+                    <a:xfrm>
+                      <a:off x="0" y="0"/>
+                      <a:ext cx="4663844" cy="2004234"/>
+                    </a:xfrm>
+                    <a:prstGeom prst="rect">
+                      <a:avLst/>
+                    </a:prstGeom>
+                  </pic:spPr>
+                </pic:pic>
+              </a:graphicData>
+            </a:graphic>
+          </wp:inline>
+        </w:drawing>
+      </w:r>
     </w:p>
     <w:p>
       <w:pPr>
         <w:jc w:val="both"/>
       </w:pPr>
       <w:r>
-        <w:lastRenderedPageBreak/>
         <w:t xml:space="preserve">Para la rendición de </w:t>
       </w:r>
       <w:r>
@@ -3224,7 +3458,7 @@
         <w:spacing w:line="360" w:lineRule="auto"/>
         <w:ind w:left="426" w:hanging="426"/>
       </w:pPr>
-      <w:bookmarkStart w:id="10" w:name="_Toc224033575"/>
+      <w:bookmarkStart w:id="10" w:name="_Toc229395729"/>
       <w:r>
         <w:lastRenderedPageBreak/>
         <w:t>PRUEBAS</w:t>
@@ -3232,12 +3466,12 @@
       <w:bookmarkEnd w:id="10"/>
     </w:p>
     <w:bookmarkEnd w:id="3"/>
+    <w:bookmarkEnd w:id="6"/>
     <w:bookmarkEnd w:id="7"/>
-    <w:bookmarkEnd w:id="8"/>
     <w:p/>
     <w:sectPr>
-      <w:headerReference w:type="first" r:id="rId11"/>
-      <w:footerReference w:type="first" r:id="rId12"/>
+      <w:headerReference w:type="first" r:id="rId19"/>
+      <w:footerReference w:type="first" r:id="rId20"/>
       <w:pgSz w:w="11906" w:h="16838"/>
       <w:pgMar w:top="2155" w:right="1133" w:bottom="1701" w:left="1701" w:header="680" w:footer="454" w:gutter="0"/>
       <w:cols w:space="708"/>
@@ -7831,6 +8065,18 @@
       <w14:ligatures w14:val="none"/>
     </w:rPr>
   </w:style>
+  <w:style w:type="character" w:styleId="Mencinsinresolver">
+    <w:name w:val="Unresolved Mention"/>
+    <w:basedOn w:val="Fuentedeprrafopredeter"/>
+    <w:uiPriority w:val="99"/>
+    <w:semiHidden/>
+    <w:unhideWhenUsed/>
+    <w:rsid w:val="00FB4B1A"/>
+    <w:rPr>
+      <w:color w:val="605E5C"/>
+      <w:shd w:val="clear" w:color="auto" w:fill="E1DFDD"/>
+    </w:rPr>
+  </w:style>
 </w:styles>
 </file>
 

</xml_diff>

<commit_message>
inserccion de videos (Pruebas), y modificacion en archivos
</commit_message>
<xml_diff>
--- a/InformeProyecto_MarioGonzalezDeLaIglesia/InformeProyecto_MarioGonzálezDeLaIglesia.docx
+++ b/InformeProyecto_MarioGonzalezDeLaIglesia/InformeProyecto_MarioGonzálezDeLaIglesia.docx
@@ -39,6 +39,8 @@
                 <w:szCs w:val="60"/>
               </w:rPr>
             </w:pPr>
+            <w:bookmarkStart w:id="0" w:name="_top"/>
+            <w:bookmarkEnd w:id="0"/>
             <w:r>
               <w:rPr>
                 <w:b/>
@@ -296,7 +298,29 @@
                   <w:szCs w:val="32"/>
                   <w:highlight w:val="yellow"/>
                 </w:rPr>
-                <w:t>EclipseProyectoMaquinaVending</w:t>
+                <w:t>EclipseProyectoMa</w:t>
+              </w:r>
+              <w:r>
+                <w:rPr>
+                  <w:rStyle w:val="Hipervnculo"/>
+                  <w:b/>
+                  <w:bCs/>
+                  <w:sz w:val="32"/>
+                  <w:szCs w:val="32"/>
+                  <w:highlight w:val="yellow"/>
+                </w:rPr>
+                <w:t>q</w:t>
+              </w:r>
+              <w:r>
+                <w:rPr>
+                  <w:rStyle w:val="Hipervnculo"/>
+                  <w:b/>
+                  <w:bCs/>
+                  <w:sz w:val="32"/>
+                  <w:szCs w:val="32"/>
+                  <w:highlight w:val="yellow"/>
+                </w:rPr>
+                <w:t>uinaVending</w:t>
               </w:r>
               <w:proofErr w:type="spellEnd"/>
             </w:hyperlink>
@@ -335,7 +359,40 @@
                   <w:szCs w:val="32"/>
                   <w:highlight w:val="yellow"/>
                 </w:rPr>
-                <w:t>-Mario/UT-p2-Maquina-Vending</w:t>
+                <w:t>-Mario/UT-p2</w:t>
+              </w:r>
+              <w:r>
+                <w:rPr>
+                  <w:rStyle w:val="Hipervnculo"/>
+                  <w:b/>
+                  <w:bCs/>
+                  <w:sz w:val="32"/>
+                  <w:szCs w:val="32"/>
+                  <w:highlight w:val="yellow"/>
+                </w:rPr>
+                <w:t>-</w:t>
+              </w:r>
+              <w:r>
+                <w:rPr>
+                  <w:rStyle w:val="Hipervnculo"/>
+                  <w:b/>
+                  <w:bCs/>
+                  <w:sz w:val="32"/>
+                  <w:szCs w:val="32"/>
+                  <w:highlight w:val="yellow"/>
+                </w:rPr>
+                <w:t>M</w:t>
+              </w:r>
+              <w:r>
+                <w:rPr>
+                  <w:rStyle w:val="Hipervnculo"/>
+                  <w:b/>
+                  <w:bCs/>
+                  <w:sz w:val="32"/>
+                  <w:szCs w:val="32"/>
+                  <w:highlight w:val="yellow"/>
+                </w:rPr>
+                <w:t>aquina-Vending</w:t>
               </w:r>
             </w:hyperlink>
           </w:p>
@@ -1304,12 +1361,12 @@
         <w:spacing w:line="360" w:lineRule="auto"/>
         <w:ind w:left="426" w:hanging="426"/>
       </w:pPr>
-      <w:bookmarkStart w:id="0" w:name="_Toc229395722"/>
+      <w:bookmarkStart w:id="1" w:name="_Toc229395722"/>
       <w:r>
         <w:lastRenderedPageBreak/>
         <w:t>CONTROL DE VERSIONES</w:t>
       </w:r>
-      <w:bookmarkEnd w:id="0"/>
+      <w:bookmarkEnd w:id="1"/>
     </w:p>
     <w:tbl>
       <w:tblPr>
@@ -1820,7 +1877,10 @@
               <w:jc w:val="center"/>
             </w:pPr>
             <w:r>
-              <w:t>1.4.1</w:t>
+              <w:t>1.</w:t>
+            </w:r>
+            <w:r>
+              <w:t>5</w:t>
             </w:r>
           </w:p>
         </w:tc>
@@ -1847,6 +1907,12 @@
             <w:pPr>
               <w:jc w:val="center"/>
             </w:pPr>
+            <w:r>
+              <w:t>Añadidos últimos</w:t>
+            </w:r>
+            <w:r>
+              <w:t>.</w:t>
+            </w:r>
           </w:p>
         </w:tc>
         <w:tc>
@@ -1858,6 +1924,9 @@
             <w:pPr>
               <w:jc w:val="center"/>
             </w:pPr>
+            <w:r>
+              <w:t>12/05/2026</w:t>
+            </w:r>
           </w:p>
         </w:tc>
       </w:tr>
@@ -2073,12 +2142,12 @@
         <w:spacing w:line="360" w:lineRule="auto"/>
         <w:ind w:left="426" w:hanging="426"/>
       </w:pPr>
-      <w:bookmarkStart w:id="1" w:name="_Toc229395723"/>
+      <w:bookmarkStart w:id="2" w:name="_Toc229395723"/>
       <w:r>
         <w:lastRenderedPageBreak/>
         <w:t>INTRODUCCIÓN</w:t>
       </w:r>
-      <w:bookmarkEnd w:id="1"/>
+      <w:bookmarkEnd w:id="2"/>
     </w:p>
     <w:p>
       <w:pPr>
@@ -2147,13 +2216,13 @@
         <w:spacing w:line="360" w:lineRule="auto"/>
         <w:ind w:left="426" w:hanging="426"/>
       </w:pPr>
-      <w:bookmarkStart w:id="2" w:name="_Toc229395724"/>
+      <w:bookmarkStart w:id="3" w:name="_Toc229395724"/>
       <w:r>
         <w:lastRenderedPageBreak/>
         <w:t>FASE ANÁLISIS</w:t>
       </w:r>
-      <w:bookmarkStart w:id="3" w:name="_Hlk140679235"/>
-      <w:bookmarkEnd w:id="2"/>
+      <w:bookmarkStart w:id="4" w:name="_Hlk140679235"/>
+      <w:bookmarkEnd w:id="3"/>
     </w:p>
     <w:p>
       <w:pPr>
@@ -2170,14 +2239,14 @@
           <w:szCs w:val="28"/>
         </w:rPr>
       </w:pPr>
-      <w:bookmarkStart w:id="4" w:name="_Toc229395725"/>
+      <w:bookmarkStart w:id="5" w:name="_Toc229395725"/>
       <w:r>
         <w:rPr>
           <w:szCs w:val="28"/>
         </w:rPr>
         <w:t>Funcionales</w:t>
       </w:r>
-      <w:bookmarkEnd w:id="4"/>
+      <w:bookmarkEnd w:id="5"/>
     </w:p>
     <w:p>
       <w:pPr>
@@ -2373,20 +2442,83 @@
     </w:p>
     <w:p>
       <w:pPr>
+        <w:jc w:val="center"/>
+      </w:pPr>
+      <w:bookmarkStart w:id="6" w:name="_Toc229395726"/>
+      <w:r>
+        <w:rPr>
+          <w:noProof/>
+        </w:rPr>
+        <w:lastRenderedPageBreak/>
+        <w:drawing>
+          <wp:inline distT="0" distB="0" distL="0" distR="0" wp14:anchorId="706EE427" wp14:editId="11F1D7D7">
+            <wp:extent cx="4063117" cy="5375669"/>
+            <wp:effectExtent l="0" t="0" r="0" b="0"/>
+            <wp:docPr id="1251941477" name="Imagen 1"/>
+            <wp:cNvGraphicFramePr>
+              <a:graphicFrameLocks xmlns:a="http://schemas.openxmlformats.org/drawingml/2006/main" noChangeAspect="1"/>
+            </wp:cNvGraphicFramePr>
+            <a:graphic xmlns:a="http://schemas.openxmlformats.org/drawingml/2006/main">
+              <a:graphicData uri="http://schemas.openxmlformats.org/drawingml/2006/picture">
+                <pic:pic xmlns:pic="http://schemas.openxmlformats.org/drawingml/2006/picture">
+                  <pic:nvPicPr>
+                    <pic:cNvPr id="0" name="Picture 1"/>
+                    <pic:cNvPicPr>
+                      <a:picLocks noChangeAspect="1" noChangeArrowheads="1"/>
+                    </pic:cNvPicPr>
+                  </pic:nvPicPr>
+                  <pic:blipFill rotWithShape="1">
+                    <a:blip r:embed="rId13">
+                      <a:extLst>
+                        <a:ext uri="{28A0092B-C50C-407E-A947-70E740481C1C}">
+                          <a14:useLocalDpi xmlns:a14="http://schemas.microsoft.com/office/drawing/2010/main" val="0"/>
+                        </a:ext>
+                      </a:extLst>
+                    </a:blip>
+                    <a:srcRect l="2060" t="1893" r="1594" b="2227"/>
+                    <a:stretch>
+                      <a:fillRect/>
+                    </a:stretch>
+                  </pic:blipFill>
+                  <pic:spPr bwMode="auto">
+                    <a:xfrm>
+                      <a:off x="0" y="0"/>
+                      <a:ext cx="4100001" cy="5424467"/>
+                    </a:xfrm>
+                    <a:prstGeom prst="rect">
+                      <a:avLst/>
+                    </a:prstGeom>
+                    <a:noFill/>
+                    <a:ln>
+                      <a:noFill/>
+                    </a:ln>
+                    <a:extLst>
+                      <a:ext uri="{53640926-AAD7-44D8-BBD7-CCE9431645EC}">
+                        <a14:shadowObscured xmlns:a14="http://schemas.microsoft.com/office/drawing/2010/main"/>
+                      </a:ext>
+                    </a:extLst>
+                  </pic:spPr>
+                </pic:pic>
+              </a:graphicData>
+            </a:graphic>
+          </wp:inline>
+        </w:drawing>
+      </w:r>
+    </w:p>
+    <w:p>
+      <w:pPr>
         <w:pStyle w:val="Ttulo2"/>
         <w:rPr>
           <w:szCs w:val="28"/>
         </w:rPr>
       </w:pPr>
-      <w:bookmarkStart w:id="5" w:name="_Toc229395726"/>
       <w:r>
         <w:rPr>
           <w:szCs w:val="28"/>
         </w:rPr>
-        <w:lastRenderedPageBreak/>
         <w:t>No funcionales</w:t>
       </w:r>
-      <w:bookmarkEnd w:id="5"/>
+      <w:bookmarkEnd w:id="6"/>
     </w:p>
     <w:p>
       <w:pPr>
@@ -2458,18 +2590,6 @@
       </w:pPr>
       <w:r>
         <w:t>Implementar un protocolo de seguridad que restrinja el acceso al menú de gestión mediante un PIN alfanumérico y bloquee los intentos tras tres fallos consecutivos.</w:t>
-      </w:r>
-    </w:p>
-    <w:p>
-      <w:pPr>
-        <w:pStyle w:val="Prrafodelista"/>
-        <w:numPr>
-          <w:ilvl w:val="0"/>
-          <w:numId w:val="21"/>
-        </w:numPr>
-      </w:pPr>
-      <w:r>
-        <w:br w:type="page"/>
       </w:r>
     </w:p>
     <w:p>
@@ -2482,10 +2602,13 @@
         <w:spacing w:line="360" w:lineRule="auto"/>
         <w:ind w:left="426" w:hanging="426"/>
       </w:pPr>
-      <w:bookmarkStart w:id="6" w:name="_Hlk140680469"/>
-      <w:bookmarkStart w:id="7" w:name="_Hlk140681490"/>
-      <w:bookmarkStart w:id="8" w:name="_Toc229395727"/>
-      <w:r>
+      <w:bookmarkStart w:id="7" w:name="_Toc229395727"/>
+      <w:bookmarkStart w:id="8" w:name="_Hlk140680469"/>
+      <w:bookmarkStart w:id="9" w:name="_Hlk140681490"/>
+      <w:r>
+        <w:rPr>
+          <w:noProof/>
+        </w:rPr>
         <w:lastRenderedPageBreak/>
         <w:drawing>
           <wp:anchor distT="0" distB="0" distL="114300" distR="114300" simplePos="0" relativeHeight="251658240" behindDoc="1" locked="0" layoutInCell="1" allowOverlap="1" wp14:anchorId="6F5C997C" wp14:editId="44728E6A">
@@ -2519,7 +2642,7 @@
                     <pic:cNvPicPr/>
                   </pic:nvPicPr>
                   <pic:blipFill>
-                    <a:blip r:embed="rId13">
+                    <a:blip r:embed="rId14">
                       <a:extLst>
                         <a:ext uri="{28A0092B-C50C-407E-A947-70E740481C1C}">
                           <a14:useLocalDpi xmlns:a14="http://schemas.microsoft.com/office/drawing/2010/main" val="0"/>
@@ -2548,7 +2671,7 @@
       <w:r>
         <w:t>FASE DISEÑO</w:t>
       </w:r>
-      <w:bookmarkEnd w:id="8"/>
+      <w:bookmarkEnd w:id="7"/>
     </w:p>
     <w:p>
       <w:pPr>
@@ -2745,6 +2868,9 @@
         <w:jc w:val="both"/>
       </w:pPr>
       <w:r>
+        <w:rPr>
+          <w:noProof/>
+        </w:rPr>
         <w:drawing>
           <wp:anchor distT="0" distB="0" distL="114300" distR="114300" simplePos="0" relativeHeight="251659264" behindDoc="1" locked="0" layoutInCell="1" allowOverlap="1" wp14:anchorId="23E165DE" wp14:editId="20E77B28">
             <wp:simplePos x="0" y="0"/>
@@ -2777,7 +2903,7 @@
                     <pic:cNvPicPr/>
                   </pic:nvPicPr>
                   <pic:blipFill>
-                    <a:blip r:embed="rId14">
+                    <a:blip r:embed="rId15">
                       <a:extLst>
                         <a:ext uri="{28A0092B-C50C-407E-A947-70E740481C1C}">
                           <a14:useLocalDpi xmlns:a14="http://schemas.microsoft.com/office/drawing/2010/main" val="0"/>
@@ -2856,18 +2982,94 @@
         <w:spacing w:line="360" w:lineRule="auto"/>
         <w:ind w:left="426" w:hanging="426"/>
       </w:pPr>
-      <w:bookmarkStart w:id="9" w:name="_Toc229395728"/>
+      <w:bookmarkStart w:id="10" w:name="_Toc229395728"/>
       <w:r>
         <w:lastRenderedPageBreak/>
         <w:t>PROGRAMACIÓN</w:t>
       </w:r>
-      <w:bookmarkEnd w:id="9"/>
+      <w:bookmarkEnd w:id="10"/>
     </w:p>
     <w:p>
       <w:pPr>
+        <w:rPr>
+          <w:noProof/>
+        </w:rPr>
+      </w:pPr>
+    </w:p>
+    <w:p>
+      <w:r>
+        <w:rPr>
+          <w:noProof/>
+        </w:rPr>
+        <w:drawing>
+          <wp:inline distT="0" distB="0" distL="0" distR="0" wp14:anchorId="206FF740" wp14:editId="5F94B9E6">
+            <wp:extent cx="5128592" cy="5382441"/>
+            <wp:effectExtent l="0" t="0" r="0" b="8890"/>
+            <wp:docPr id="160663957" name="Imagen 2"/>
+            <wp:cNvGraphicFramePr>
+              <a:graphicFrameLocks xmlns:a="http://schemas.openxmlformats.org/drawingml/2006/main" noChangeAspect="1"/>
+            </wp:cNvGraphicFramePr>
+            <a:graphic xmlns:a="http://schemas.openxmlformats.org/drawingml/2006/main">
+              <a:graphicData uri="http://schemas.openxmlformats.org/drawingml/2006/picture">
+                <pic:pic xmlns:pic="http://schemas.openxmlformats.org/drawingml/2006/picture">
+                  <pic:nvPicPr>
+                    <pic:cNvPr id="0" name="Picture 2"/>
+                    <pic:cNvPicPr>
+                      <a:picLocks noChangeAspect="1" noChangeArrowheads="1"/>
+                    </pic:cNvPicPr>
+                  </pic:nvPicPr>
+                  <pic:blipFill rotWithShape="1">
+                    <a:blip r:embed="rId16" cstate="print">
+                      <a:extLst>
+                        <a:ext uri="{28A0092B-C50C-407E-A947-70E740481C1C}">
+                          <a14:useLocalDpi xmlns:a14="http://schemas.microsoft.com/office/drawing/2010/main" val="0"/>
+                        </a:ext>
+                      </a:extLst>
+                    </a:blip>
+                    <a:srcRect l="3735" t="4776" r="7042" b="2860"/>
+                    <a:stretch>
+                      <a:fillRect/>
+                    </a:stretch>
+                  </pic:blipFill>
+                  <pic:spPr bwMode="auto">
+                    <a:xfrm>
+                      <a:off x="0" y="0"/>
+                      <a:ext cx="5129129" cy="5383004"/>
+                    </a:xfrm>
+                    <a:prstGeom prst="rect">
+                      <a:avLst/>
+                    </a:prstGeom>
+                    <a:noFill/>
+                    <a:ln>
+                      <a:noFill/>
+                    </a:ln>
+                    <a:extLst>
+                      <a:ext uri="{53640926-AAD7-44D8-BBD7-CCE9431645EC}">
+                        <a14:shadowObscured xmlns:a14="http://schemas.microsoft.com/office/drawing/2010/main"/>
+                      </a:ext>
+                    </a:extLst>
+                  </pic:spPr>
+                </pic:pic>
+              </a:graphicData>
+            </a:graphic>
+          </wp:inline>
+        </w:drawing>
+      </w:r>
+    </w:p>
+    <w:p>
+      <w:r>
+        <w:br w:type="page"/>
+      </w:r>
+    </w:p>
+    <w:p>
+      <w:pPr>
         <w:jc w:val="both"/>
       </w:pPr>
       <w:r>
+        <w:rPr>
+          <w:noProof/>
+        </w:rPr>
+        <w:lastRenderedPageBreak/>
         <w:drawing>
           <wp:anchor distT="0" distB="0" distL="114300" distR="114300" simplePos="0" relativeHeight="251662336" behindDoc="1" locked="0" layoutInCell="1" allowOverlap="1" wp14:anchorId="1CE6F3E7" wp14:editId="78616935">
             <wp:simplePos x="0" y="0"/>
@@ -2900,7 +3102,7 @@
                     <pic:cNvPicPr/>
                   </pic:nvPicPr>
                   <pic:blipFill>
-                    <a:blip r:embed="rId15">
+                    <a:blip r:embed="rId17">
                       <a:extLst>
                         <a:ext uri="{28A0092B-C50C-407E-A947-70E740481C1C}">
                           <a14:useLocalDpi xmlns:a14="http://schemas.microsoft.com/office/drawing/2010/main" val="0"/>
@@ -3000,6 +3202,9 @@
         <w:jc w:val="both"/>
       </w:pPr>
       <w:r>
+        <w:rPr>
+          <w:noProof/>
+        </w:rPr>
         <w:drawing>
           <wp:anchor distT="0" distB="0" distL="114300" distR="114300" simplePos="0" relativeHeight="251660288" behindDoc="1" locked="0" layoutInCell="1" allowOverlap="1" wp14:anchorId="598D351E" wp14:editId="078719D1">
             <wp:simplePos x="0" y="0"/>
@@ -3032,7 +3237,7 @@
                     <pic:cNvPicPr/>
                   </pic:nvPicPr>
                   <pic:blipFill>
-                    <a:blip r:embed="rId16">
+                    <a:blip r:embed="rId18">
                       <a:extLst>
                         <a:ext uri="{28A0092B-C50C-407E-A947-70E740481C1C}">
                           <a14:useLocalDpi xmlns:a14="http://schemas.microsoft.com/office/drawing/2010/main" val="0"/>
@@ -3128,6 +3333,9 @@
         <w:jc w:val="both"/>
       </w:pPr>
       <w:r>
+        <w:rPr>
+          <w:noProof/>
+        </w:rPr>
         <w:lastRenderedPageBreak/>
         <w:drawing>
           <wp:anchor distT="0" distB="0" distL="114300" distR="114300" simplePos="0" relativeHeight="251661312" behindDoc="1" locked="0" layoutInCell="1" allowOverlap="1" wp14:anchorId="5890FFA8" wp14:editId="4C57A412">
@@ -3161,7 +3369,7 @@
                     <pic:cNvPicPr/>
                   </pic:nvPicPr>
                   <pic:blipFill>
-                    <a:blip r:embed="rId17">
+                    <a:blip r:embed="rId19">
                       <a:extLst>
                         <a:ext uri="{28A0092B-C50C-407E-A947-70E740481C1C}">
                           <a14:useLocalDpi xmlns:a14="http://schemas.microsoft.com/office/drawing/2010/main" val="0"/>
@@ -3369,6 +3577,9 @@
         <w:jc w:val="both"/>
       </w:pPr>
       <w:r>
+        <w:rPr>
+          <w:noProof/>
+        </w:rPr>
         <w:drawing>
           <wp:inline distT="0" distB="0" distL="0" distR="0" wp14:anchorId="4FBB2230" wp14:editId="591B6ECB">
             <wp:extent cx="4663844" cy="2004234"/>
@@ -3385,7 +3596,7 @@
                     <pic:cNvPicPr/>
                   </pic:nvPicPr>
                   <pic:blipFill>
-                    <a:blip r:embed="rId18"/>
+                    <a:blip r:embed="rId20"/>
                     <a:stretch>
                       <a:fillRect/>
                     </a:stretch>
@@ -3458,20 +3669,54 @@
         <w:spacing w:line="360" w:lineRule="auto"/>
         <w:ind w:left="426" w:hanging="426"/>
       </w:pPr>
-      <w:bookmarkStart w:id="10" w:name="_Toc229395729"/>
+      <w:bookmarkStart w:id="11" w:name="_Toc229395729"/>
       <w:r>
         <w:lastRenderedPageBreak/>
         <w:t>PRUEBAS</w:t>
       </w:r>
-      <w:bookmarkEnd w:id="10"/>
+      <w:bookmarkEnd w:id="11"/>
     </w:p>
-    <w:bookmarkEnd w:id="3"/>
-    <w:bookmarkEnd w:id="6"/>
-    <w:bookmarkEnd w:id="7"/>
-    <w:p/>
+    <w:bookmarkEnd w:id="4"/>
+    <w:bookmarkEnd w:id="8"/>
+    <w:bookmarkEnd w:id="9"/>
+    <w:p>
+      <w:r>
+        <w:fldChar w:fldCharType="begin"/>
+      </w:r>
+      <w:r>
+        <w:instrText>HYPERLINK  \l "_top"</w:instrText>
+      </w:r>
+      <w:r>
+        <w:fldChar w:fldCharType="separate"/>
+      </w:r>
+      <w:r>
+        <w:rPr>
+          <w:rStyle w:val="Hipervnculo"/>
+        </w:rPr>
+        <w:t>GitHub Repositorio de Informe - UT-p2-</w:t>
+      </w:r>
+      <w:r>
+        <w:rPr>
+          <w:rStyle w:val="Hipervnculo"/>
+        </w:rPr>
+        <w:t>M</w:t>
+      </w:r>
+      <w:r>
+        <w:rPr>
+          <w:rStyle w:val="Hipervnculo"/>
+        </w:rPr>
+        <w:t>aquina-Vending</w:t>
+      </w:r>
+      <w:r>
+        <w:fldChar w:fldCharType="end"/>
+      </w:r>
+      <w:r>
+        <w:t xml:space="preserve"> </w:t>
+      </w:r>
+    </w:p>
     <w:sectPr>
-      <w:headerReference w:type="first" r:id="rId19"/>
-      <w:footerReference w:type="first" r:id="rId20"/>
+      <w:headerReference w:type="first" r:id="rId21"/>
+      <w:footerReference w:type="first" r:id="rId22"/>
       <w:pgSz w:w="11906" w:h="16838"/>
       <w:pgMar w:top="2155" w:right="1133" w:bottom="1701" w:left="1701" w:header="680" w:footer="454" w:gutter="0"/>
       <w:cols w:space="708"/>

</xml_diff>

<commit_message>
Diagramas y ultimo retoque en word
</commit_message>
<xml_diff>
--- a/InformeProyecto_MarioGonzalezDeLaIglesia/InformeProyecto_MarioGonzálezDeLaIglesia.docx
+++ b/InformeProyecto_MarioGonzalezDeLaIglesia/InformeProyecto_MarioGonzálezDeLaIglesia.docx
@@ -663,7 +663,7 @@
           <w:r>
             <w:fldChar w:fldCharType="separate"/>
           </w:r>
-          <w:hyperlink w:anchor="_Toc229395722" w:history="1">
+          <w:hyperlink w:anchor="_Toc229479097" w:history="1">
             <w:r>
               <w:rPr>
                 <w:rStyle w:val="Hipervnculo"/>
@@ -706,7 +706,7 @@
                 <w:noProof/>
                 <w:webHidden/>
               </w:rPr>
-              <w:instrText xml:space="preserve"> PAGEREF _Toc229395722 \h </w:instrText>
+              <w:instrText xml:space="preserve"> PAGEREF _Toc229479097 \h </w:instrText>
             </w:r>
             <w:r>
               <w:rPr>
@@ -751,7 +751,7 @@
               <w:lang w:eastAsia="es-ES"/>
             </w:rPr>
           </w:pPr>
-          <w:hyperlink w:anchor="_Toc229395723" w:history="1">
+          <w:hyperlink w:anchor="_Toc229479098" w:history="1">
             <w:r>
               <w:rPr>
                 <w:rStyle w:val="Hipervnculo"/>
@@ -794,7 +794,7 @@
                 <w:noProof/>
                 <w:webHidden/>
               </w:rPr>
-              <w:instrText xml:space="preserve"> PAGEREF _Toc229395723 \h </w:instrText>
+              <w:instrText xml:space="preserve"> PAGEREF _Toc229479098 \h </w:instrText>
             </w:r>
             <w:r>
               <w:rPr>
@@ -839,7 +839,7 @@
               <w:lang w:eastAsia="es-ES"/>
             </w:rPr>
           </w:pPr>
-          <w:hyperlink w:anchor="_Toc229395724" w:history="1">
+          <w:hyperlink w:anchor="_Toc229479099" w:history="1">
             <w:r>
               <w:rPr>
                 <w:rStyle w:val="Hipervnculo"/>
@@ -882,7 +882,7 @@
                 <w:noProof/>
                 <w:webHidden/>
               </w:rPr>
-              <w:instrText xml:space="preserve"> PAGEREF _Toc229395724 \h </w:instrText>
+              <w:instrText xml:space="preserve"> PAGEREF _Toc229479099 \h </w:instrText>
             </w:r>
             <w:r>
               <w:rPr>
@@ -926,7 +926,7 @@
               <w:lang w:eastAsia="es-ES"/>
             </w:rPr>
           </w:pPr>
-          <w:hyperlink w:anchor="_Toc229395725" w:history="1">
+          <w:hyperlink w:anchor="_Toc229479100" w:history="1">
             <w:r>
               <w:rPr>
                 <w:rStyle w:val="Hipervnculo"/>
@@ -953,7 +953,7 @@
                 <w:noProof/>
                 <w:webHidden/>
               </w:rPr>
-              <w:instrText xml:space="preserve"> PAGEREF _Toc229395725 \h </w:instrText>
+              <w:instrText xml:space="preserve"> PAGEREF _Toc229479100 \h </w:instrText>
             </w:r>
             <w:r>
               <w:rPr>
@@ -997,7 +997,7 @@
               <w:lang w:eastAsia="es-ES"/>
             </w:rPr>
           </w:pPr>
-          <w:hyperlink w:anchor="_Toc229395726" w:history="1">
+          <w:hyperlink w:anchor="_Toc229479101" w:history="1">
             <w:r>
               <w:rPr>
                 <w:rStyle w:val="Hipervnculo"/>
@@ -1024,7 +1024,7 @@
                 <w:noProof/>
                 <w:webHidden/>
               </w:rPr>
-              <w:instrText xml:space="preserve"> PAGEREF _Toc229395726 \h </w:instrText>
+              <w:instrText xml:space="preserve"> PAGEREF _Toc229479101 \h </w:instrText>
             </w:r>
             <w:r>
               <w:rPr>
@@ -1069,7 +1069,7 @@
               <w:lang w:eastAsia="es-ES"/>
             </w:rPr>
           </w:pPr>
-          <w:hyperlink w:anchor="_Toc229395727" w:history="1">
+          <w:hyperlink w:anchor="_Toc229479102" w:history="1">
             <w:r>
               <w:rPr>
                 <w:rStyle w:val="Hipervnculo"/>
@@ -1112,7 +1112,7 @@
                 <w:noProof/>
                 <w:webHidden/>
               </w:rPr>
-              <w:instrText xml:space="preserve"> PAGEREF _Toc229395727 \h </w:instrText>
+              <w:instrText xml:space="preserve"> PAGEREF _Toc229479102 \h </w:instrText>
             </w:r>
             <w:r>
               <w:rPr>
@@ -1157,7 +1157,7 @@
               <w:lang w:eastAsia="es-ES"/>
             </w:rPr>
           </w:pPr>
-          <w:hyperlink w:anchor="_Toc229395728" w:history="1">
+          <w:hyperlink w:anchor="_Toc229479103" w:history="1">
             <w:r>
               <w:rPr>
                 <w:rStyle w:val="Hipervnculo"/>
@@ -1200,7 +1200,7 @@
                 <w:noProof/>
                 <w:webHidden/>
               </w:rPr>
-              <w:instrText xml:space="preserve"> PAGEREF _Toc229395728 \h </w:instrText>
+              <w:instrText xml:space="preserve"> PAGEREF _Toc229479103 \h </w:instrText>
             </w:r>
             <w:r>
               <w:rPr>
@@ -1245,7 +1245,7 @@
               <w:lang w:eastAsia="es-ES"/>
             </w:rPr>
           </w:pPr>
-          <w:hyperlink w:anchor="_Toc229395729" w:history="1">
+          <w:hyperlink w:anchor="_Toc229479104" w:history="1">
             <w:r>
               <w:rPr>
                 <w:rStyle w:val="Hipervnculo"/>
@@ -1288,7 +1288,7 @@
                 <w:noProof/>
                 <w:webHidden/>
               </w:rPr>
-              <w:instrText xml:space="preserve"> PAGEREF _Toc229395729 \h </w:instrText>
+              <w:instrText xml:space="preserve"> PAGEREF _Toc229479104 \h </w:instrText>
             </w:r>
             <w:r>
               <w:rPr>
@@ -1308,7 +1308,7 @@
                 <w:noProof/>
                 <w:webHidden/>
               </w:rPr>
-              <w:t>12</w:t>
+              <w:t>13</w:t>
             </w:r>
             <w:r>
               <w:rPr>
@@ -1361,7 +1361,7 @@
         <w:spacing w:line="360" w:lineRule="auto"/>
         <w:ind w:left="426" w:hanging="426"/>
       </w:pPr>
-      <w:bookmarkStart w:id="1" w:name="_Toc229395722"/>
+      <w:bookmarkStart w:id="1" w:name="_Toc229479097"/>
       <w:r>
         <w:lastRenderedPageBreak/>
         <w:t>CONTROL DE VERSIONES</w:t>
@@ -1930,202 +1930,6 @@
           </w:p>
         </w:tc>
       </w:tr>
-      <w:tr>
-        <w:trPr>
-          <w:jc w:val="center"/>
-        </w:trPr>
-        <w:tc>
-          <w:tcPr>
-            <w:tcW w:w="1271" w:type="dxa"/>
-            <w:vAlign w:val="center"/>
-          </w:tcPr>
-          <w:p>
-            <w:pPr>
-              <w:jc w:val="center"/>
-            </w:pPr>
-          </w:p>
-        </w:tc>
-        <w:tc>
-          <w:tcPr>
-            <w:tcW w:w="1843" w:type="dxa"/>
-            <w:vAlign w:val="center"/>
-          </w:tcPr>
-          <w:p>
-            <w:pPr>
-              <w:jc w:val="center"/>
-            </w:pPr>
-          </w:p>
-        </w:tc>
-        <w:tc>
-          <w:tcPr>
-            <w:tcW w:w="4258" w:type="dxa"/>
-            <w:vAlign w:val="center"/>
-          </w:tcPr>
-          <w:p>
-            <w:pPr>
-              <w:jc w:val="center"/>
-            </w:pPr>
-          </w:p>
-        </w:tc>
-        <w:tc>
-          <w:tcPr>
-            <w:tcW w:w="1690" w:type="dxa"/>
-            <w:vAlign w:val="center"/>
-          </w:tcPr>
-          <w:p>
-            <w:pPr>
-              <w:jc w:val="center"/>
-            </w:pPr>
-          </w:p>
-        </w:tc>
-      </w:tr>
-      <w:tr>
-        <w:trPr>
-          <w:jc w:val="center"/>
-        </w:trPr>
-        <w:tc>
-          <w:tcPr>
-            <w:tcW w:w="1271" w:type="dxa"/>
-            <w:vAlign w:val="center"/>
-          </w:tcPr>
-          <w:p>
-            <w:pPr>
-              <w:jc w:val="center"/>
-            </w:pPr>
-          </w:p>
-        </w:tc>
-        <w:tc>
-          <w:tcPr>
-            <w:tcW w:w="1843" w:type="dxa"/>
-            <w:vAlign w:val="center"/>
-          </w:tcPr>
-          <w:p>
-            <w:pPr>
-              <w:jc w:val="center"/>
-            </w:pPr>
-          </w:p>
-        </w:tc>
-        <w:tc>
-          <w:tcPr>
-            <w:tcW w:w="4258" w:type="dxa"/>
-            <w:vAlign w:val="center"/>
-          </w:tcPr>
-          <w:p>
-            <w:pPr>
-              <w:jc w:val="center"/>
-            </w:pPr>
-          </w:p>
-        </w:tc>
-        <w:tc>
-          <w:tcPr>
-            <w:tcW w:w="1690" w:type="dxa"/>
-            <w:vAlign w:val="center"/>
-          </w:tcPr>
-          <w:p>
-            <w:pPr>
-              <w:jc w:val="center"/>
-            </w:pPr>
-          </w:p>
-        </w:tc>
-      </w:tr>
-      <w:tr>
-        <w:trPr>
-          <w:jc w:val="center"/>
-        </w:trPr>
-        <w:tc>
-          <w:tcPr>
-            <w:tcW w:w="1271" w:type="dxa"/>
-            <w:vAlign w:val="center"/>
-          </w:tcPr>
-          <w:p>
-            <w:pPr>
-              <w:jc w:val="center"/>
-            </w:pPr>
-          </w:p>
-        </w:tc>
-        <w:tc>
-          <w:tcPr>
-            <w:tcW w:w="1843" w:type="dxa"/>
-            <w:vAlign w:val="center"/>
-          </w:tcPr>
-          <w:p>
-            <w:pPr>
-              <w:jc w:val="center"/>
-            </w:pPr>
-          </w:p>
-        </w:tc>
-        <w:tc>
-          <w:tcPr>
-            <w:tcW w:w="4258" w:type="dxa"/>
-            <w:vAlign w:val="center"/>
-          </w:tcPr>
-          <w:p>
-            <w:pPr>
-              <w:jc w:val="center"/>
-            </w:pPr>
-          </w:p>
-        </w:tc>
-        <w:tc>
-          <w:tcPr>
-            <w:tcW w:w="1690" w:type="dxa"/>
-            <w:vAlign w:val="center"/>
-          </w:tcPr>
-          <w:p>
-            <w:pPr>
-              <w:jc w:val="center"/>
-            </w:pPr>
-          </w:p>
-        </w:tc>
-      </w:tr>
-      <w:tr>
-        <w:trPr>
-          <w:jc w:val="center"/>
-        </w:trPr>
-        <w:tc>
-          <w:tcPr>
-            <w:tcW w:w="1271" w:type="dxa"/>
-            <w:vAlign w:val="center"/>
-          </w:tcPr>
-          <w:p>
-            <w:pPr>
-              <w:jc w:val="center"/>
-            </w:pPr>
-          </w:p>
-        </w:tc>
-        <w:tc>
-          <w:tcPr>
-            <w:tcW w:w="1843" w:type="dxa"/>
-            <w:vAlign w:val="center"/>
-          </w:tcPr>
-          <w:p>
-            <w:pPr>
-              <w:jc w:val="center"/>
-            </w:pPr>
-          </w:p>
-        </w:tc>
-        <w:tc>
-          <w:tcPr>
-            <w:tcW w:w="4258" w:type="dxa"/>
-            <w:vAlign w:val="center"/>
-          </w:tcPr>
-          <w:p>
-            <w:pPr>
-              <w:jc w:val="center"/>
-            </w:pPr>
-          </w:p>
-        </w:tc>
-        <w:tc>
-          <w:tcPr>
-            <w:tcW w:w="1690" w:type="dxa"/>
-            <w:vAlign w:val="center"/>
-          </w:tcPr>
-          <w:p>
-            <w:pPr>
-              <w:jc w:val="center"/>
-            </w:pPr>
-          </w:p>
-        </w:tc>
-      </w:tr>
     </w:tbl>
     <w:p>
       <w:r>
@@ -2142,7 +1946,7 @@
         <w:spacing w:line="360" w:lineRule="auto"/>
         <w:ind w:left="426" w:hanging="426"/>
       </w:pPr>
-      <w:bookmarkStart w:id="2" w:name="_Toc229395723"/>
+      <w:bookmarkStart w:id="2" w:name="_Toc229479098"/>
       <w:r>
         <w:lastRenderedPageBreak/>
         <w:t>INTRODUCCIÓN</w:t>
@@ -2216,7 +2020,7 @@
         <w:spacing w:line="360" w:lineRule="auto"/>
         <w:ind w:left="426" w:hanging="426"/>
       </w:pPr>
-      <w:bookmarkStart w:id="3" w:name="_Toc229395724"/>
+      <w:bookmarkStart w:id="3" w:name="_Toc229479099"/>
       <w:r>
         <w:lastRenderedPageBreak/>
         <w:t>FASE ANÁLISIS</w:t>
@@ -2239,7 +2043,7 @@
           <w:szCs w:val="28"/>
         </w:rPr>
       </w:pPr>
-      <w:bookmarkStart w:id="5" w:name="_Toc229395725"/>
+      <w:bookmarkStart w:id="5" w:name="_Toc229479100"/>
       <w:r>
         <w:rPr>
           <w:szCs w:val="28"/>
@@ -2444,7 +2248,6 @@
       <w:pPr>
         <w:jc w:val="center"/>
       </w:pPr>
-      <w:bookmarkStart w:id="6" w:name="_Toc229395726"/>
       <w:r>
         <w:rPr>
           <w:noProof/>
@@ -2512,6 +2315,7 @@
           <w:szCs w:val="28"/>
         </w:rPr>
       </w:pPr>
+      <w:bookmarkStart w:id="6" w:name="_Toc229479101"/>
       <w:r>
         <w:rPr>
           <w:szCs w:val="28"/>
@@ -2602,9 +2406,9 @@
         <w:spacing w:line="360" w:lineRule="auto"/>
         <w:ind w:left="426" w:hanging="426"/>
       </w:pPr>
-      <w:bookmarkStart w:id="7" w:name="_Toc229395727"/>
-      <w:bookmarkStart w:id="8" w:name="_Hlk140680469"/>
-      <w:bookmarkStart w:id="9" w:name="_Hlk140681490"/>
+      <w:bookmarkStart w:id="7" w:name="_Hlk140680469"/>
+      <w:bookmarkStart w:id="8" w:name="_Hlk140681490"/>
+      <w:bookmarkStart w:id="9" w:name="_Toc229479102"/>
       <w:r>
         <w:rPr>
           <w:noProof/>
@@ -2671,7 +2475,7 @@
       <w:r>
         <w:t>FASE DISEÑO</w:t>
       </w:r>
-      <w:bookmarkEnd w:id="7"/>
+      <w:bookmarkEnd w:id="9"/>
     </w:p>
     <w:p>
       <w:pPr>
@@ -2982,7 +2786,7 @@
         <w:spacing w:line="360" w:lineRule="auto"/>
         <w:ind w:left="426" w:hanging="426"/>
       </w:pPr>
-      <w:bookmarkStart w:id="10" w:name="_Toc229395728"/>
+      <w:bookmarkStart w:id="10" w:name="_Toc229479103"/>
       <w:r>
         <w:lastRenderedPageBreak/>
         <w:t>PROGRAMACIÓN</w:t>
@@ -3669,22 +3473,27 @@
         <w:spacing w:line="360" w:lineRule="auto"/>
         <w:ind w:left="426" w:hanging="426"/>
       </w:pPr>
-      <w:bookmarkStart w:id="11" w:name="_Toc229395729"/>
+      <w:bookmarkStart w:id="11" w:name="_Toc229479104"/>
       <w:r>
         <w:lastRenderedPageBreak/>
         <w:t>PRUEBAS</w:t>
       </w:r>
       <w:bookmarkEnd w:id="11"/>
     </w:p>
+    <w:p>
+      <w:r>
+        <w:t>Para descargar cualquier cosa necesaria:</w:t>
+      </w:r>
+    </w:p>
     <w:bookmarkEnd w:id="4"/>
+    <w:bookmarkEnd w:id="7"/>
     <w:bookmarkEnd w:id="8"/>
-    <w:bookmarkEnd w:id="9"/>
     <w:p>
       <w:r>
         <w:fldChar w:fldCharType="begin"/>
       </w:r>
       <w:r>
-        <w:instrText>HYPERLINK  \l "_top"</w:instrText>
+        <w:instrText>HYPERLINK "https://github.com/Sys-Mario/UT-p2-Maquina-Vending.git"</w:instrText>
       </w:r>
       <w:r>
         <w:fldChar w:fldCharType="separate"/>
@@ -3713,10 +3522,28 @@
       <w:r>
         <w:t xml:space="preserve"> </w:t>
       </w:r>
+      <w:r>
+        <w:br/>
+      </w:r>
+      <w:r>
+        <w:br/>
+        <w:t>O por si no quieres descargarlo directamente:</w:t>
+      </w:r>
+      <w:r>
+        <w:br/>
+      </w:r>
+      <w:hyperlink r:id="rId21" w:history="1">
+        <w:r>
+          <w:rPr>
+            <w:rStyle w:val="Hipervnculo"/>
+          </w:rPr>
+          <w:t>Google Drive - Proyecto</w:t>
+        </w:r>
+      </w:hyperlink>
     </w:p>
     <w:sectPr>
-      <w:headerReference w:type="first" r:id="rId21"/>
-      <w:footerReference w:type="first" r:id="rId22"/>
+      <w:headerReference w:type="first" r:id="rId22"/>
+      <w:footerReference w:type="first" r:id="rId23"/>
       <w:pgSz w:w="11906" w:h="16838"/>
       <w:pgMar w:top="2155" w:right="1133" w:bottom="1701" w:left="1701" w:header="680" w:footer="454" w:gutter="0"/>
       <w:cols w:space="708"/>

</xml_diff>